<commit_message>
Modification plan de test pour fonctionnalités pas listées
</commit_message>
<xml_diff>
--- a/Documents/Plans de tests.docx
+++ b/Documents/Plans de tests.docx
@@ -1317,7 +1317,7 @@
       </w:pPr>
       <w:r>
         <w:rPr/>
-        <w:t>Affichage carte d’un tableaux</w:t>
+        <w:t>Affichage carte d’un tableau</w:t>
       </w:r>
     </w:p>
     <w:tbl>
@@ -3228,6 +3228,4315 @@
         <w:rPr/>
       </w:r>
     </w:p>
+    <w:p>
+      <w:pPr>
+        <w:pStyle w:val="Normal"/>
+        <w:bidi w:val="0"/>
+        <w:jc w:val="start"/>
+        <w:rPr/>
+      </w:pPr>
+      <w:r>
+        <w:rPr/>
+        <w:t>Modification profil</w:t>
+      </w:r>
+    </w:p>
+    <w:tbl>
+      <w:tblPr>
+        <w:tblW w:w="5000" w:type="pct"/>
+        <w:jc w:val="start"/>
+        <w:tblInd w:w="-5" w:type="dxa"/>
+        <w:tblLayout w:type="fixed"/>
+        <w:tblCellMar>
+          <w:top w:w="55" w:type="dxa"/>
+          <w:start w:w="55" w:type="dxa"/>
+          <w:bottom w:w="55" w:type="dxa"/>
+          <w:end w:w="55" w:type="dxa"/>
+        </w:tblCellMar>
+      </w:tblPr>
+      <w:tblGrid>
+        <w:gridCol w:w="3212"/>
+        <w:gridCol w:w="3213"/>
+        <w:gridCol w:w="3213"/>
+      </w:tblGrid>
+      <w:tr>
+        <w:trPr/>
+        <w:tc>
+          <w:tcPr>
+            <w:tcW w:w="3212" w:type="dxa"/>
+            <w:tcBorders>
+              <w:top w:val="single" w:sz="4" w:space="0" w:color="000000"/>
+              <w:start w:val="single" w:sz="4" w:space="0" w:color="000000"/>
+              <w:bottom w:val="single" w:sz="4" w:space="0" w:color="000000"/>
+            </w:tcBorders>
+          </w:tcPr>
+          <w:p>
+            <w:pPr>
+              <w:pStyle w:val="Contenudetableau"/>
+              <w:bidi w:val="0"/>
+              <w:jc w:val="start"/>
+              <w:rPr/>
+            </w:pPr>
+            <w:r>
+              <w:rPr/>
+              <w:t>Etape</w:t>
+            </w:r>
+          </w:p>
+        </w:tc>
+        <w:tc>
+          <w:tcPr>
+            <w:tcW w:w="3213" w:type="dxa"/>
+            <w:tcBorders>
+              <w:top w:val="single" w:sz="4" w:space="0" w:color="000000"/>
+              <w:start w:val="single" w:sz="4" w:space="0" w:color="000000"/>
+              <w:bottom w:val="single" w:sz="4" w:space="0" w:color="000000"/>
+            </w:tcBorders>
+          </w:tcPr>
+          <w:p>
+            <w:pPr>
+              <w:pStyle w:val="Contenudetableau"/>
+              <w:bidi w:val="0"/>
+              <w:jc w:val="start"/>
+              <w:rPr/>
+            </w:pPr>
+            <w:r>
+              <w:rPr/>
+              <w:t>Action utilisateur</w:t>
+            </w:r>
+          </w:p>
+        </w:tc>
+        <w:tc>
+          <w:tcPr>
+            <w:tcW w:w="3213" w:type="dxa"/>
+            <w:tcBorders>
+              <w:top w:val="single" w:sz="4" w:space="0" w:color="000000"/>
+              <w:start w:val="single" w:sz="4" w:space="0" w:color="000000"/>
+              <w:bottom w:val="single" w:sz="4" w:space="0" w:color="000000"/>
+              <w:end w:val="single" w:sz="4" w:space="0" w:color="000000"/>
+            </w:tcBorders>
+          </w:tcPr>
+          <w:p>
+            <w:pPr>
+              <w:pStyle w:val="Contenudetableau"/>
+              <w:bidi w:val="0"/>
+              <w:jc w:val="start"/>
+              <w:rPr/>
+            </w:pPr>
+            <w:r>
+              <w:rPr/>
+              <w:t>Réponse Api</w:t>
+            </w:r>
+          </w:p>
+        </w:tc>
+      </w:tr>
+      <w:tr>
+        <w:trPr/>
+        <w:tc>
+          <w:tcPr>
+            <w:tcW w:w="3212" w:type="dxa"/>
+            <w:tcBorders>
+              <w:start w:val="single" w:sz="4" w:space="0" w:color="000000"/>
+              <w:bottom w:val="single" w:sz="4" w:space="0" w:color="000000"/>
+            </w:tcBorders>
+          </w:tcPr>
+          <w:p>
+            <w:pPr>
+              <w:pStyle w:val="Contenudetableau"/>
+              <w:bidi w:val="0"/>
+              <w:jc w:val="start"/>
+              <w:rPr/>
+            </w:pPr>
+            <w:r>
+              <w:rPr/>
+            </w:r>
+          </w:p>
+        </w:tc>
+        <w:tc>
+          <w:tcPr>
+            <w:tcW w:w="3213" w:type="dxa"/>
+            <w:tcBorders>
+              <w:start w:val="single" w:sz="4" w:space="0" w:color="000000"/>
+              <w:bottom w:val="single" w:sz="4" w:space="0" w:color="000000"/>
+            </w:tcBorders>
+          </w:tcPr>
+          <w:p>
+            <w:pPr>
+              <w:pStyle w:val="Contenudetableau"/>
+              <w:bidi w:val="0"/>
+              <w:jc w:val="start"/>
+              <w:rPr/>
+            </w:pPr>
+            <w:r>
+              <w:rPr/>
+            </w:r>
+          </w:p>
+        </w:tc>
+        <w:tc>
+          <w:tcPr>
+            <w:tcW w:w="3213" w:type="dxa"/>
+            <w:tcBorders>
+              <w:start w:val="single" w:sz="4" w:space="0" w:color="000000"/>
+              <w:bottom w:val="single" w:sz="4" w:space="0" w:color="000000"/>
+              <w:end w:val="single" w:sz="4" w:space="0" w:color="000000"/>
+            </w:tcBorders>
+          </w:tcPr>
+          <w:p>
+            <w:pPr>
+              <w:pStyle w:val="Contenudetableau"/>
+              <w:bidi w:val="0"/>
+              <w:jc w:val="start"/>
+              <w:rPr/>
+            </w:pPr>
+            <w:r>
+              <w:rPr/>
+            </w:r>
+          </w:p>
+        </w:tc>
+      </w:tr>
+      <w:tr>
+        <w:trPr/>
+        <w:tc>
+          <w:tcPr>
+            <w:tcW w:w="3212" w:type="dxa"/>
+            <w:tcBorders>
+              <w:start w:val="single" w:sz="4" w:space="0" w:color="000000"/>
+              <w:bottom w:val="single" w:sz="4" w:space="0" w:color="000000"/>
+            </w:tcBorders>
+          </w:tcPr>
+          <w:p>
+            <w:pPr>
+              <w:pStyle w:val="Contenudetableau"/>
+              <w:bidi w:val="0"/>
+              <w:jc w:val="start"/>
+              <w:rPr/>
+            </w:pPr>
+            <w:r>
+              <w:rPr/>
+            </w:r>
+          </w:p>
+        </w:tc>
+        <w:tc>
+          <w:tcPr>
+            <w:tcW w:w="3213" w:type="dxa"/>
+            <w:tcBorders>
+              <w:start w:val="single" w:sz="4" w:space="0" w:color="000000"/>
+              <w:bottom w:val="single" w:sz="4" w:space="0" w:color="000000"/>
+            </w:tcBorders>
+          </w:tcPr>
+          <w:p>
+            <w:pPr>
+              <w:pStyle w:val="Contenudetableau"/>
+              <w:bidi w:val="0"/>
+              <w:jc w:val="start"/>
+              <w:rPr/>
+            </w:pPr>
+            <w:r>
+              <w:rPr/>
+            </w:r>
+          </w:p>
+        </w:tc>
+        <w:tc>
+          <w:tcPr>
+            <w:tcW w:w="3213" w:type="dxa"/>
+            <w:tcBorders>
+              <w:start w:val="single" w:sz="4" w:space="0" w:color="000000"/>
+              <w:bottom w:val="single" w:sz="4" w:space="0" w:color="000000"/>
+              <w:end w:val="single" w:sz="4" w:space="0" w:color="000000"/>
+            </w:tcBorders>
+          </w:tcPr>
+          <w:p>
+            <w:pPr>
+              <w:pStyle w:val="Contenudetableau"/>
+              <w:bidi w:val="0"/>
+              <w:jc w:val="start"/>
+              <w:rPr/>
+            </w:pPr>
+            <w:r>
+              <w:rPr/>
+            </w:r>
+          </w:p>
+        </w:tc>
+      </w:tr>
+    </w:tbl>
+    <w:p>
+      <w:pPr>
+        <w:pStyle w:val="Normal"/>
+        <w:bidi w:val="0"/>
+        <w:jc w:val="start"/>
+        <w:rPr/>
+      </w:pPr>
+      <w:r>
+        <w:rPr/>
+      </w:r>
+    </w:p>
+    <w:p>
+      <w:pPr>
+        <w:pStyle w:val="Normal"/>
+        <w:bidi w:val="0"/>
+        <w:jc w:val="start"/>
+        <w:rPr/>
+      </w:pPr>
+      <w:r>
+        <w:rPr/>
+        <w:t>Modification d’un tableau</w:t>
+      </w:r>
+    </w:p>
+    <w:tbl>
+      <w:tblPr>
+        <w:tblW w:w="5000" w:type="pct"/>
+        <w:jc w:val="start"/>
+        <w:tblInd w:w="-5" w:type="dxa"/>
+        <w:tblLayout w:type="fixed"/>
+        <w:tblCellMar>
+          <w:top w:w="55" w:type="dxa"/>
+          <w:start w:w="55" w:type="dxa"/>
+          <w:bottom w:w="55" w:type="dxa"/>
+          <w:end w:w="55" w:type="dxa"/>
+        </w:tblCellMar>
+      </w:tblPr>
+      <w:tblGrid>
+        <w:gridCol w:w="3212"/>
+        <w:gridCol w:w="3213"/>
+        <w:gridCol w:w="3213"/>
+      </w:tblGrid>
+      <w:tr>
+        <w:trPr/>
+        <w:tc>
+          <w:tcPr>
+            <w:tcW w:w="3212" w:type="dxa"/>
+            <w:tcBorders>
+              <w:top w:val="single" w:sz="4" w:space="0" w:color="000000"/>
+              <w:start w:val="single" w:sz="4" w:space="0" w:color="000000"/>
+              <w:bottom w:val="single" w:sz="4" w:space="0" w:color="000000"/>
+            </w:tcBorders>
+          </w:tcPr>
+          <w:p>
+            <w:pPr>
+              <w:pStyle w:val="Contenudetableau"/>
+              <w:bidi w:val="0"/>
+              <w:jc w:val="start"/>
+              <w:rPr/>
+            </w:pPr>
+            <w:r>
+              <w:rPr/>
+              <w:t>Etape</w:t>
+            </w:r>
+          </w:p>
+        </w:tc>
+        <w:tc>
+          <w:tcPr>
+            <w:tcW w:w="3213" w:type="dxa"/>
+            <w:tcBorders>
+              <w:top w:val="single" w:sz="4" w:space="0" w:color="000000"/>
+              <w:start w:val="single" w:sz="4" w:space="0" w:color="000000"/>
+              <w:bottom w:val="single" w:sz="4" w:space="0" w:color="000000"/>
+            </w:tcBorders>
+          </w:tcPr>
+          <w:p>
+            <w:pPr>
+              <w:pStyle w:val="Contenudetableau"/>
+              <w:bidi w:val="0"/>
+              <w:jc w:val="start"/>
+              <w:rPr/>
+            </w:pPr>
+            <w:r>
+              <w:rPr/>
+              <w:t>Action utilisateur</w:t>
+            </w:r>
+          </w:p>
+        </w:tc>
+        <w:tc>
+          <w:tcPr>
+            <w:tcW w:w="3213" w:type="dxa"/>
+            <w:tcBorders>
+              <w:top w:val="single" w:sz="4" w:space="0" w:color="000000"/>
+              <w:start w:val="single" w:sz="4" w:space="0" w:color="000000"/>
+              <w:bottom w:val="single" w:sz="4" w:space="0" w:color="000000"/>
+              <w:end w:val="single" w:sz="4" w:space="0" w:color="000000"/>
+            </w:tcBorders>
+          </w:tcPr>
+          <w:p>
+            <w:pPr>
+              <w:pStyle w:val="Contenudetableau"/>
+              <w:bidi w:val="0"/>
+              <w:jc w:val="start"/>
+              <w:rPr/>
+            </w:pPr>
+            <w:r>
+              <w:rPr/>
+              <w:t>Réponse Api</w:t>
+            </w:r>
+          </w:p>
+        </w:tc>
+      </w:tr>
+      <w:tr>
+        <w:trPr/>
+        <w:tc>
+          <w:tcPr>
+            <w:tcW w:w="3212" w:type="dxa"/>
+            <w:tcBorders>
+              <w:start w:val="single" w:sz="4" w:space="0" w:color="000000"/>
+              <w:bottom w:val="single" w:sz="4" w:space="0" w:color="000000"/>
+            </w:tcBorders>
+          </w:tcPr>
+          <w:p>
+            <w:pPr>
+              <w:pStyle w:val="Contenudetableau"/>
+              <w:bidi w:val="0"/>
+              <w:jc w:val="start"/>
+              <w:rPr/>
+            </w:pPr>
+            <w:r>
+              <w:rPr/>
+            </w:r>
+          </w:p>
+        </w:tc>
+        <w:tc>
+          <w:tcPr>
+            <w:tcW w:w="3213" w:type="dxa"/>
+            <w:tcBorders>
+              <w:start w:val="single" w:sz="4" w:space="0" w:color="000000"/>
+              <w:bottom w:val="single" w:sz="4" w:space="0" w:color="000000"/>
+            </w:tcBorders>
+          </w:tcPr>
+          <w:p>
+            <w:pPr>
+              <w:pStyle w:val="Contenudetableau"/>
+              <w:bidi w:val="0"/>
+              <w:jc w:val="start"/>
+              <w:rPr/>
+            </w:pPr>
+            <w:r>
+              <w:rPr/>
+            </w:r>
+          </w:p>
+        </w:tc>
+        <w:tc>
+          <w:tcPr>
+            <w:tcW w:w="3213" w:type="dxa"/>
+            <w:tcBorders>
+              <w:start w:val="single" w:sz="4" w:space="0" w:color="000000"/>
+              <w:bottom w:val="single" w:sz="4" w:space="0" w:color="000000"/>
+              <w:end w:val="single" w:sz="4" w:space="0" w:color="000000"/>
+            </w:tcBorders>
+          </w:tcPr>
+          <w:p>
+            <w:pPr>
+              <w:pStyle w:val="Contenudetableau"/>
+              <w:bidi w:val="0"/>
+              <w:jc w:val="start"/>
+              <w:rPr/>
+            </w:pPr>
+            <w:r>
+              <w:rPr/>
+            </w:r>
+          </w:p>
+        </w:tc>
+      </w:tr>
+      <w:tr>
+        <w:trPr/>
+        <w:tc>
+          <w:tcPr>
+            <w:tcW w:w="3212" w:type="dxa"/>
+            <w:tcBorders>
+              <w:start w:val="single" w:sz="4" w:space="0" w:color="000000"/>
+              <w:bottom w:val="single" w:sz="4" w:space="0" w:color="000000"/>
+            </w:tcBorders>
+          </w:tcPr>
+          <w:p>
+            <w:pPr>
+              <w:pStyle w:val="Contenudetableau"/>
+              <w:bidi w:val="0"/>
+              <w:jc w:val="start"/>
+              <w:rPr/>
+            </w:pPr>
+            <w:r>
+              <w:rPr/>
+            </w:r>
+          </w:p>
+        </w:tc>
+        <w:tc>
+          <w:tcPr>
+            <w:tcW w:w="3213" w:type="dxa"/>
+            <w:tcBorders>
+              <w:start w:val="single" w:sz="4" w:space="0" w:color="000000"/>
+              <w:bottom w:val="single" w:sz="4" w:space="0" w:color="000000"/>
+            </w:tcBorders>
+          </w:tcPr>
+          <w:p>
+            <w:pPr>
+              <w:pStyle w:val="Contenudetableau"/>
+              <w:bidi w:val="0"/>
+              <w:jc w:val="start"/>
+              <w:rPr/>
+            </w:pPr>
+            <w:r>
+              <w:rPr/>
+            </w:r>
+          </w:p>
+        </w:tc>
+        <w:tc>
+          <w:tcPr>
+            <w:tcW w:w="3213" w:type="dxa"/>
+            <w:tcBorders>
+              <w:start w:val="single" w:sz="4" w:space="0" w:color="000000"/>
+              <w:bottom w:val="single" w:sz="4" w:space="0" w:color="000000"/>
+              <w:end w:val="single" w:sz="4" w:space="0" w:color="000000"/>
+            </w:tcBorders>
+          </w:tcPr>
+          <w:p>
+            <w:pPr>
+              <w:pStyle w:val="Contenudetableau"/>
+              <w:bidi w:val="0"/>
+              <w:jc w:val="start"/>
+              <w:rPr/>
+            </w:pPr>
+            <w:r>
+              <w:rPr/>
+            </w:r>
+          </w:p>
+        </w:tc>
+      </w:tr>
+    </w:tbl>
+    <w:p>
+      <w:pPr>
+        <w:pStyle w:val="Normal"/>
+        <w:bidi w:val="0"/>
+        <w:jc w:val="start"/>
+        <w:rPr/>
+      </w:pPr>
+      <w:r>
+        <w:rPr/>
+      </w:r>
+    </w:p>
+    <w:p>
+      <w:pPr>
+        <w:pStyle w:val="Normal"/>
+        <w:bidi w:val="0"/>
+        <w:jc w:val="start"/>
+        <w:rPr/>
+      </w:pPr>
+      <w:r>
+        <w:rPr/>
+        <w:t>Modification d’une liste</w:t>
+      </w:r>
+    </w:p>
+    <w:tbl>
+      <w:tblPr>
+        <w:tblW w:w="5000" w:type="pct"/>
+        <w:jc w:val="start"/>
+        <w:tblInd w:w="-5" w:type="dxa"/>
+        <w:tblLayout w:type="fixed"/>
+        <w:tblCellMar>
+          <w:top w:w="55" w:type="dxa"/>
+          <w:start w:w="55" w:type="dxa"/>
+          <w:bottom w:w="55" w:type="dxa"/>
+          <w:end w:w="55" w:type="dxa"/>
+        </w:tblCellMar>
+      </w:tblPr>
+      <w:tblGrid>
+        <w:gridCol w:w="3212"/>
+        <w:gridCol w:w="3213"/>
+        <w:gridCol w:w="3213"/>
+      </w:tblGrid>
+      <w:tr>
+        <w:trPr/>
+        <w:tc>
+          <w:tcPr>
+            <w:tcW w:w="3212" w:type="dxa"/>
+            <w:tcBorders>
+              <w:top w:val="single" w:sz="4" w:space="0" w:color="000000"/>
+              <w:start w:val="single" w:sz="4" w:space="0" w:color="000000"/>
+              <w:bottom w:val="single" w:sz="4" w:space="0" w:color="000000"/>
+            </w:tcBorders>
+          </w:tcPr>
+          <w:p>
+            <w:pPr>
+              <w:pStyle w:val="Contenudetableau"/>
+              <w:bidi w:val="0"/>
+              <w:jc w:val="start"/>
+              <w:rPr/>
+            </w:pPr>
+            <w:r>
+              <w:rPr/>
+              <w:t>Etape</w:t>
+            </w:r>
+          </w:p>
+        </w:tc>
+        <w:tc>
+          <w:tcPr>
+            <w:tcW w:w="3213" w:type="dxa"/>
+            <w:tcBorders>
+              <w:top w:val="single" w:sz="4" w:space="0" w:color="000000"/>
+              <w:start w:val="single" w:sz="4" w:space="0" w:color="000000"/>
+              <w:bottom w:val="single" w:sz="4" w:space="0" w:color="000000"/>
+            </w:tcBorders>
+          </w:tcPr>
+          <w:p>
+            <w:pPr>
+              <w:pStyle w:val="Contenudetableau"/>
+              <w:bidi w:val="0"/>
+              <w:jc w:val="start"/>
+              <w:rPr/>
+            </w:pPr>
+            <w:r>
+              <w:rPr/>
+              <w:t>Action utilisateur</w:t>
+            </w:r>
+          </w:p>
+        </w:tc>
+        <w:tc>
+          <w:tcPr>
+            <w:tcW w:w="3213" w:type="dxa"/>
+            <w:tcBorders>
+              <w:top w:val="single" w:sz="4" w:space="0" w:color="000000"/>
+              <w:start w:val="single" w:sz="4" w:space="0" w:color="000000"/>
+              <w:bottom w:val="single" w:sz="4" w:space="0" w:color="000000"/>
+              <w:end w:val="single" w:sz="4" w:space="0" w:color="000000"/>
+            </w:tcBorders>
+          </w:tcPr>
+          <w:p>
+            <w:pPr>
+              <w:pStyle w:val="Contenudetableau"/>
+              <w:bidi w:val="0"/>
+              <w:jc w:val="start"/>
+              <w:rPr/>
+            </w:pPr>
+            <w:r>
+              <w:rPr/>
+              <w:t>Réponse Api</w:t>
+            </w:r>
+          </w:p>
+        </w:tc>
+      </w:tr>
+      <w:tr>
+        <w:trPr/>
+        <w:tc>
+          <w:tcPr>
+            <w:tcW w:w="3212" w:type="dxa"/>
+            <w:tcBorders>
+              <w:start w:val="single" w:sz="4" w:space="0" w:color="000000"/>
+              <w:bottom w:val="single" w:sz="4" w:space="0" w:color="000000"/>
+            </w:tcBorders>
+          </w:tcPr>
+          <w:p>
+            <w:pPr>
+              <w:pStyle w:val="Contenudetableau"/>
+              <w:bidi w:val="0"/>
+              <w:jc w:val="start"/>
+              <w:rPr/>
+            </w:pPr>
+            <w:r>
+              <w:rPr/>
+            </w:r>
+          </w:p>
+        </w:tc>
+        <w:tc>
+          <w:tcPr>
+            <w:tcW w:w="3213" w:type="dxa"/>
+            <w:tcBorders>
+              <w:start w:val="single" w:sz="4" w:space="0" w:color="000000"/>
+              <w:bottom w:val="single" w:sz="4" w:space="0" w:color="000000"/>
+            </w:tcBorders>
+          </w:tcPr>
+          <w:p>
+            <w:pPr>
+              <w:pStyle w:val="Contenudetableau"/>
+              <w:bidi w:val="0"/>
+              <w:jc w:val="start"/>
+              <w:rPr/>
+            </w:pPr>
+            <w:r>
+              <w:rPr/>
+            </w:r>
+          </w:p>
+        </w:tc>
+        <w:tc>
+          <w:tcPr>
+            <w:tcW w:w="3213" w:type="dxa"/>
+            <w:tcBorders>
+              <w:start w:val="single" w:sz="4" w:space="0" w:color="000000"/>
+              <w:bottom w:val="single" w:sz="4" w:space="0" w:color="000000"/>
+              <w:end w:val="single" w:sz="4" w:space="0" w:color="000000"/>
+            </w:tcBorders>
+          </w:tcPr>
+          <w:p>
+            <w:pPr>
+              <w:pStyle w:val="Contenudetableau"/>
+              <w:bidi w:val="0"/>
+              <w:jc w:val="start"/>
+              <w:rPr/>
+            </w:pPr>
+            <w:r>
+              <w:rPr/>
+            </w:r>
+          </w:p>
+        </w:tc>
+      </w:tr>
+      <w:tr>
+        <w:trPr/>
+        <w:tc>
+          <w:tcPr>
+            <w:tcW w:w="3212" w:type="dxa"/>
+            <w:tcBorders>
+              <w:start w:val="single" w:sz="4" w:space="0" w:color="000000"/>
+              <w:bottom w:val="single" w:sz="4" w:space="0" w:color="000000"/>
+            </w:tcBorders>
+          </w:tcPr>
+          <w:p>
+            <w:pPr>
+              <w:pStyle w:val="Contenudetableau"/>
+              <w:bidi w:val="0"/>
+              <w:jc w:val="start"/>
+              <w:rPr/>
+            </w:pPr>
+            <w:r>
+              <w:rPr/>
+            </w:r>
+          </w:p>
+        </w:tc>
+        <w:tc>
+          <w:tcPr>
+            <w:tcW w:w="3213" w:type="dxa"/>
+            <w:tcBorders>
+              <w:start w:val="single" w:sz="4" w:space="0" w:color="000000"/>
+              <w:bottom w:val="single" w:sz="4" w:space="0" w:color="000000"/>
+            </w:tcBorders>
+          </w:tcPr>
+          <w:p>
+            <w:pPr>
+              <w:pStyle w:val="Contenudetableau"/>
+              <w:bidi w:val="0"/>
+              <w:jc w:val="start"/>
+              <w:rPr/>
+            </w:pPr>
+            <w:r>
+              <w:rPr/>
+            </w:r>
+          </w:p>
+        </w:tc>
+        <w:tc>
+          <w:tcPr>
+            <w:tcW w:w="3213" w:type="dxa"/>
+            <w:tcBorders>
+              <w:start w:val="single" w:sz="4" w:space="0" w:color="000000"/>
+              <w:bottom w:val="single" w:sz="4" w:space="0" w:color="000000"/>
+              <w:end w:val="single" w:sz="4" w:space="0" w:color="000000"/>
+            </w:tcBorders>
+          </w:tcPr>
+          <w:p>
+            <w:pPr>
+              <w:pStyle w:val="Contenudetableau"/>
+              <w:bidi w:val="0"/>
+              <w:jc w:val="start"/>
+              <w:rPr/>
+            </w:pPr>
+            <w:r>
+              <w:rPr/>
+            </w:r>
+          </w:p>
+        </w:tc>
+      </w:tr>
+    </w:tbl>
+    <w:p>
+      <w:pPr>
+        <w:pStyle w:val="Normal"/>
+        <w:bidi w:val="0"/>
+        <w:jc w:val="start"/>
+        <w:rPr/>
+      </w:pPr>
+      <w:r>
+        <w:rPr/>
+      </w:r>
+    </w:p>
+    <w:p>
+      <w:pPr>
+        <w:pStyle w:val="Normal"/>
+        <w:bidi w:val="0"/>
+        <w:jc w:val="start"/>
+        <w:rPr/>
+      </w:pPr>
+      <w:r>
+        <w:rPr/>
+        <w:t>Modification d’une carte</w:t>
+      </w:r>
+    </w:p>
+    <w:tbl>
+      <w:tblPr>
+        <w:tblW w:w="5000" w:type="pct"/>
+        <w:jc w:val="start"/>
+        <w:tblInd w:w="-5" w:type="dxa"/>
+        <w:tblLayout w:type="fixed"/>
+        <w:tblCellMar>
+          <w:top w:w="55" w:type="dxa"/>
+          <w:start w:w="55" w:type="dxa"/>
+          <w:bottom w:w="55" w:type="dxa"/>
+          <w:end w:w="55" w:type="dxa"/>
+        </w:tblCellMar>
+      </w:tblPr>
+      <w:tblGrid>
+        <w:gridCol w:w="3212"/>
+        <w:gridCol w:w="3213"/>
+        <w:gridCol w:w="3213"/>
+      </w:tblGrid>
+      <w:tr>
+        <w:trPr/>
+        <w:tc>
+          <w:tcPr>
+            <w:tcW w:w="3212" w:type="dxa"/>
+            <w:tcBorders>
+              <w:top w:val="single" w:sz="4" w:space="0" w:color="000000"/>
+              <w:start w:val="single" w:sz="4" w:space="0" w:color="000000"/>
+              <w:bottom w:val="single" w:sz="4" w:space="0" w:color="000000"/>
+            </w:tcBorders>
+          </w:tcPr>
+          <w:p>
+            <w:pPr>
+              <w:pStyle w:val="Contenudetableau"/>
+              <w:bidi w:val="0"/>
+              <w:jc w:val="start"/>
+              <w:rPr/>
+            </w:pPr>
+            <w:r>
+              <w:rPr/>
+              <w:t>Etape</w:t>
+            </w:r>
+          </w:p>
+        </w:tc>
+        <w:tc>
+          <w:tcPr>
+            <w:tcW w:w="3213" w:type="dxa"/>
+            <w:tcBorders>
+              <w:top w:val="single" w:sz="4" w:space="0" w:color="000000"/>
+              <w:start w:val="single" w:sz="4" w:space="0" w:color="000000"/>
+              <w:bottom w:val="single" w:sz="4" w:space="0" w:color="000000"/>
+            </w:tcBorders>
+          </w:tcPr>
+          <w:p>
+            <w:pPr>
+              <w:pStyle w:val="Contenudetableau"/>
+              <w:bidi w:val="0"/>
+              <w:jc w:val="start"/>
+              <w:rPr/>
+            </w:pPr>
+            <w:r>
+              <w:rPr/>
+              <w:t>Action utilisateur</w:t>
+            </w:r>
+          </w:p>
+        </w:tc>
+        <w:tc>
+          <w:tcPr>
+            <w:tcW w:w="3213" w:type="dxa"/>
+            <w:tcBorders>
+              <w:top w:val="single" w:sz="4" w:space="0" w:color="000000"/>
+              <w:start w:val="single" w:sz="4" w:space="0" w:color="000000"/>
+              <w:bottom w:val="single" w:sz="4" w:space="0" w:color="000000"/>
+              <w:end w:val="single" w:sz="4" w:space="0" w:color="000000"/>
+            </w:tcBorders>
+          </w:tcPr>
+          <w:p>
+            <w:pPr>
+              <w:pStyle w:val="Contenudetableau"/>
+              <w:bidi w:val="0"/>
+              <w:jc w:val="start"/>
+              <w:rPr/>
+            </w:pPr>
+            <w:r>
+              <w:rPr/>
+              <w:t>Réponse Api</w:t>
+            </w:r>
+          </w:p>
+        </w:tc>
+      </w:tr>
+      <w:tr>
+        <w:trPr/>
+        <w:tc>
+          <w:tcPr>
+            <w:tcW w:w="3212" w:type="dxa"/>
+            <w:tcBorders>
+              <w:start w:val="single" w:sz="4" w:space="0" w:color="000000"/>
+              <w:bottom w:val="single" w:sz="4" w:space="0" w:color="000000"/>
+            </w:tcBorders>
+          </w:tcPr>
+          <w:p>
+            <w:pPr>
+              <w:pStyle w:val="Contenudetableau"/>
+              <w:bidi w:val="0"/>
+              <w:jc w:val="start"/>
+              <w:rPr/>
+            </w:pPr>
+            <w:r>
+              <w:rPr/>
+            </w:r>
+          </w:p>
+        </w:tc>
+        <w:tc>
+          <w:tcPr>
+            <w:tcW w:w="3213" w:type="dxa"/>
+            <w:tcBorders>
+              <w:start w:val="single" w:sz="4" w:space="0" w:color="000000"/>
+              <w:bottom w:val="single" w:sz="4" w:space="0" w:color="000000"/>
+            </w:tcBorders>
+          </w:tcPr>
+          <w:p>
+            <w:pPr>
+              <w:pStyle w:val="Contenudetableau"/>
+              <w:bidi w:val="0"/>
+              <w:jc w:val="start"/>
+              <w:rPr/>
+            </w:pPr>
+            <w:r>
+              <w:rPr/>
+            </w:r>
+          </w:p>
+        </w:tc>
+        <w:tc>
+          <w:tcPr>
+            <w:tcW w:w="3213" w:type="dxa"/>
+            <w:tcBorders>
+              <w:start w:val="single" w:sz="4" w:space="0" w:color="000000"/>
+              <w:bottom w:val="single" w:sz="4" w:space="0" w:color="000000"/>
+              <w:end w:val="single" w:sz="4" w:space="0" w:color="000000"/>
+            </w:tcBorders>
+          </w:tcPr>
+          <w:p>
+            <w:pPr>
+              <w:pStyle w:val="Contenudetableau"/>
+              <w:bidi w:val="0"/>
+              <w:jc w:val="start"/>
+              <w:rPr/>
+            </w:pPr>
+            <w:r>
+              <w:rPr/>
+            </w:r>
+          </w:p>
+        </w:tc>
+      </w:tr>
+      <w:tr>
+        <w:trPr/>
+        <w:tc>
+          <w:tcPr>
+            <w:tcW w:w="3212" w:type="dxa"/>
+            <w:tcBorders>
+              <w:start w:val="single" w:sz="4" w:space="0" w:color="000000"/>
+              <w:bottom w:val="single" w:sz="4" w:space="0" w:color="000000"/>
+            </w:tcBorders>
+          </w:tcPr>
+          <w:p>
+            <w:pPr>
+              <w:pStyle w:val="Contenudetableau"/>
+              <w:bidi w:val="0"/>
+              <w:jc w:val="start"/>
+              <w:rPr/>
+            </w:pPr>
+            <w:r>
+              <w:rPr/>
+            </w:r>
+          </w:p>
+        </w:tc>
+        <w:tc>
+          <w:tcPr>
+            <w:tcW w:w="3213" w:type="dxa"/>
+            <w:tcBorders>
+              <w:start w:val="single" w:sz="4" w:space="0" w:color="000000"/>
+              <w:bottom w:val="single" w:sz="4" w:space="0" w:color="000000"/>
+            </w:tcBorders>
+          </w:tcPr>
+          <w:p>
+            <w:pPr>
+              <w:pStyle w:val="Contenudetableau"/>
+              <w:bidi w:val="0"/>
+              <w:jc w:val="start"/>
+              <w:rPr/>
+            </w:pPr>
+            <w:r>
+              <w:rPr/>
+            </w:r>
+          </w:p>
+        </w:tc>
+        <w:tc>
+          <w:tcPr>
+            <w:tcW w:w="3213" w:type="dxa"/>
+            <w:tcBorders>
+              <w:start w:val="single" w:sz="4" w:space="0" w:color="000000"/>
+              <w:bottom w:val="single" w:sz="4" w:space="0" w:color="000000"/>
+              <w:end w:val="single" w:sz="4" w:space="0" w:color="000000"/>
+            </w:tcBorders>
+          </w:tcPr>
+          <w:p>
+            <w:pPr>
+              <w:pStyle w:val="Contenudetableau"/>
+              <w:bidi w:val="0"/>
+              <w:jc w:val="start"/>
+              <w:rPr/>
+            </w:pPr>
+            <w:r>
+              <w:rPr/>
+            </w:r>
+          </w:p>
+        </w:tc>
+      </w:tr>
+    </w:tbl>
+    <w:p>
+      <w:pPr>
+        <w:pStyle w:val="Normal"/>
+        <w:bidi w:val="0"/>
+        <w:jc w:val="start"/>
+        <w:rPr/>
+      </w:pPr>
+      <w:r>
+        <w:rPr/>
+      </w:r>
+    </w:p>
+    <w:p>
+      <w:pPr>
+        <w:pStyle w:val="Normal"/>
+        <w:bidi w:val="0"/>
+        <w:jc w:val="start"/>
+        <w:rPr/>
+      </w:pPr>
+      <w:r>
+        <w:rPr/>
+        <w:t>Modification d’une etiquette</w:t>
+      </w:r>
+    </w:p>
+    <w:tbl>
+      <w:tblPr>
+        <w:tblW w:w="5000" w:type="pct"/>
+        <w:jc w:val="start"/>
+        <w:tblInd w:w="-5" w:type="dxa"/>
+        <w:tblLayout w:type="fixed"/>
+        <w:tblCellMar>
+          <w:top w:w="55" w:type="dxa"/>
+          <w:start w:w="55" w:type="dxa"/>
+          <w:bottom w:w="55" w:type="dxa"/>
+          <w:end w:w="55" w:type="dxa"/>
+        </w:tblCellMar>
+      </w:tblPr>
+      <w:tblGrid>
+        <w:gridCol w:w="3212"/>
+        <w:gridCol w:w="3213"/>
+        <w:gridCol w:w="3213"/>
+      </w:tblGrid>
+      <w:tr>
+        <w:trPr/>
+        <w:tc>
+          <w:tcPr>
+            <w:tcW w:w="3212" w:type="dxa"/>
+            <w:tcBorders>
+              <w:top w:val="single" w:sz="4" w:space="0" w:color="000000"/>
+              <w:start w:val="single" w:sz="4" w:space="0" w:color="000000"/>
+              <w:bottom w:val="single" w:sz="4" w:space="0" w:color="000000"/>
+            </w:tcBorders>
+          </w:tcPr>
+          <w:p>
+            <w:pPr>
+              <w:pStyle w:val="Contenudetableau"/>
+              <w:bidi w:val="0"/>
+              <w:jc w:val="start"/>
+              <w:rPr/>
+            </w:pPr>
+            <w:r>
+              <w:rPr/>
+              <w:t>Etape</w:t>
+            </w:r>
+          </w:p>
+        </w:tc>
+        <w:tc>
+          <w:tcPr>
+            <w:tcW w:w="3213" w:type="dxa"/>
+            <w:tcBorders>
+              <w:top w:val="single" w:sz="4" w:space="0" w:color="000000"/>
+              <w:start w:val="single" w:sz="4" w:space="0" w:color="000000"/>
+              <w:bottom w:val="single" w:sz="4" w:space="0" w:color="000000"/>
+            </w:tcBorders>
+          </w:tcPr>
+          <w:p>
+            <w:pPr>
+              <w:pStyle w:val="Contenudetableau"/>
+              <w:bidi w:val="0"/>
+              <w:jc w:val="start"/>
+              <w:rPr/>
+            </w:pPr>
+            <w:r>
+              <w:rPr/>
+              <w:t>Action utilisateur</w:t>
+            </w:r>
+          </w:p>
+        </w:tc>
+        <w:tc>
+          <w:tcPr>
+            <w:tcW w:w="3213" w:type="dxa"/>
+            <w:tcBorders>
+              <w:top w:val="single" w:sz="4" w:space="0" w:color="000000"/>
+              <w:start w:val="single" w:sz="4" w:space="0" w:color="000000"/>
+              <w:bottom w:val="single" w:sz="4" w:space="0" w:color="000000"/>
+              <w:end w:val="single" w:sz="4" w:space="0" w:color="000000"/>
+            </w:tcBorders>
+          </w:tcPr>
+          <w:p>
+            <w:pPr>
+              <w:pStyle w:val="Contenudetableau"/>
+              <w:bidi w:val="0"/>
+              <w:jc w:val="start"/>
+              <w:rPr/>
+            </w:pPr>
+            <w:r>
+              <w:rPr/>
+              <w:t>Réponse Api</w:t>
+            </w:r>
+          </w:p>
+        </w:tc>
+      </w:tr>
+      <w:tr>
+        <w:trPr/>
+        <w:tc>
+          <w:tcPr>
+            <w:tcW w:w="3212" w:type="dxa"/>
+            <w:tcBorders>
+              <w:start w:val="single" w:sz="4" w:space="0" w:color="000000"/>
+              <w:bottom w:val="single" w:sz="4" w:space="0" w:color="000000"/>
+            </w:tcBorders>
+          </w:tcPr>
+          <w:p>
+            <w:pPr>
+              <w:pStyle w:val="Contenudetableau"/>
+              <w:bidi w:val="0"/>
+              <w:jc w:val="start"/>
+              <w:rPr/>
+            </w:pPr>
+            <w:r>
+              <w:rPr/>
+            </w:r>
+          </w:p>
+        </w:tc>
+        <w:tc>
+          <w:tcPr>
+            <w:tcW w:w="3213" w:type="dxa"/>
+            <w:tcBorders>
+              <w:start w:val="single" w:sz="4" w:space="0" w:color="000000"/>
+              <w:bottom w:val="single" w:sz="4" w:space="0" w:color="000000"/>
+            </w:tcBorders>
+          </w:tcPr>
+          <w:p>
+            <w:pPr>
+              <w:pStyle w:val="Contenudetableau"/>
+              <w:bidi w:val="0"/>
+              <w:jc w:val="start"/>
+              <w:rPr/>
+            </w:pPr>
+            <w:r>
+              <w:rPr/>
+            </w:r>
+          </w:p>
+        </w:tc>
+        <w:tc>
+          <w:tcPr>
+            <w:tcW w:w="3213" w:type="dxa"/>
+            <w:tcBorders>
+              <w:start w:val="single" w:sz="4" w:space="0" w:color="000000"/>
+              <w:bottom w:val="single" w:sz="4" w:space="0" w:color="000000"/>
+              <w:end w:val="single" w:sz="4" w:space="0" w:color="000000"/>
+            </w:tcBorders>
+          </w:tcPr>
+          <w:p>
+            <w:pPr>
+              <w:pStyle w:val="Contenudetableau"/>
+              <w:bidi w:val="0"/>
+              <w:jc w:val="start"/>
+              <w:rPr/>
+            </w:pPr>
+            <w:r>
+              <w:rPr/>
+            </w:r>
+          </w:p>
+        </w:tc>
+      </w:tr>
+      <w:tr>
+        <w:trPr/>
+        <w:tc>
+          <w:tcPr>
+            <w:tcW w:w="3212" w:type="dxa"/>
+            <w:tcBorders>
+              <w:start w:val="single" w:sz="4" w:space="0" w:color="000000"/>
+              <w:bottom w:val="single" w:sz="4" w:space="0" w:color="000000"/>
+            </w:tcBorders>
+          </w:tcPr>
+          <w:p>
+            <w:pPr>
+              <w:pStyle w:val="Contenudetableau"/>
+              <w:bidi w:val="0"/>
+              <w:jc w:val="start"/>
+              <w:rPr/>
+            </w:pPr>
+            <w:r>
+              <w:rPr/>
+            </w:r>
+          </w:p>
+        </w:tc>
+        <w:tc>
+          <w:tcPr>
+            <w:tcW w:w="3213" w:type="dxa"/>
+            <w:tcBorders>
+              <w:start w:val="single" w:sz="4" w:space="0" w:color="000000"/>
+              <w:bottom w:val="single" w:sz="4" w:space="0" w:color="000000"/>
+            </w:tcBorders>
+          </w:tcPr>
+          <w:p>
+            <w:pPr>
+              <w:pStyle w:val="Contenudetableau"/>
+              <w:bidi w:val="0"/>
+              <w:jc w:val="start"/>
+              <w:rPr/>
+            </w:pPr>
+            <w:r>
+              <w:rPr/>
+            </w:r>
+          </w:p>
+        </w:tc>
+        <w:tc>
+          <w:tcPr>
+            <w:tcW w:w="3213" w:type="dxa"/>
+            <w:tcBorders>
+              <w:start w:val="single" w:sz="4" w:space="0" w:color="000000"/>
+              <w:bottom w:val="single" w:sz="4" w:space="0" w:color="000000"/>
+              <w:end w:val="single" w:sz="4" w:space="0" w:color="000000"/>
+            </w:tcBorders>
+          </w:tcPr>
+          <w:p>
+            <w:pPr>
+              <w:pStyle w:val="Contenudetableau"/>
+              <w:bidi w:val="0"/>
+              <w:jc w:val="start"/>
+              <w:rPr/>
+            </w:pPr>
+            <w:r>
+              <w:rPr/>
+            </w:r>
+          </w:p>
+        </w:tc>
+      </w:tr>
+    </w:tbl>
+    <w:p>
+      <w:pPr>
+        <w:pStyle w:val="Normal"/>
+        <w:bidi w:val="0"/>
+        <w:jc w:val="start"/>
+        <w:rPr/>
+      </w:pPr>
+      <w:r>
+        <w:rPr/>
+      </w:r>
+    </w:p>
+    <w:p>
+      <w:pPr>
+        <w:pStyle w:val="Normal"/>
+        <w:bidi w:val="0"/>
+        <w:jc w:val="start"/>
+        <w:rPr/>
+      </w:pPr>
+      <w:r>
+        <w:rPr/>
+        <w:t>Modification d’un journal (archivage)</w:t>
+      </w:r>
+    </w:p>
+    <w:tbl>
+      <w:tblPr>
+        <w:tblW w:w="5000" w:type="pct"/>
+        <w:jc w:val="start"/>
+        <w:tblInd w:w="-5" w:type="dxa"/>
+        <w:tblLayout w:type="fixed"/>
+        <w:tblCellMar>
+          <w:top w:w="55" w:type="dxa"/>
+          <w:start w:w="55" w:type="dxa"/>
+          <w:bottom w:w="55" w:type="dxa"/>
+          <w:end w:w="55" w:type="dxa"/>
+        </w:tblCellMar>
+      </w:tblPr>
+      <w:tblGrid>
+        <w:gridCol w:w="3212"/>
+        <w:gridCol w:w="3213"/>
+        <w:gridCol w:w="3213"/>
+      </w:tblGrid>
+      <w:tr>
+        <w:trPr/>
+        <w:tc>
+          <w:tcPr>
+            <w:tcW w:w="3212" w:type="dxa"/>
+            <w:tcBorders>
+              <w:top w:val="single" w:sz="4" w:space="0" w:color="000000"/>
+              <w:start w:val="single" w:sz="4" w:space="0" w:color="000000"/>
+              <w:bottom w:val="single" w:sz="4" w:space="0" w:color="000000"/>
+            </w:tcBorders>
+          </w:tcPr>
+          <w:p>
+            <w:pPr>
+              <w:pStyle w:val="Contenudetableau"/>
+              <w:bidi w:val="0"/>
+              <w:jc w:val="start"/>
+              <w:rPr/>
+            </w:pPr>
+            <w:r>
+              <w:rPr/>
+              <w:t>Etape</w:t>
+            </w:r>
+          </w:p>
+        </w:tc>
+        <w:tc>
+          <w:tcPr>
+            <w:tcW w:w="3213" w:type="dxa"/>
+            <w:tcBorders>
+              <w:top w:val="single" w:sz="4" w:space="0" w:color="000000"/>
+              <w:start w:val="single" w:sz="4" w:space="0" w:color="000000"/>
+              <w:bottom w:val="single" w:sz="4" w:space="0" w:color="000000"/>
+            </w:tcBorders>
+          </w:tcPr>
+          <w:p>
+            <w:pPr>
+              <w:pStyle w:val="Contenudetableau"/>
+              <w:bidi w:val="0"/>
+              <w:jc w:val="start"/>
+              <w:rPr/>
+            </w:pPr>
+            <w:r>
+              <w:rPr/>
+              <w:t>Action utilisateur</w:t>
+            </w:r>
+          </w:p>
+        </w:tc>
+        <w:tc>
+          <w:tcPr>
+            <w:tcW w:w="3213" w:type="dxa"/>
+            <w:tcBorders>
+              <w:top w:val="single" w:sz="4" w:space="0" w:color="000000"/>
+              <w:start w:val="single" w:sz="4" w:space="0" w:color="000000"/>
+              <w:bottom w:val="single" w:sz="4" w:space="0" w:color="000000"/>
+              <w:end w:val="single" w:sz="4" w:space="0" w:color="000000"/>
+            </w:tcBorders>
+          </w:tcPr>
+          <w:p>
+            <w:pPr>
+              <w:pStyle w:val="Contenudetableau"/>
+              <w:bidi w:val="0"/>
+              <w:jc w:val="start"/>
+              <w:rPr/>
+            </w:pPr>
+            <w:r>
+              <w:rPr/>
+              <w:t>Réponse Api</w:t>
+            </w:r>
+          </w:p>
+        </w:tc>
+      </w:tr>
+      <w:tr>
+        <w:trPr/>
+        <w:tc>
+          <w:tcPr>
+            <w:tcW w:w="3212" w:type="dxa"/>
+            <w:tcBorders>
+              <w:start w:val="single" w:sz="4" w:space="0" w:color="000000"/>
+              <w:bottom w:val="single" w:sz="4" w:space="0" w:color="000000"/>
+            </w:tcBorders>
+          </w:tcPr>
+          <w:p>
+            <w:pPr>
+              <w:pStyle w:val="Contenudetableau"/>
+              <w:bidi w:val="0"/>
+              <w:jc w:val="start"/>
+              <w:rPr/>
+            </w:pPr>
+            <w:r>
+              <w:rPr/>
+            </w:r>
+          </w:p>
+        </w:tc>
+        <w:tc>
+          <w:tcPr>
+            <w:tcW w:w="3213" w:type="dxa"/>
+            <w:tcBorders>
+              <w:start w:val="single" w:sz="4" w:space="0" w:color="000000"/>
+              <w:bottom w:val="single" w:sz="4" w:space="0" w:color="000000"/>
+            </w:tcBorders>
+          </w:tcPr>
+          <w:p>
+            <w:pPr>
+              <w:pStyle w:val="Contenudetableau"/>
+              <w:bidi w:val="0"/>
+              <w:jc w:val="start"/>
+              <w:rPr/>
+            </w:pPr>
+            <w:r>
+              <w:rPr/>
+            </w:r>
+          </w:p>
+        </w:tc>
+        <w:tc>
+          <w:tcPr>
+            <w:tcW w:w="3213" w:type="dxa"/>
+            <w:tcBorders>
+              <w:start w:val="single" w:sz="4" w:space="0" w:color="000000"/>
+              <w:bottom w:val="single" w:sz="4" w:space="0" w:color="000000"/>
+              <w:end w:val="single" w:sz="4" w:space="0" w:color="000000"/>
+            </w:tcBorders>
+          </w:tcPr>
+          <w:p>
+            <w:pPr>
+              <w:pStyle w:val="Contenudetableau"/>
+              <w:bidi w:val="0"/>
+              <w:jc w:val="start"/>
+              <w:rPr/>
+            </w:pPr>
+            <w:r>
+              <w:rPr/>
+            </w:r>
+          </w:p>
+        </w:tc>
+      </w:tr>
+      <w:tr>
+        <w:trPr/>
+        <w:tc>
+          <w:tcPr>
+            <w:tcW w:w="3212" w:type="dxa"/>
+            <w:tcBorders>
+              <w:start w:val="single" w:sz="4" w:space="0" w:color="000000"/>
+              <w:bottom w:val="single" w:sz="4" w:space="0" w:color="000000"/>
+            </w:tcBorders>
+          </w:tcPr>
+          <w:p>
+            <w:pPr>
+              <w:pStyle w:val="Contenudetableau"/>
+              <w:bidi w:val="0"/>
+              <w:jc w:val="start"/>
+              <w:rPr/>
+            </w:pPr>
+            <w:r>
+              <w:rPr/>
+            </w:r>
+          </w:p>
+        </w:tc>
+        <w:tc>
+          <w:tcPr>
+            <w:tcW w:w="3213" w:type="dxa"/>
+            <w:tcBorders>
+              <w:start w:val="single" w:sz="4" w:space="0" w:color="000000"/>
+              <w:bottom w:val="single" w:sz="4" w:space="0" w:color="000000"/>
+            </w:tcBorders>
+          </w:tcPr>
+          <w:p>
+            <w:pPr>
+              <w:pStyle w:val="Contenudetableau"/>
+              <w:bidi w:val="0"/>
+              <w:jc w:val="start"/>
+              <w:rPr/>
+            </w:pPr>
+            <w:r>
+              <w:rPr/>
+            </w:r>
+          </w:p>
+        </w:tc>
+        <w:tc>
+          <w:tcPr>
+            <w:tcW w:w="3213" w:type="dxa"/>
+            <w:tcBorders>
+              <w:start w:val="single" w:sz="4" w:space="0" w:color="000000"/>
+              <w:bottom w:val="single" w:sz="4" w:space="0" w:color="000000"/>
+              <w:end w:val="single" w:sz="4" w:space="0" w:color="000000"/>
+            </w:tcBorders>
+          </w:tcPr>
+          <w:p>
+            <w:pPr>
+              <w:pStyle w:val="Contenudetableau"/>
+              <w:bidi w:val="0"/>
+              <w:jc w:val="start"/>
+              <w:rPr/>
+            </w:pPr>
+            <w:r>
+              <w:rPr/>
+            </w:r>
+          </w:p>
+        </w:tc>
+      </w:tr>
+    </w:tbl>
+    <w:p>
+      <w:pPr>
+        <w:pStyle w:val="Normal"/>
+        <w:bidi w:val="0"/>
+        <w:jc w:val="start"/>
+        <w:rPr/>
+      </w:pPr>
+      <w:r>
+        <w:rPr/>
+      </w:r>
+    </w:p>
+    <w:p>
+      <w:pPr>
+        <w:pStyle w:val="Normal"/>
+        <w:bidi w:val="0"/>
+        <w:jc w:val="start"/>
+        <w:rPr/>
+      </w:pPr>
+      <w:r>
+        <w:rPr/>
+        <w:t>Ajout d’un tableau</w:t>
+      </w:r>
+    </w:p>
+    <w:tbl>
+      <w:tblPr>
+        <w:tblW w:w="5000" w:type="pct"/>
+        <w:jc w:val="start"/>
+        <w:tblInd w:w="-5" w:type="dxa"/>
+        <w:tblLayout w:type="fixed"/>
+        <w:tblCellMar>
+          <w:top w:w="55" w:type="dxa"/>
+          <w:start w:w="55" w:type="dxa"/>
+          <w:bottom w:w="55" w:type="dxa"/>
+          <w:end w:w="55" w:type="dxa"/>
+        </w:tblCellMar>
+      </w:tblPr>
+      <w:tblGrid>
+        <w:gridCol w:w="3212"/>
+        <w:gridCol w:w="3213"/>
+        <w:gridCol w:w="3213"/>
+      </w:tblGrid>
+      <w:tr>
+        <w:trPr/>
+        <w:tc>
+          <w:tcPr>
+            <w:tcW w:w="3212" w:type="dxa"/>
+            <w:tcBorders>
+              <w:top w:val="single" w:sz="4" w:space="0" w:color="000000"/>
+              <w:start w:val="single" w:sz="4" w:space="0" w:color="000000"/>
+              <w:bottom w:val="single" w:sz="4" w:space="0" w:color="000000"/>
+            </w:tcBorders>
+          </w:tcPr>
+          <w:p>
+            <w:pPr>
+              <w:pStyle w:val="Contenudetableau"/>
+              <w:bidi w:val="0"/>
+              <w:jc w:val="start"/>
+              <w:rPr/>
+            </w:pPr>
+            <w:r>
+              <w:rPr/>
+              <w:t>Etape</w:t>
+            </w:r>
+          </w:p>
+        </w:tc>
+        <w:tc>
+          <w:tcPr>
+            <w:tcW w:w="3213" w:type="dxa"/>
+            <w:tcBorders>
+              <w:top w:val="single" w:sz="4" w:space="0" w:color="000000"/>
+              <w:start w:val="single" w:sz="4" w:space="0" w:color="000000"/>
+              <w:bottom w:val="single" w:sz="4" w:space="0" w:color="000000"/>
+            </w:tcBorders>
+          </w:tcPr>
+          <w:p>
+            <w:pPr>
+              <w:pStyle w:val="Contenudetableau"/>
+              <w:bidi w:val="0"/>
+              <w:jc w:val="start"/>
+              <w:rPr/>
+            </w:pPr>
+            <w:r>
+              <w:rPr/>
+              <w:t>Action utilisateur</w:t>
+            </w:r>
+          </w:p>
+        </w:tc>
+        <w:tc>
+          <w:tcPr>
+            <w:tcW w:w="3213" w:type="dxa"/>
+            <w:tcBorders>
+              <w:top w:val="single" w:sz="4" w:space="0" w:color="000000"/>
+              <w:start w:val="single" w:sz="4" w:space="0" w:color="000000"/>
+              <w:bottom w:val="single" w:sz="4" w:space="0" w:color="000000"/>
+              <w:end w:val="single" w:sz="4" w:space="0" w:color="000000"/>
+            </w:tcBorders>
+          </w:tcPr>
+          <w:p>
+            <w:pPr>
+              <w:pStyle w:val="Contenudetableau"/>
+              <w:bidi w:val="0"/>
+              <w:jc w:val="start"/>
+              <w:rPr/>
+            </w:pPr>
+            <w:r>
+              <w:rPr/>
+              <w:t>Réponse Api</w:t>
+            </w:r>
+          </w:p>
+        </w:tc>
+      </w:tr>
+      <w:tr>
+        <w:trPr/>
+        <w:tc>
+          <w:tcPr>
+            <w:tcW w:w="3212" w:type="dxa"/>
+            <w:tcBorders>
+              <w:start w:val="single" w:sz="4" w:space="0" w:color="000000"/>
+              <w:bottom w:val="single" w:sz="4" w:space="0" w:color="000000"/>
+            </w:tcBorders>
+          </w:tcPr>
+          <w:p>
+            <w:pPr>
+              <w:pStyle w:val="Contenudetableau"/>
+              <w:bidi w:val="0"/>
+              <w:jc w:val="start"/>
+              <w:rPr/>
+            </w:pPr>
+            <w:r>
+              <w:rPr/>
+            </w:r>
+          </w:p>
+        </w:tc>
+        <w:tc>
+          <w:tcPr>
+            <w:tcW w:w="3213" w:type="dxa"/>
+            <w:tcBorders>
+              <w:start w:val="single" w:sz="4" w:space="0" w:color="000000"/>
+              <w:bottom w:val="single" w:sz="4" w:space="0" w:color="000000"/>
+            </w:tcBorders>
+          </w:tcPr>
+          <w:p>
+            <w:pPr>
+              <w:pStyle w:val="Contenudetableau"/>
+              <w:bidi w:val="0"/>
+              <w:jc w:val="start"/>
+              <w:rPr/>
+            </w:pPr>
+            <w:r>
+              <w:rPr/>
+            </w:r>
+          </w:p>
+        </w:tc>
+        <w:tc>
+          <w:tcPr>
+            <w:tcW w:w="3213" w:type="dxa"/>
+            <w:tcBorders>
+              <w:start w:val="single" w:sz="4" w:space="0" w:color="000000"/>
+              <w:bottom w:val="single" w:sz="4" w:space="0" w:color="000000"/>
+              <w:end w:val="single" w:sz="4" w:space="0" w:color="000000"/>
+            </w:tcBorders>
+          </w:tcPr>
+          <w:p>
+            <w:pPr>
+              <w:pStyle w:val="Contenudetableau"/>
+              <w:bidi w:val="0"/>
+              <w:jc w:val="start"/>
+              <w:rPr/>
+            </w:pPr>
+            <w:r>
+              <w:rPr/>
+            </w:r>
+          </w:p>
+        </w:tc>
+      </w:tr>
+      <w:tr>
+        <w:trPr/>
+        <w:tc>
+          <w:tcPr>
+            <w:tcW w:w="3212" w:type="dxa"/>
+            <w:tcBorders>
+              <w:start w:val="single" w:sz="4" w:space="0" w:color="000000"/>
+              <w:bottom w:val="single" w:sz="4" w:space="0" w:color="000000"/>
+            </w:tcBorders>
+          </w:tcPr>
+          <w:p>
+            <w:pPr>
+              <w:pStyle w:val="Contenudetableau"/>
+              <w:bidi w:val="0"/>
+              <w:jc w:val="start"/>
+              <w:rPr/>
+            </w:pPr>
+            <w:r>
+              <w:rPr/>
+            </w:r>
+          </w:p>
+        </w:tc>
+        <w:tc>
+          <w:tcPr>
+            <w:tcW w:w="3213" w:type="dxa"/>
+            <w:tcBorders>
+              <w:start w:val="single" w:sz="4" w:space="0" w:color="000000"/>
+              <w:bottom w:val="single" w:sz="4" w:space="0" w:color="000000"/>
+            </w:tcBorders>
+          </w:tcPr>
+          <w:p>
+            <w:pPr>
+              <w:pStyle w:val="Contenudetableau"/>
+              <w:bidi w:val="0"/>
+              <w:jc w:val="start"/>
+              <w:rPr/>
+            </w:pPr>
+            <w:r>
+              <w:rPr/>
+            </w:r>
+          </w:p>
+        </w:tc>
+        <w:tc>
+          <w:tcPr>
+            <w:tcW w:w="3213" w:type="dxa"/>
+            <w:tcBorders>
+              <w:start w:val="single" w:sz="4" w:space="0" w:color="000000"/>
+              <w:bottom w:val="single" w:sz="4" w:space="0" w:color="000000"/>
+              <w:end w:val="single" w:sz="4" w:space="0" w:color="000000"/>
+            </w:tcBorders>
+          </w:tcPr>
+          <w:p>
+            <w:pPr>
+              <w:pStyle w:val="Contenudetableau"/>
+              <w:bidi w:val="0"/>
+              <w:jc w:val="start"/>
+              <w:rPr/>
+            </w:pPr>
+            <w:r>
+              <w:rPr/>
+            </w:r>
+          </w:p>
+        </w:tc>
+      </w:tr>
+    </w:tbl>
+    <w:p>
+      <w:pPr>
+        <w:pStyle w:val="Normal"/>
+        <w:bidi w:val="0"/>
+        <w:jc w:val="start"/>
+        <w:rPr/>
+      </w:pPr>
+      <w:r>
+        <w:rPr/>
+      </w:r>
+    </w:p>
+    <w:p>
+      <w:pPr>
+        <w:pStyle w:val="Normal"/>
+        <w:bidi w:val="0"/>
+        <w:jc w:val="start"/>
+        <w:rPr/>
+      </w:pPr>
+      <w:r>
+        <w:rPr/>
+        <w:t>Ajout d’une liste</w:t>
+      </w:r>
+    </w:p>
+    <w:tbl>
+      <w:tblPr>
+        <w:tblW w:w="5000" w:type="pct"/>
+        <w:jc w:val="start"/>
+        <w:tblInd w:w="-5" w:type="dxa"/>
+        <w:tblLayout w:type="fixed"/>
+        <w:tblCellMar>
+          <w:top w:w="55" w:type="dxa"/>
+          <w:start w:w="55" w:type="dxa"/>
+          <w:bottom w:w="55" w:type="dxa"/>
+          <w:end w:w="55" w:type="dxa"/>
+        </w:tblCellMar>
+      </w:tblPr>
+      <w:tblGrid>
+        <w:gridCol w:w="3212"/>
+        <w:gridCol w:w="3213"/>
+        <w:gridCol w:w="3213"/>
+      </w:tblGrid>
+      <w:tr>
+        <w:trPr/>
+        <w:tc>
+          <w:tcPr>
+            <w:tcW w:w="3212" w:type="dxa"/>
+            <w:tcBorders>
+              <w:top w:val="single" w:sz="4" w:space="0" w:color="000000"/>
+              <w:start w:val="single" w:sz="4" w:space="0" w:color="000000"/>
+              <w:bottom w:val="single" w:sz="4" w:space="0" w:color="000000"/>
+            </w:tcBorders>
+          </w:tcPr>
+          <w:p>
+            <w:pPr>
+              <w:pStyle w:val="Contenudetableau"/>
+              <w:bidi w:val="0"/>
+              <w:jc w:val="start"/>
+              <w:rPr/>
+            </w:pPr>
+            <w:r>
+              <w:rPr/>
+              <w:t>Etape</w:t>
+            </w:r>
+          </w:p>
+        </w:tc>
+        <w:tc>
+          <w:tcPr>
+            <w:tcW w:w="3213" w:type="dxa"/>
+            <w:tcBorders>
+              <w:top w:val="single" w:sz="4" w:space="0" w:color="000000"/>
+              <w:start w:val="single" w:sz="4" w:space="0" w:color="000000"/>
+              <w:bottom w:val="single" w:sz="4" w:space="0" w:color="000000"/>
+            </w:tcBorders>
+          </w:tcPr>
+          <w:p>
+            <w:pPr>
+              <w:pStyle w:val="Contenudetableau"/>
+              <w:bidi w:val="0"/>
+              <w:jc w:val="start"/>
+              <w:rPr/>
+            </w:pPr>
+            <w:r>
+              <w:rPr/>
+              <w:t>Action utilisateur</w:t>
+            </w:r>
+          </w:p>
+        </w:tc>
+        <w:tc>
+          <w:tcPr>
+            <w:tcW w:w="3213" w:type="dxa"/>
+            <w:tcBorders>
+              <w:top w:val="single" w:sz="4" w:space="0" w:color="000000"/>
+              <w:start w:val="single" w:sz="4" w:space="0" w:color="000000"/>
+              <w:bottom w:val="single" w:sz="4" w:space="0" w:color="000000"/>
+              <w:end w:val="single" w:sz="4" w:space="0" w:color="000000"/>
+            </w:tcBorders>
+          </w:tcPr>
+          <w:p>
+            <w:pPr>
+              <w:pStyle w:val="Contenudetableau"/>
+              <w:bidi w:val="0"/>
+              <w:jc w:val="start"/>
+              <w:rPr/>
+            </w:pPr>
+            <w:r>
+              <w:rPr/>
+              <w:t>Réponse Api</w:t>
+            </w:r>
+          </w:p>
+        </w:tc>
+      </w:tr>
+      <w:tr>
+        <w:trPr/>
+        <w:tc>
+          <w:tcPr>
+            <w:tcW w:w="3212" w:type="dxa"/>
+            <w:tcBorders>
+              <w:start w:val="single" w:sz="4" w:space="0" w:color="000000"/>
+              <w:bottom w:val="single" w:sz="4" w:space="0" w:color="000000"/>
+            </w:tcBorders>
+          </w:tcPr>
+          <w:p>
+            <w:pPr>
+              <w:pStyle w:val="Contenudetableau"/>
+              <w:bidi w:val="0"/>
+              <w:jc w:val="start"/>
+              <w:rPr/>
+            </w:pPr>
+            <w:r>
+              <w:rPr/>
+            </w:r>
+          </w:p>
+        </w:tc>
+        <w:tc>
+          <w:tcPr>
+            <w:tcW w:w="3213" w:type="dxa"/>
+            <w:tcBorders>
+              <w:start w:val="single" w:sz="4" w:space="0" w:color="000000"/>
+              <w:bottom w:val="single" w:sz="4" w:space="0" w:color="000000"/>
+            </w:tcBorders>
+          </w:tcPr>
+          <w:p>
+            <w:pPr>
+              <w:pStyle w:val="Contenudetableau"/>
+              <w:bidi w:val="0"/>
+              <w:jc w:val="start"/>
+              <w:rPr/>
+            </w:pPr>
+            <w:r>
+              <w:rPr/>
+            </w:r>
+          </w:p>
+        </w:tc>
+        <w:tc>
+          <w:tcPr>
+            <w:tcW w:w="3213" w:type="dxa"/>
+            <w:tcBorders>
+              <w:start w:val="single" w:sz="4" w:space="0" w:color="000000"/>
+              <w:bottom w:val="single" w:sz="4" w:space="0" w:color="000000"/>
+              <w:end w:val="single" w:sz="4" w:space="0" w:color="000000"/>
+            </w:tcBorders>
+          </w:tcPr>
+          <w:p>
+            <w:pPr>
+              <w:pStyle w:val="Contenudetableau"/>
+              <w:bidi w:val="0"/>
+              <w:jc w:val="start"/>
+              <w:rPr/>
+            </w:pPr>
+            <w:r>
+              <w:rPr/>
+            </w:r>
+          </w:p>
+        </w:tc>
+      </w:tr>
+      <w:tr>
+        <w:trPr/>
+        <w:tc>
+          <w:tcPr>
+            <w:tcW w:w="3212" w:type="dxa"/>
+            <w:tcBorders>
+              <w:start w:val="single" w:sz="4" w:space="0" w:color="000000"/>
+              <w:bottom w:val="single" w:sz="4" w:space="0" w:color="000000"/>
+            </w:tcBorders>
+          </w:tcPr>
+          <w:p>
+            <w:pPr>
+              <w:pStyle w:val="Contenudetableau"/>
+              <w:bidi w:val="0"/>
+              <w:jc w:val="start"/>
+              <w:rPr/>
+            </w:pPr>
+            <w:r>
+              <w:rPr/>
+            </w:r>
+          </w:p>
+        </w:tc>
+        <w:tc>
+          <w:tcPr>
+            <w:tcW w:w="3213" w:type="dxa"/>
+            <w:tcBorders>
+              <w:start w:val="single" w:sz="4" w:space="0" w:color="000000"/>
+              <w:bottom w:val="single" w:sz="4" w:space="0" w:color="000000"/>
+            </w:tcBorders>
+          </w:tcPr>
+          <w:p>
+            <w:pPr>
+              <w:pStyle w:val="Contenudetableau"/>
+              <w:bidi w:val="0"/>
+              <w:jc w:val="start"/>
+              <w:rPr/>
+            </w:pPr>
+            <w:r>
+              <w:rPr/>
+            </w:r>
+          </w:p>
+        </w:tc>
+        <w:tc>
+          <w:tcPr>
+            <w:tcW w:w="3213" w:type="dxa"/>
+            <w:tcBorders>
+              <w:start w:val="single" w:sz="4" w:space="0" w:color="000000"/>
+              <w:bottom w:val="single" w:sz="4" w:space="0" w:color="000000"/>
+              <w:end w:val="single" w:sz="4" w:space="0" w:color="000000"/>
+            </w:tcBorders>
+          </w:tcPr>
+          <w:p>
+            <w:pPr>
+              <w:pStyle w:val="Contenudetableau"/>
+              <w:bidi w:val="0"/>
+              <w:jc w:val="start"/>
+              <w:rPr/>
+            </w:pPr>
+            <w:r>
+              <w:rPr/>
+            </w:r>
+          </w:p>
+        </w:tc>
+      </w:tr>
+    </w:tbl>
+    <w:p>
+      <w:pPr>
+        <w:pStyle w:val="Normal"/>
+        <w:bidi w:val="0"/>
+        <w:jc w:val="start"/>
+        <w:rPr/>
+      </w:pPr>
+      <w:r>
+        <w:rPr/>
+      </w:r>
+    </w:p>
+    <w:p>
+      <w:pPr>
+        <w:pStyle w:val="Normal"/>
+        <w:bidi w:val="0"/>
+        <w:jc w:val="start"/>
+        <w:rPr/>
+      </w:pPr>
+      <w:r>
+        <w:rPr/>
+        <w:t>Ajout d’une carte</w:t>
+      </w:r>
+    </w:p>
+    <w:tbl>
+      <w:tblPr>
+        <w:tblW w:w="5000" w:type="pct"/>
+        <w:jc w:val="start"/>
+        <w:tblInd w:w="-5" w:type="dxa"/>
+        <w:tblLayout w:type="fixed"/>
+        <w:tblCellMar>
+          <w:top w:w="55" w:type="dxa"/>
+          <w:start w:w="55" w:type="dxa"/>
+          <w:bottom w:w="55" w:type="dxa"/>
+          <w:end w:w="55" w:type="dxa"/>
+        </w:tblCellMar>
+      </w:tblPr>
+      <w:tblGrid>
+        <w:gridCol w:w="3212"/>
+        <w:gridCol w:w="3213"/>
+        <w:gridCol w:w="3213"/>
+      </w:tblGrid>
+      <w:tr>
+        <w:trPr/>
+        <w:tc>
+          <w:tcPr>
+            <w:tcW w:w="3212" w:type="dxa"/>
+            <w:tcBorders>
+              <w:top w:val="single" w:sz="4" w:space="0" w:color="000000"/>
+              <w:start w:val="single" w:sz="4" w:space="0" w:color="000000"/>
+              <w:bottom w:val="single" w:sz="4" w:space="0" w:color="000000"/>
+            </w:tcBorders>
+          </w:tcPr>
+          <w:p>
+            <w:pPr>
+              <w:pStyle w:val="Contenudetableau"/>
+              <w:bidi w:val="0"/>
+              <w:jc w:val="start"/>
+              <w:rPr/>
+            </w:pPr>
+            <w:r>
+              <w:rPr/>
+              <w:t>Etape</w:t>
+            </w:r>
+          </w:p>
+        </w:tc>
+        <w:tc>
+          <w:tcPr>
+            <w:tcW w:w="3213" w:type="dxa"/>
+            <w:tcBorders>
+              <w:top w:val="single" w:sz="4" w:space="0" w:color="000000"/>
+              <w:start w:val="single" w:sz="4" w:space="0" w:color="000000"/>
+              <w:bottom w:val="single" w:sz="4" w:space="0" w:color="000000"/>
+            </w:tcBorders>
+          </w:tcPr>
+          <w:p>
+            <w:pPr>
+              <w:pStyle w:val="Contenudetableau"/>
+              <w:bidi w:val="0"/>
+              <w:jc w:val="start"/>
+              <w:rPr/>
+            </w:pPr>
+            <w:r>
+              <w:rPr/>
+              <w:t>Action utilisateur</w:t>
+            </w:r>
+          </w:p>
+        </w:tc>
+        <w:tc>
+          <w:tcPr>
+            <w:tcW w:w="3213" w:type="dxa"/>
+            <w:tcBorders>
+              <w:top w:val="single" w:sz="4" w:space="0" w:color="000000"/>
+              <w:start w:val="single" w:sz="4" w:space="0" w:color="000000"/>
+              <w:bottom w:val="single" w:sz="4" w:space="0" w:color="000000"/>
+              <w:end w:val="single" w:sz="4" w:space="0" w:color="000000"/>
+            </w:tcBorders>
+          </w:tcPr>
+          <w:p>
+            <w:pPr>
+              <w:pStyle w:val="Contenudetableau"/>
+              <w:bidi w:val="0"/>
+              <w:jc w:val="start"/>
+              <w:rPr/>
+            </w:pPr>
+            <w:r>
+              <w:rPr/>
+              <w:t>Réponse Api</w:t>
+            </w:r>
+          </w:p>
+        </w:tc>
+      </w:tr>
+      <w:tr>
+        <w:trPr/>
+        <w:tc>
+          <w:tcPr>
+            <w:tcW w:w="3212" w:type="dxa"/>
+            <w:tcBorders>
+              <w:start w:val="single" w:sz="4" w:space="0" w:color="000000"/>
+              <w:bottom w:val="single" w:sz="4" w:space="0" w:color="000000"/>
+            </w:tcBorders>
+          </w:tcPr>
+          <w:p>
+            <w:pPr>
+              <w:pStyle w:val="Contenudetableau"/>
+              <w:bidi w:val="0"/>
+              <w:jc w:val="start"/>
+              <w:rPr/>
+            </w:pPr>
+            <w:r>
+              <w:rPr/>
+            </w:r>
+          </w:p>
+        </w:tc>
+        <w:tc>
+          <w:tcPr>
+            <w:tcW w:w="3213" w:type="dxa"/>
+            <w:tcBorders>
+              <w:start w:val="single" w:sz="4" w:space="0" w:color="000000"/>
+              <w:bottom w:val="single" w:sz="4" w:space="0" w:color="000000"/>
+            </w:tcBorders>
+          </w:tcPr>
+          <w:p>
+            <w:pPr>
+              <w:pStyle w:val="Contenudetableau"/>
+              <w:bidi w:val="0"/>
+              <w:jc w:val="start"/>
+              <w:rPr/>
+            </w:pPr>
+            <w:r>
+              <w:rPr/>
+            </w:r>
+          </w:p>
+        </w:tc>
+        <w:tc>
+          <w:tcPr>
+            <w:tcW w:w="3213" w:type="dxa"/>
+            <w:tcBorders>
+              <w:start w:val="single" w:sz="4" w:space="0" w:color="000000"/>
+              <w:bottom w:val="single" w:sz="4" w:space="0" w:color="000000"/>
+              <w:end w:val="single" w:sz="4" w:space="0" w:color="000000"/>
+            </w:tcBorders>
+          </w:tcPr>
+          <w:p>
+            <w:pPr>
+              <w:pStyle w:val="Contenudetableau"/>
+              <w:bidi w:val="0"/>
+              <w:jc w:val="start"/>
+              <w:rPr/>
+            </w:pPr>
+            <w:r>
+              <w:rPr/>
+            </w:r>
+          </w:p>
+        </w:tc>
+      </w:tr>
+      <w:tr>
+        <w:trPr/>
+        <w:tc>
+          <w:tcPr>
+            <w:tcW w:w="3212" w:type="dxa"/>
+            <w:tcBorders>
+              <w:start w:val="single" w:sz="4" w:space="0" w:color="000000"/>
+              <w:bottom w:val="single" w:sz="4" w:space="0" w:color="000000"/>
+            </w:tcBorders>
+          </w:tcPr>
+          <w:p>
+            <w:pPr>
+              <w:pStyle w:val="Contenudetableau"/>
+              <w:bidi w:val="0"/>
+              <w:jc w:val="start"/>
+              <w:rPr/>
+            </w:pPr>
+            <w:r>
+              <w:rPr/>
+            </w:r>
+          </w:p>
+        </w:tc>
+        <w:tc>
+          <w:tcPr>
+            <w:tcW w:w="3213" w:type="dxa"/>
+            <w:tcBorders>
+              <w:start w:val="single" w:sz="4" w:space="0" w:color="000000"/>
+              <w:bottom w:val="single" w:sz="4" w:space="0" w:color="000000"/>
+            </w:tcBorders>
+          </w:tcPr>
+          <w:p>
+            <w:pPr>
+              <w:pStyle w:val="Contenudetableau"/>
+              <w:bidi w:val="0"/>
+              <w:jc w:val="start"/>
+              <w:rPr/>
+            </w:pPr>
+            <w:r>
+              <w:rPr/>
+            </w:r>
+          </w:p>
+        </w:tc>
+        <w:tc>
+          <w:tcPr>
+            <w:tcW w:w="3213" w:type="dxa"/>
+            <w:tcBorders>
+              <w:start w:val="single" w:sz="4" w:space="0" w:color="000000"/>
+              <w:bottom w:val="single" w:sz="4" w:space="0" w:color="000000"/>
+              <w:end w:val="single" w:sz="4" w:space="0" w:color="000000"/>
+            </w:tcBorders>
+          </w:tcPr>
+          <w:p>
+            <w:pPr>
+              <w:pStyle w:val="Contenudetableau"/>
+              <w:bidi w:val="0"/>
+              <w:jc w:val="start"/>
+              <w:rPr/>
+            </w:pPr>
+            <w:r>
+              <w:rPr/>
+            </w:r>
+          </w:p>
+        </w:tc>
+      </w:tr>
+    </w:tbl>
+    <w:p>
+      <w:pPr>
+        <w:pStyle w:val="Normal"/>
+        <w:bidi w:val="0"/>
+        <w:jc w:val="start"/>
+        <w:rPr/>
+      </w:pPr>
+      <w:r>
+        <w:rPr/>
+      </w:r>
+    </w:p>
+    <w:p>
+      <w:pPr>
+        <w:pStyle w:val="Normal"/>
+        <w:bidi w:val="0"/>
+        <w:jc w:val="start"/>
+        <w:rPr/>
+      </w:pPr>
+      <w:r>
+        <w:rPr/>
+        <w:t>Ajout d’une étiquette</w:t>
+      </w:r>
+    </w:p>
+    <w:tbl>
+      <w:tblPr>
+        <w:tblW w:w="5000" w:type="pct"/>
+        <w:jc w:val="start"/>
+        <w:tblInd w:w="-5" w:type="dxa"/>
+        <w:tblLayout w:type="fixed"/>
+        <w:tblCellMar>
+          <w:top w:w="55" w:type="dxa"/>
+          <w:start w:w="55" w:type="dxa"/>
+          <w:bottom w:w="55" w:type="dxa"/>
+          <w:end w:w="55" w:type="dxa"/>
+        </w:tblCellMar>
+      </w:tblPr>
+      <w:tblGrid>
+        <w:gridCol w:w="3212"/>
+        <w:gridCol w:w="3213"/>
+        <w:gridCol w:w="3213"/>
+      </w:tblGrid>
+      <w:tr>
+        <w:trPr/>
+        <w:tc>
+          <w:tcPr>
+            <w:tcW w:w="3212" w:type="dxa"/>
+            <w:tcBorders>
+              <w:top w:val="single" w:sz="4" w:space="0" w:color="000000"/>
+              <w:start w:val="single" w:sz="4" w:space="0" w:color="000000"/>
+              <w:bottom w:val="single" w:sz="4" w:space="0" w:color="000000"/>
+            </w:tcBorders>
+          </w:tcPr>
+          <w:p>
+            <w:pPr>
+              <w:pStyle w:val="Contenudetableau"/>
+              <w:bidi w:val="0"/>
+              <w:jc w:val="start"/>
+              <w:rPr/>
+            </w:pPr>
+            <w:r>
+              <w:rPr/>
+              <w:t>Etape</w:t>
+            </w:r>
+          </w:p>
+        </w:tc>
+        <w:tc>
+          <w:tcPr>
+            <w:tcW w:w="3213" w:type="dxa"/>
+            <w:tcBorders>
+              <w:top w:val="single" w:sz="4" w:space="0" w:color="000000"/>
+              <w:start w:val="single" w:sz="4" w:space="0" w:color="000000"/>
+              <w:bottom w:val="single" w:sz="4" w:space="0" w:color="000000"/>
+            </w:tcBorders>
+          </w:tcPr>
+          <w:p>
+            <w:pPr>
+              <w:pStyle w:val="Contenudetableau"/>
+              <w:bidi w:val="0"/>
+              <w:jc w:val="start"/>
+              <w:rPr/>
+            </w:pPr>
+            <w:r>
+              <w:rPr/>
+              <w:t>Action utilisateur</w:t>
+            </w:r>
+          </w:p>
+        </w:tc>
+        <w:tc>
+          <w:tcPr>
+            <w:tcW w:w="3213" w:type="dxa"/>
+            <w:tcBorders>
+              <w:top w:val="single" w:sz="4" w:space="0" w:color="000000"/>
+              <w:start w:val="single" w:sz="4" w:space="0" w:color="000000"/>
+              <w:bottom w:val="single" w:sz="4" w:space="0" w:color="000000"/>
+              <w:end w:val="single" w:sz="4" w:space="0" w:color="000000"/>
+            </w:tcBorders>
+          </w:tcPr>
+          <w:p>
+            <w:pPr>
+              <w:pStyle w:val="Contenudetableau"/>
+              <w:bidi w:val="0"/>
+              <w:jc w:val="start"/>
+              <w:rPr/>
+            </w:pPr>
+            <w:r>
+              <w:rPr/>
+              <w:t>Réponse Api</w:t>
+            </w:r>
+          </w:p>
+        </w:tc>
+      </w:tr>
+      <w:tr>
+        <w:trPr/>
+        <w:tc>
+          <w:tcPr>
+            <w:tcW w:w="3212" w:type="dxa"/>
+            <w:tcBorders>
+              <w:start w:val="single" w:sz="4" w:space="0" w:color="000000"/>
+              <w:bottom w:val="single" w:sz="4" w:space="0" w:color="000000"/>
+            </w:tcBorders>
+          </w:tcPr>
+          <w:p>
+            <w:pPr>
+              <w:pStyle w:val="Contenudetableau"/>
+              <w:bidi w:val="0"/>
+              <w:jc w:val="start"/>
+              <w:rPr/>
+            </w:pPr>
+            <w:r>
+              <w:rPr/>
+            </w:r>
+          </w:p>
+        </w:tc>
+        <w:tc>
+          <w:tcPr>
+            <w:tcW w:w="3213" w:type="dxa"/>
+            <w:tcBorders>
+              <w:start w:val="single" w:sz="4" w:space="0" w:color="000000"/>
+              <w:bottom w:val="single" w:sz="4" w:space="0" w:color="000000"/>
+            </w:tcBorders>
+          </w:tcPr>
+          <w:p>
+            <w:pPr>
+              <w:pStyle w:val="Contenudetableau"/>
+              <w:bidi w:val="0"/>
+              <w:jc w:val="start"/>
+              <w:rPr/>
+            </w:pPr>
+            <w:r>
+              <w:rPr/>
+            </w:r>
+          </w:p>
+        </w:tc>
+        <w:tc>
+          <w:tcPr>
+            <w:tcW w:w="3213" w:type="dxa"/>
+            <w:tcBorders>
+              <w:start w:val="single" w:sz="4" w:space="0" w:color="000000"/>
+              <w:bottom w:val="single" w:sz="4" w:space="0" w:color="000000"/>
+              <w:end w:val="single" w:sz="4" w:space="0" w:color="000000"/>
+            </w:tcBorders>
+          </w:tcPr>
+          <w:p>
+            <w:pPr>
+              <w:pStyle w:val="Contenudetableau"/>
+              <w:bidi w:val="0"/>
+              <w:jc w:val="start"/>
+              <w:rPr/>
+            </w:pPr>
+            <w:r>
+              <w:rPr/>
+            </w:r>
+          </w:p>
+        </w:tc>
+      </w:tr>
+      <w:tr>
+        <w:trPr/>
+        <w:tc>
+          <w:tcPr>
+            <w:tcW w:w="3212" w:type="dxa"/>
+            <w:tcBorders>
+              <w:start w:val="single" w:sz="4" w:space="0" w:color="000000"/>
+              <w:bottom w:val="single" w:sz="4" w:space="0" w:color="000000"/>
+            </w:tcBorders>
+          </w:tcPr>
+          <w:p>
+            <w:pPr>
+              <w:pStyle w:val="Contenudetableau"/>
+              <w:bidi w:val="0"/>
+              <w:jc w:val="start"/>
+              <w:rPr/>
+            </w:pPr>
+            <w:r>
+              <w:rPr/>
+            </w:r>
+          </w:p>
+        </w:tc>
+        <w:tc>
+          <w:tcPr>
+            <w:tcW w:w="3213" w:type="dxa"/>
+            <w:tcBorders>
+              <w:start w:val="single" w:sz="4" w:space="0" w:color="000000"/>
+              <w:bottom w:val="single" w:sz="4" w:space="0" w:color="000000"/>
+            </w:tcBorders>
+          </w:tcPr>
+          <w:p>
+            <w:pPr>
+              <w:pStyle w:val="Contenudetableau"/>
+              <w:bidi w:val="0"/>
+              <w:jc w:val="start"/>
+              <w:rPr/>
+            </w:pPr>
+            <w:r>
+              <w:rPr/>
+            </w:r>
+          </w:p>
+        </w:tc>
+        <w:tc>
+          <w:tcPr>
+            <w:tcW w:w="3213" w:type="dxa"/>
+            <w:tcBorders>
+              <w:start w:val="single" w:sz="4" w:space="0" w:color="000000"/>
+              <w:bottom w:val="single" w:sz="4" w:space="0" w:color="000000"/>
+              <w:end w:val="single" w:sz="4" w:space="0" w:color="000000"/>
+            </w:tcBorders>
+          </w:tcPr>
+          <w:p>
+            <w:pPr>
+              <w:pStyle w:val="Contenudetableau"/>
+              <w:bidi w:val="0"/>
+              <w:jc w:val="start"/>
+              <w:rPr/>
+            </w:pPr>
+            <w:r>
+              <w:rPr/>
+            </w:r>
+          </w:p>
+        </w:tc>
+      </w:tr>
+    </w:tbl>
+    <w:p>
+      <w:pPr>
+        <w:pStyle w:val="Normal"/>
+        <w:bidi w:val="0"/>
+        <w:jc w:val="start"/>
+        <w:rPr/>
+      </w:pPr>
+      <w:r>
+        <w:rPr/>
+      </w:r>
+    </w:p>
+    <w:p>
+      <w:pPr>
+        <w:pStyle w:val="Normal"/>
+        <w:bidi w:val="0"/>
+        <w:jc w:val="start"/>
+        <w:rPr/>
+      </w:pPr>
+      <w:r>
+        <w:rPr/>
+        <w:t>Ajout de commentaires</w:t>
+      </w:r>
+    </w:p>
+    <w:tbl>
+      <w:tblPr>
+        <w:tblW w:w="5000" w:type="pct"/>
+        <w:jc w:val="start"/>
+        <w:tblInd w:w="-5" w:type="dxa"/>
+        <w:tblLayout w:type="fixed"/>
+        <w:tblCellMar>
+          <w:top w:w="55" w:type="dxa"/>
+          <w:start w:w="55" w:type="dxa"/>
+          <w:bottom w:w="55" w:type="dxa"/>
+          <w:end w:w="55" w:type="dxa"/>
+        </w:tblCellMar>
+      </w:tblPr>
+      <w:tblGrid>
+        <w:gridCol w:w="3212"/>
+        <w:gridCol w:w="3213"/>
+        <w:gridCol w:w="3213"/>
+      </w:tblGrid>
+      <w:tr>
+        <w:trPr/>
+        <w:tc>
+          <w:tcPr>
+            <w:tcW w:w="3212" w:type="dxa"/>
+            <w:tcBorders>
+              <w:top w:val="single" w:sz="4" w:space="0" w:color="000000"/>
+              <w:start w:val="single" w:sz="4" w:space="0" w:color="000000"/>
+              <w:bottom w:val="single" w:sz="4" w:space="0" w:color="000000"/>
+            </w:tcBorders>
+          </w:tcPr>
+          <w:p>
+            <w:pPr>
+              <w:pStyle w:val="Contenudetableau"/>
+              <w:bidi w:val="0"/>
+              <w:jc w:val="start"/>
+              <w:rPr/>
+            </w:pPr>
+            <w:r>
+              <w:rPr/>
+              <w:t>Etape</w:t>
+            </w:r>
+          </w:p>
+        </w:tc>
+        <w:tc>
+          <w:tcPr>
+            <w:tcW w:w="3213" w:type="dxa"/>
+            <w:tcBorders>
+              <w:top w:val="single" w:sz="4" w:space="0" w:color="000000"/>
+              <w:start w:val="single" w:sz="4" w:space="0" w:color="000000"/>
+              <w:bottom w:val="single" w:sz="4" w:space="0" w:color="000000"/>
+            </w:tcBorders>
+          </w:tcPr>
+          <w:p>
+            <w:pPr>
+              <w:pStyle w:val="Contenudetableau"/>
+              <w:bidi w:val="0"/>
+              <w:jc w:val="start"/>
+              <w:rPr/>
+            </w:pPr>
+            <w:r>
+              <w:rPr/>
+              <w:t>Action utilisateur</w:t>
+            </w:r>
+          </w:p>
+        </w:tc>
+        <w:tc>
+          <w:tcPr>
+            <w:tcW w:w="3213" w:type="dxa"/>
+            <w:tcBorders>
+              <w:top w:val="single" w:sz="4" w:space="0" w:color="000000"/>
+              <w:start w:val="single" w:sz="4" w:space="0" w:color="000000"/>
+              <w:bottom w:val="single" w:sz="4" w:space="0" w:color="000000"/>
+              <w:end w:val="single" w:sz="4" w:space="0" w:color="000000"/>
+            </w:tcBorders>
+          </w:tcPr>
+          <w:p>
+            <w:pPr>
+              <w:pStyle w:val="Contenudetableau"/>
+              <w:bidi w:val="0"/>
+              <w:jc w:val="start"/>
+              <w:rPr/>
+            </w:pPr>
+            <w:r>
+              <w:rPr/>
+              <w:t>Réponse Api</w:t>
+            </w:r>
+          </w:p>
+        </w:tc>
+      </w:tr>
+      <w:tr>
+        <w:trPr/>
+        <w:tc>
+          <w:tcPr>
+            <w:tcW w:w="3212" w:type="dxa"/>
+            <w:tcBorders>
+              <w:start w:val="single" w:sz="4" w:space="0" w:color="000000"/>
+              <w:bottom w:val="single" w:sz="4" w:space="0" w:color="000000"/>
+            </w:tcBorders>
+          </w:tcPr>
+          <w:p>
+            <w:pPr>
+              <w:pStyle w:val="Contenudetableau"/>
+              <w:bidi w:val="0"/>
+              <w:jc w:val="start"/>
+              <w:rPr/>
+            </w:pPr>
+            <w:r>
+              <w:rPr/>
+            </w:r>
+          </w:p>
+        </w:tc>
+        <w:tc>
+          <w:tcPr>
+            <w:tcW w:w="3213" w:type="dxa"/>
+            <w:tcBorders>
+              <w:start w:val="single" w:sz="4" w:space="0" w:color="000000"/>
+              <w:bottom w:val="single" w:sz="4" w:space="0" w:color="000000"/>
+            </w:tcBorders>
+          </w:tcPr>
+          <w:p>
+            <w:pPr>
+              <w:pStyle w:val="Contenudetableau"/>
+              <w:bidi w:val="0"/>
+              <w:jc w:val="start"/>
+              <w:rPr/>
+            </w:pPr>
+            <w:r>
+              <w:rPr/>
+            </w:r>
+          </w:p>
+        </w:tc>
+        <w:tc>
+          <w:tcPr>
+            <w:tcW w:w="3213" w:type="dxa"/>
+            <w:tcBorders>
+              <w:start w:val="single" w:sz="4" w:space="0" w:color="000000"/>
+              <w:bottom w:val="single" w:sz="4" w:space="0" w:color="000000"/>
+              <w:end w:val="single" w:sz="4" w:space="0" w:color="000000"/>
+            </w:tcBorders>
+          </w:tcPr>
+          <w:p>
+            <w:pPr>
+              <w:pStyle w:val="Contenudetableau"/>
+              <w:bidi w:val="0"/>
+              <w:jc w:val="start"/>
+              <w:rPr/>
+            </w:pPr>
+            <w:r>
+              <w:rPr/>
+            </w:r>
+          </w:p>
+        </w:tc>
+      </w:tr>
+      <w:tr>
+        <w:trPr/>
+        <w:tc>
+          <w:tcPr>
+            <w:tcW w:w="3212" w:type="dxa"/>
+            <w:tcBorders>
+              <w:start w:val="single" w:sz="4" w:space="0" w:color="000000"/>
+              <w:bottom w:val="single" w:sz="4" w:space="0" w:color="000000"/>
+            </w:tcBorders>
+          </w:tcPr>
+          <w:p>
+            <w:pPr>
+              <w:pStyle w:val="Contenudetableau"/>
+              <w:bidi w:val="0"/>
+              <w:jc w:val="start"/>
+              <w:rPr/>
+            </w:pPr>
+            <w:r>
+              <w:rPr/>
+            </w:r>
+          </w:p>
+        </w:tc>
+        <w:tc>
+          <w:tcPr>
+            <w:tcW w:w="3213" w:type="dxa"/>
+            <w:tcBorders>
+              <w:start w:val="single" w:sz="4" w:space="0" w:color="000000"/>
+              <w:bottom w:val="single" w:sz="4" w:space="0" w:color="000000"/>
+            </w:tcBorders>
+          </w:tcPr>
+          <w:p>
+            <w:pPr>
+              <w:pStyle w:val="Contenudetableau"/>
+              <w:bidi w:val="0"/>
+              <w:jc w:val="start"/>
+              <w:rPr/>
+            </w:pPr>
+            <w:r>
+              <w:rPr/>
+            </w:r>
+          </w:p>
+        </w:tc>
+        <w:tc>
+          <w:tcPr>
+            <w:tcW w:w="3213" w:type="dxa"/>
+            <w:tcBorders>
+              <w:start w:val="single" w:sz="4" w:space="0" w:color="000000"/>
+              <w:bottom w:val="single" w:sz="4" w:space="0" w:color="000000"/>
+              <w:end w:val="single" w:sz="4" w:space="0" w:color="000000"/>
+            </w:tcBorders>
+          </w:tcPr>
+          <w:p>
+            <w:pPr>
+              <w:pStyle w:val="Contenudetableau"/>
+              <w:bidi w:val="0"/>
+              <w:jc w:val="start"/>
+              <w:rPr/>
+            </w:pPr>
+            <w:r>
+              <w:rPr/>
+            </w:r>
+          </w:p>
+        </w:tc>
+      </w:tr>
+    </w:tbl>
+    <w:p>
+      <w:pPr>
+        <w:pStyle w:val="Normal"/>
+        <w:bidi w:val="0"/>
+        <w:jc w:val="start"/>
+        <w:rPr/>
+      </w:pPr>
+      <w:r>
+        <w:rPr/>
+      </w:r>
+    </w:p>
+    <w:p>
+      <w:pPr>
+        <w:pStyle w:val="Normal"/>
+        <w:bidi w:val="0"/>
+        <w:jc w:val="start"/>
+        <w:rPr/>
+      </w:pPr>
+      <w:r>
+        <w:rPr/>
+        <w:t>Ajout de compte (admin)</w:t>
+      </w:r>
+    </w:p>
+    <w:tbl>
+      <w:tblPr>
+        <w:tblW w:w="5000" w:type="pct"/>
+        <w:jc w:val="start"/>
+        <w:tblInd w:w="-5" w:type="dxa"/>
+        <w:tblLayout w:type="fixed"/>
+        <w:tblCellMar>
+          <w:top w:w="55" w:type="dxa"/>
+          <w:start w:w="55" w:type="dxa"/>
+          <w:bottom w:w="55" w:type="dxa"/>
+          <w:end w:w="55" w:type="dxa"/>
+        </w:tblCellMar>
+      </w:tblPr>
+      <w:tblGrid>
+        <w:gridCol w:w="3212"/>
+        <w:gridCol w:w="3213"/>
+        <w:gridCol w:w="3213"/>
+      </w:tblGrid>
+      <w:tr>
+        <w:trPr/>
+        <w:tc>
+          <w:tcPr>
+            <w:tcW w:w="3212" w:type="dxa"/>
+            <w:tcBorders>
+              <w:top w:val="single" w:sz="4" w:space="0" w:color="000000"/>
+              <w:start w:val="single" w:sz="4" w:space="0" w:color="000000"/>
+              <w:bottom w:val="single" w:sz="4" w:space="0" w:color="000000"/>
+            </w:tcBorders>
+          </w:tcPr>
+          <w:p>
+            <w:pPr>
+              <w:pStyle w:val="Contenudetableau"/>
+              <w:bidi w:val="0"/>
+              <w:jc w:val="start"/>
+              <w:rPr/>
+            </w:pPr>
+            <w:r>
+              <w:rPr/>
+              <w:t>Etape</w:t>
+            </w:r>
+          </w:p>
+        </w:tc>
+        <w:tc>
+          <w:tcPr>
+            <w:tcW w:w="3213" w:type="dxa"/>
+            <w:tcBorders>
+              <w:top w:val="single" w:sz="4" w:space="0" w:color="000000"/>
+              <w:start w:val="single" w:sz="4" w:space="0" w:color="000000"/>
+              <w:bottom w:val="single" w:sz="4" w:space="0" w:color="000000"/>
+            </w:tcBorders>
+          </w:tcPr>
+          <w:p>
+            <w:pPr>
+              <w:pStyle w:val="Contenudetableau"/>
+              <w:bidi w:val="0"/>
+              <w:jc w:val="start"/>
+              <w:rPr/>
+            </w:pPr>
+            <w:r>
+              <w:rPr/>
+              <w:t>Action utilisateur</w:t>
+            </w:r>
+          </w:p>
+        </w:tc>
+        <w:tc>
+          <w:tcPr>
+            <w:tcW w:w="3213" w:type="dxa"/>
+            <w:tcBorders>
+              <w:top w:val="single" w:sz="4" w:space="0" w:color="000000"/>
+              <w:start w:val="single" w:sz="4" w:space="0" w:color="000000"/>
+              <w:bottom w:val="single" w:sz="4" w:space="0" w:color="000000"/>
+              <w:end w:val="single" w:sz="4" w:space="0" w:color="000000"/>
+            </w:tcBorders>
+          </w:tcPr>
+          <w:p>
+            <w:pPr>
+              <w:pStyle w:val="Contenudetableau"/>
+              <w:bidi w:val="0"/>
+              <w:jc w:val="start"/>
+              <w:rPr/>
+            </w:pPr>
+            <w:r>
+              <w:rPr/>
+              <w:t>Réponse Api</w:t>
+            </w:r>
+          </w:p>
+        </w:tc>
+      </w:tr>
+      <w:tr>
+        <w:trPr/>
+        <w:tc>
+          <w:tcPr>
+            <w:tcW w:w="3212" w:type="dxa"/>
+            <w:tcBorders>
+              <w:start w:val="single" w:sz="4" w:space="0" w:color="000000"/>
+              <w:bottom w:val="single" w:sz="4" w:space="0" w:color="000000"/>
+            </w:tcBorders>
+          </w:tcPr>
+          <w:p>
+            <w:pPr>
+              <w:pStyle w:val="Contenudetableau"/>
+              <w:bidi w:val="0"/>
+              <w:jc w:val="start"/>
+              <w:rPr/>
+            </w:pPr>
+            <w:r>
+              <w:rPr/>
+            </w:r>
+          </w:p>
+        </w:tc>
+        <w:tc>
+          <w:tcPr>
+            <w:tcW w:w="3213" w:type="dxa"/>
+            <w:tcBorders>
+              <w:start w:val="single" w:sz="4" w:space="0" w:color="000000"/>
+              <w:bottom w:val="single" w:sz="4" w:space="0" w:color="000000"/>
+            </w:tcBorders>
+          </w:tcPr>
+          <w:p>
+            <w:pPr>
+              <w:pStyle w:val="Contenudetableau"/>
+              <w:bidi w:val="0"/>
+              <w:jc w:val="start"/>
+              <w:rPr/>
+            </w:pPr>
+            <w:r>
+              <w:rPr/>
+            </w:r>
+          </w:p>
+        </w:tc>
+        <w:tc>
+          <w:tcPr>
+            <w:tcW w:w="3213" w:type="dxa"/>
+            <w:tcBorders>
+              <w:start w:val="single" w:sz="4" w:space="0" w:color="000000"/>
+              <w:bottom w:val="single" w:sz="4" w:space="0" w:color="000000"/>
+              <w:end w:val="single" w:sz="4" w:space="0" w:color="000000"/>
+            </w:tcBorders>
+          </w:tcPr>
+          <w:p>
+            <w:pPr>
+              <w:pStyle w:val="Contenudetableau"/>
+              <w:bidi w:val="0"/>
+              <w:jc w:val="start"/>
+              <w:rPr/>
+            </w:pPr>
+            <w:r>
+              <w:rPr/>
+            </w:r>
+          </w:p>
+        </w:tc>
+      </w:tr>
+      <w:tr>
+        <w:trPr/>
+        <w:tc>
+          <w:tcPr>
+            <w:tcW w:w="3212" w:type="dxa"/>
+            <w:tcBorders>
+              <w:start w:val="single" w:sz="4" w:space="0" w:color="000000"/>
+              <w:bottom w:val="single" w:sz="4" w:space="0" w:color="000000"/>
+            </w:tcBorders>
+          </w:tcPr>
+          <w:p>
+            <w:pPr>
+              <w:pStyle w:val="Contenudetableau"/>
+              <w:bidi w:val="0"/>
+              <w:jc w:val="start"/>
+              <w:rPr/>
+            </w:pPr>
+            <w:r>
+              <w:rPr/>
+            </w:r>
+          </w:p>
+        </w:tc>
+        <w:tc>
+          <w:tcPr>
+            <w:tcW w:w="3213" w:type="dxa"/>
+            <w:tcBorders>
+              <w:start w:val="single" w:sz="4" w:space="0" w:color="000000"/>
+              <w:bottom w:val="single" w:sz="4" w:space="0" w:color="000000"/>
+            </w:tcBorders>
+          </w:tcPr>
+          <w:p>
+            <w:pPr>
+              <w:pStyle w:val="Contenudetableau"/>
+              <w:bidi w:val="0"/>
+              <w:jc w:val="start"/>
+              <w:rPr/>
+            </w:pPr>
+            <w:r>
+              <w:rPr/>
+            </w:r>
+          </w:p>
+        </w:tc>
+        <w:tc>
+          <w:tcPr>
+            <w:tcW w:w="3213" w:type="dxa"/>
+            <w:tcBorders>
+              <w:start w:val="single" w:sz="4" w:space="0" w:color="000000"/>
+              <w:bottom w:val="single" w:sz="4" w:space="0" w:color="000000"/>
+              <w:end w:val="single" w:sz="4" w:space="0" w:color="000000"/>
+            </w:tcBorders>
+          </w:tcPr>
+          <w:p>
+            <w:pPr>
+              <w:pStyle w:val="Contenudetableau"/>
+              <w:bidi w:val="0"/>
+              <w:jc w:val="start"/>
+              <w:rPr/>
+            </w:pPr>
+            <w:r>
+              <w:rPr/>
+            </w:r>
+          </w:p>
+        </w:tc>
+      </w:tr>
+    </w:tbl>
+    <w:p>
+      <w:pPr>
+        <w:pStyle w:val="Normal"/>
+        <w:bidi w:val="0"/>
+        <w:jc w:val="start"/>
+        <w:rPr/>
+      </w:pPr>
+      <w:r>
+        <w:rPr/>
+      </w:r>
+    </w:p>
+    <w:p>
+      <w:pPr>
+        <w:pStyle w:val="Normal"/>
+        <w:bidi w:val="0"/>
+        <w:jc w:val="start"/>
+        <w:rPr/>
+      </w:pPr>
+      <w:r>
+        <w:rPr/>
+        <w:t>Suppression d’un tableau</w:t>
+      </w:r>
+    </w:p>
+    <w:tbl>
+      <w:tblPr>
+        <w:tblW w:w="5000" w:type="pct"/>
+        <w:jc w:val="start"/>
+        <w:tblInd w:w="-5" w:type="dxa"/>
+        <w:tblLayout w:type="fixed"/>
+        <w:tblCellMar>
+          <w:top w:w="55" w:type="dxa"/>
+          <w:start w:w="55" w:type="dxa"/>
+          <w:bottom w:w="55" w:type="dxa"/>
+          <w:end w:w="55" w:type="dxa"/>
+        </w:tblCellMar>
+      </w:tblPr>
+      <w:tblGrid>
+        <w:gridCol w:w="3212"/>
+        <w:gridCol w:w="3213"/>
+        <w:gridCol w:w="3213"/>
+      </w:tblGrid>
+      <w:tr>
+        <w:trPr/>
+        <w:tc>
+          <w:tcPr>
+            <w:tcW w:w="3212" w:type="dxa"/>
+            <w:tcBorders>
+              <w:top w:val="single" w:sz="4" w:space="0" w:color="000000"/>
+              <w:start w:val="single" w:sz="4" w:space="0" w:color="000000"/>
+              <w:bottom w:val="single" w:sz="4" w:space="0" w:color="000000"/>
+            </w:tcBorders>
+          </w:tcPr>
+          <w:p>
+            <w:pPr>
+              <w:pStyle w:val="Contenudetableau"/>
+              <w:bidi w:val="0"/>
+              <w:jc w:val="start"/>
+              <w:rPr/>
+            </w:pPr>
+            <w:r>
+              <w:rPr/>
+              <w:t>Etape</w:t>
+            </w:r>
+          </w:p>
+        </w:tc>
+        <w:tc>
+          <w:tcPr>
+            <w:tcW w:w="3213" w:type="dxa"/>
+            <w:tcBorders>
+              <w:top w:val="single" w:sz="4" w:space="0" w:color="000000"/>
+              <w:start w:val="single" w:sz="4" w:space="0" w:color="000000"/>
+              <w:bottom w:val="single" w:sz="4" w:space="0" w:color="000000"/>
+            </w:tcBorders>
+          </w:tcPr>
+          <w:p>
+            <w:pPr>
+              <w:pStyle w:val="Contenudetableau"/>
+              <w:bidi w:val="0"/>
+              <w:jc w:val="start"/>
+              <w:rPr/>
+            </w:pPr>
+            <w:r>
+              <w:rPr/>
+              <w:t>Action utilisateur</w:t>
+            </w:r>
+          </w:p>
+        </w:tc>
+        <w:tc>
+          <w:tcPr>
+            <w:tcW w:w="3213" w:type="dxa"/>
+            <w:tcBorders>
+              <w:top w:val="single" w:sz="4" w:space="0" w:color="000000"/>
+              <w:start w:val="single" w:sz="4" w:space="0" w:color="000000"/>
+              <w:bottom w:val="single" w:sz="4" w:space="0" w:color="000000"/>
+              <w:end w:val="single" w:sz="4" w:space="0" w:color="000000"/>
+            </w:tcBorders>
+          </w:tcPr>
+          <w:p>
+            <w:pPr>
+              <w:pStyle w:val="Contenudetableau"/>
+              <w:bidi w:val="0"/>
+              <w:jc w:val="start"/>
+              <w:rPr/>
+            </w:pPr>
+            <w:r>
+              <w:rPr/>
+              <w:t>Réponse Api</w:t>
+            </w:r>
+          </w:p>
+        </w:tc>
+      </w:tr>
+      <w:tr>
+        <w:trPr/>
+        <w:tc>
+          <w:tcPr>
+            <w:tcW w:w="3212" w:type="dxa"/>
+            <w:tcBorders>
+              <w:start w:val="single" w:sz="4" w:space="0" w:color="000000"/>
+              <w:bottom w:val="single" w:sz="4" w:space="0" w:color="000000"/>
+            </w:tcBorders>
+          </w:tcPr>
+          <w:p>
+            <w:pPr>
+              <w:pStyle w:val="Contenudetableau"/>
+              <w:bidi w:val="0"/>
+              <w:jc w:val="start"/>
+              <w:rPr/>
+            </w:pPr>
+            <w:r>
+              <w:rPr/>
+            </w:r>
+          </w:p>
+        </w:tc>
+        <w:tc>
+          <w:tcPr>
+            <w:tcW w:w="3213" w:type="dxa"/>
+            <w:tcBorders>
+              <w:start w:val="single" w:sz="4" w:space="0" w:color="000000"/>
+              <w:bottom w:val="single" w:sz="4" w:space="0" w:color="000000"/>
+            </w:tcBorders>
+          </w:tcPr>
+          <w:p>
+            <w:pPr>
+              <w:pStyle w:val="Contenudetableau"/>
+              <w:bidi w:val="0"/>
+              <w:jc w:val="start"/>
+              <w:rPr/>
+            </w:pPr>
+            <w:r>
+              <w:rPr/>
+            </w:r>
+          </w:p>
+        </w:tc>
+        <w:tc>
+          <w:tcPr>
+            <w:tcW w:w="3213" w:type="dxa"/>
+            <w:tcBorders>
+              <w:start w:val="single" w:sz="4" w:space="0" w:color="000000"/>
+              <w:bottom w:val="single" w:sz="4" w:space="0" w:color="000000"/>
+              <w:end w:val="single" w:sz="4" w:space="0" w:color="000000"/>
+            </w:tcBorders>
+          </w:tcPr>
+          <w:p>
+            <w:pPr>
+              <w:pStyle w:val="Contenudetableau"/>
+              <w:bidi w:val="0"/>
+              <w:jc w:val="start"/>
+              <w:rPr/>
+            </w:pPr>
+            <w:r>
+              <w:rPr/>
+            </w:r>
+          </w:p>
+        </w:tc>
+      </w:tr>
+      <w:tr>
+        <w:trPr/>
+        <w:tc>
+          <w:tcPr>
+            <w:tcW w:w="3212" w:type="dxa"/>
+            <w:tcBorders>
+              <w:start w:val="single" w:sz="4" w:space="0" w:color="000000"/>
+              <w:bottom w:val="single" w:sz="4" w:space="0" w:color="000000"/>
+            </w:tcBorders>
+          </w:tcPr>
+          <w:p>
+            <w:pPr>
+              <w:pStyle w:val="Contenudetableau"/>
+              <w:bidi w:val="0"/>
+              <w:jc w:val="start"/>
+              <w:rPr/>
+            </w:pPr>
+            <w:r>
+              <w:rPr/>
+            </w:r>
+          </w:p>
+        </w:tc>
+        <w:tc>
+          <w:tcPr>
+            <w:tcW w:w="3213" w:type="dxa"/>
+            <w:tcBorders>
+              <w:start w:val="single" w:sz="4" w:space="0" w:color="000000"/>
+              <w:bottom w:val="single" w:sz="4" w:space="0" w:color="000000"/>
+            </w:tcBorders>
+          </w:tcPr>
+          <w:p>
+            <w:pPr>
+              <w:pStyle w:val="Contenudetableau"/>
+              <w:bidi w:val="0"/>
+              <w:jc w:val="start"/>
+              <w:rPr/>
+            </w:pPr>
+            <w:r>
+              <w:rPr/>
+            </w:r>
+          </w:p>
+        </w:tc>
+        <w:tc>
+          <w:tcPr>
+            <w:tcW w:w="3213" w:type="dxa"/>
+            <w:tcBorders>
+              <w:start w:val="single" w:sz="4" w:space="0" w:color="000000"/>
+              <w:bottom w:val="single" w:sz="4" w:space="0" w:color="000000"/>
+              <w:end w:val="single" w:sz="4" w:space="0" w:color="000000"/>
+            </w:tcBorders>
+          </w:tcPr>
+          <w:p>
+            <w:pPr>
+              <w:pStyle w:val="Contenudetableau"/>
+              <w:bidi w:val="0"/>
+              <w:jc w:val="start"/>
+              <w:rPr/>
+            </w:pPr>
+            <w:r>
+              <w:rPr/>
+            </w:r>
+          </w:p>
+        </w:tc>
+      </w:tr>
+    </w:tbl>
+    <w:p>
+      <w:pPr>
+        <w:pStyle w:val="Normal"/>
+        <w:bidi w:val="0"/>
+        <w:jc w:val="start"/>
+        <w:rPr/>
+      </w:pPr>
+      <w:r>
+        <w:rPr/>
+      </w:r>
+    </w:p>
+    <w:p>
+      <w:pPr>
+        <w:pStyle w:val="Normal"/>
+        <w:bidi w:val="0"/>
+        <w:jc w:val="start"/>
+        <w:rPr/>
+      </w:pPr>
+      <w:r>
+        <w:rPr/>
+        <w:t>Suppression d’une liste</w:t>
+      </w:r>
+    </w:p>
+    <w:tbl>
+      <w:tblPr>
+        <w:tblW w:w="5000" w:type="pct"/>
+        <w:jc w:val="start"/>
+        <w:tblInd w:w="-5" w:type="dxa"/>
+        <w:tblLayout w:type="fixed"/>
+        <w:tblCellMar>
+          <w:top w:w="55" w:type="dxa"/>
+          <w:start w:w="55" w:type="dxa"/>
+          <w:bottom w:w="55" w:type="dxa"/>
+          <w:end w:w="55" w:type="dxa"/>
+        </w:tblCellMar>
+      </w:tblPr>
+      <w:tblGrid>
+        <w:gridCol w:w="3212"/>
+        <w:gridCol w:w="3213"/>
+        <w:gridCol w:w="3213"/>
+      </w:tblGrid>
+      <w:tr>
+        <w:trPr/>
+        <w:tc>
+          <w:tcPr>
+            <w:tcW w:w="3212" w:type="dxa"/>
+            <w:tcBorders>
+              <w:top w:val="single" w:sz="4" w:space="0" w:color="000000"/>
+              <w:start w:val="single" w:sz="4" w:space="0" w:color="000000"/>
+              <w:bottom w:val="single" w:sz="4" w:space="0" w:color="000000"/>
+            </w:tcBorders>
+          </w:tcPr>
+          <w:p>
+            <w:pPr>
+              <w:pStyle w:val="Contenudetableau"/>
+              <w:bidi w:val="0"/>
+              <w:jc w:val="start"/>
+              <w:rPr/>
+            </w:pPr>
+            <w:r>
+              <w:rPr/>
+              <w:t>Etape</w:t>
+            </w:r>
+          </w:p>
+        </w:tc>
+        <w:tc>
+          <w:tcPr>
+            <w:tcW w:w="3213" w:type="dxa"/>
+            <w:tcBorders>
+              <w:top w:val="single" w:sz="4" w:space="0" w:color="000000"/>
+              <w:start w:val="single" w:sz="4" w:space="0" w:color="000000"/>
+              <w:bottom w:val="single" w:sz="4" w:space="0" w:color="000000"/>
+            </w:tcBorders>
+          </w:tcPr>
+          <w:p>
+            <w:pPr>
+              <w:pStyle w:val="Contenudetableau"/>
+              <w:bidi w:val="0"/>
+              <w:jc w:val="start"/>
+              <w:rPr/>
+            </w:pPr>
+            <w:r>
+              <w:rPr/>
+              <w:t>Action utilisateur</w:t>
+            </w:r>
+          </w:p>
+        </w:tc>
+        <w:tc>
+          <w:tcPr>
+            <w:tcW w:w="3213" w:type="dxa"/>
+            <w:tcBorders>
+              <w:top w:val="single" w:sz="4" w:space="0" w:color="000000"/>
+              <w:start w:val="single" w:sz="4" w:space="0" w:color="000000"/>
+              <w:bottom w:val="single" w:sz="4" w:space="0" w:color="000000"/>
+              <w:end w:val="single" w:sz="4" w:space="0" w:color="000000"/>
+            </w:tcBorders>
+          </w:tcPr>
+          <w:p>
+            <w:pPr>
+              <w:pStyle w:val="Contenudetableau"/>
+              <w:bidi w:val="0"/>
+              <w:jc w:val="start"/>
+              <w:rPr/>
+            </w:pPr>
+            <w:r>
+              <w:rPr/>
+              <w:t>Réponse Api</w:t>
+            </w:r>
+          </w:p>
+        </w:tc>
+      </w:tr>
+      <w:tr>
+        <w:trPr/>
+        <w:tc>
+          <w:tcPr>
+            <w:tcW w:w="3212" w:type="dxa"/>
+            <w:tcBorders>
+              <w:start w:val="single" w:sz="4" w:space="0" w:color="000000"/>
+              <w:bottom w:val="single" w:sz="4" w:space="0" w:color="000000"/>
+            </w:tcBorders>
+          </w:tcPr>
+          <w:p>
+            <w:pPr>
+              <w:pStyle w:val="Contenudetableau"/>
+              <w:bidi w:val="0"/>
+              <w:jc w:val="start"/>
+              <w:rPr/>
+            </w:pPr>
+            <w:r>
+              <w:rPr/>
+            </w:r>
+          </w:p>
+        </w:tc>
+        <w:tc>
+          <w:tcPr>
+            <w:tcW w:w="3213" w:type="dxa"/>
+            <w:tcBorders>
+              <w:start w:val="single" w:sz="4" w:space="0" w:color="000000"/>
+              <w:bottom w:val="single" w:sz="4" w:space="0" w:color="000000"/>
+            </w:tcBorders>
+          </w:tcPr>
+          <w:p>
+            <w:pPr>
+              <w:pStyle w:val="Contenudetableau"/>
+              <w:bidi w:val="0"/>
+              <w:jc w:val="start"/>
+              <w:rPr/>
+            </w:pPr>
+            <w:r>
+              <w:rPr/>
+            </w:r>
+          </w:p>
+        </w:tc>
+        <w:tc>
+          <w:tcPr>
+            <w:tcW w:w="3213" w:type="dxa"/>
+            <w:tcBorders>
+              <w:start w:val="single" w:sz="4" w:space="0" w:color="000000"/>
+              <w:bottom w:val="single" w:sz="4" w:space="0" w:color="000000"/>
+              <w:end w:val="single" w:sz="4" w:space="0" w:color="000000"/>
+            </w:tcBorders>
+          </w:tcPr>
+          <w:p>
+            <w:pPr>
+              <w:pStyle w:val="Contenudetableau"/>
+              <w:bidi w:val="0"/>
+              <w:jc w:val="start"/>
+              <w:rPr/>
+            </w:pPr>
+            <w:r>
+              <w:rPr/>
+            </w:r>
+          </w:p>
+        </w:tc>
+      </w:tr>
+      <w:tr>
+        <w:trPr/>
+        <w:tc>
+          <w:tcPr>
+            <w:tcW w:w="3212" w:type="dxa"/>
+            <w:tcBorders>
+              <w:start w:val="single" w:sz="4" w:space="0" w:color="000000"/>
+              <w:bottom w:val="single" w:sz="4" w:space="0" w:color="000000"/>
+            </w:tcBorders>
+          </w:tcPr>
+          <w:p>
+            <w:pPr>
+              <w:pStyle w:val="Contenudetableau"/>
+              <w:bidi w:val="0"/>
+              <w:jc w:val="start"/>
+              <w:rPr/>
+            </w:pPr>
+            <w:r>
+              <w:rPr/>
+            </w:r>
+          </w:p>
+        </w:tc>
+        <w:tc>
+          <w:tcPr>
+            <w:tcW w:w="3213" w:type="dxa"/>
+            <w:tcBorders>
+              <w:start w:val="single" w:sz="4" w:space="0" w:color="000000"/>
+              <w:bottom w:val="single" w:sz="4" w:space="0" w:color="000000"/>
+            </w:tcBorders>
+          </w:tcPr>
+          <w:p>
+            <w:pPr>
+              <w:pStyle w:val="Contenudetableau"/>
+              <w:bidi w:val="0"/>
+              <w:jc w:val="start"/>
+              <w:rPr/>
+            </w:pPr>
+            <w:r>
+              <w:rPr/>
+            </w:r>
+          </w:p>
+        </w:tc>
+        <w:tc>
+          <w:tcPr>
+            <w:tcW w:w="3213" w:type="dxa"/>
+            <w:tcBorders>
+              <w:start w:val="single" w:sz="4" w:space="0" w:color="000000"/>
+              <w:bottom w:val="single" w:sz="4" w:space="0" w:color="000000"/>
+              <w:end w:val="single" w:sz="4" w:space="0" w:color="000000"/>
+            </w:tcBorders>
+          </w:tcPr>
+          <w:p>
+            <w:pPr>
+              <w:pStyle w:val="Contenudetableau"/>
+              <w:bidi w:val="0"/>
+              <w:jc w:val="start"/>
+              <w:rPr/>
+            </w:pPr>
+            <w:r>
+              <w:rPr/>
+            </w:r>
+          </w:p>
+        </w:tc>
+      </w:tr>
+    </w:tbl>
+    <w:p>
+      <w:pPr>
+        <w:pStyle w:val="Normal"/>
+        <w:bidi w:val="0"/>
+        <w:jc w:val="start"/>
+        <w:rPr/>
+      </w:pPr>
+      <w:r>
+        <w:rPr/>
+      </w:r>
+    </w:p>
+    <w:p>
+      <w:pPr>
+        <w:pStyle w:val="Normal"/>
+        <w:bidi w:val="0"/>
+        <w:jc w:val="start"/>
+        <w:rPr/>
+      </w:pPr>
+      <w:r>
+        <w:rPr/>
+        <w:t>Suppression d’une carte</w:t>
+      </w:r>
+    </w:p>
+    <w:tbl>
+      <w:tblPr>
+        <w:tblW w:w="5000" w:type="pct"/>
+        <w:jc w:val="start"/>
+        <w:tblInd w:w="-5" w:type="dxa"/>
+        <w:tblLayout w:type="fixed"/>
+        <w:tblCellMar>
+          <w:top w:w="55" w:type="dxa"/>
+          <w:start w:w="55" w:type="dxa"/>
+          <w:bottom w:w="55" w:type="dxa"/>
+          <w:end w:w="55" w:type="dxa"/>
+        </w:tblCellMar>
+      </w:tblPr>
+      <w:tblGrid>
+        <w:gridCol w:w="3212"/>
+        <w:gridCol w:w="3213"/>
+        <w:gridCol w:w="3213"/>
+      </w:tblGrid>
+      <w:tr>
+        <w:trPr/>
+        <w:tc>
+          <w:tcPr>
+            <w:tcW w:w="3212" w:type="dxa"/>
+            <w:tcBorders>
+              <w:top w:val="single" w:sz="4" w:space="0" w:color="000000"/>
+              <w:start w:val="single" w:sz="4" w:space="0" w:color="000000"/>
+              <w:bottom w:val="single" w:sz="4" w:space="0" w:color="000000"/>
+            </w:tcBorders>
+          </w:tcPr>
+          <w:p>
+            <w:pPr>
+              <w:pStyle w:val="Contenudetableau"/>
+              <w:bidi w:val="0"/>
+              <w:jc w:val="start"/>
+              <w:rPr/>
+            </w:pPr>
+            <w:r>
+              <w:rPr/>
+              <w:t>Etape</w:t>
+            </w:r>
+          </w:p>
+        </w:tc>
+        <w:tc>
+          <w:tcPr>
+            <w:tcW w:w="3213" w:type="dxa"/>
+            <w:tcBorders>
+              <w:top w:val="single" w:sz="4" w:space="0" w:color="000000"/>
+              <w:start w:val="single" w:sz="4" w:space="0" w:color="000000"/>
+              <w:bottom w:val="single" w:sz="4" w:space="0" w:color="000000"/>
+            </w:tcBorders>
+          </w:tcPr>
+          <w:p>
+            <w:pPr>
+              <w:pStyle w:val="Contenudetableau"/>
+              <w:bidi w:val="0"/>
+              <w:jc w:val="start"/>
+              <w:rPr/>
+            </w:pPr>
+            <w:r>
+              <w:rPr/>
+              <w:t>Action utilisateur</w:t>
+            </w:r>
+          </w:p>
+        </w:tc>
+        <w:tc>
+          <w:tcPr>
+            <w:tcW w:w="3213" w:type="dxa"/>
+            <w:tcBorders>
+              <w:top w:val="single" w:sz="4" w:space="0" w:color="000000"/>
+              <w:start w:val="single" w:sz="4" w:space="0" w:color="000000"/>
+              <w:bottom w:val="single" w:sz="4" w:space="0" w:color="000000"/>
+              <w:end w:val="single" w:sz="4" w:space="0" w:color="000000"/>
+            </w:tcBorders>
+          </w:tcPr>
+          <w:p>
+            <w:pPr>
+              <w:pStyle w:val="Contenudetableau"/>
+              <w:bidi w:val="0"/>
+              <w:jc w:val="start"/>
+              <w:rPr/>
+            </w:pPr>
+            <w:r>
+              <w:rPr/>
+              <w:t>Réponse Api</w:t>
+            </w:r>
+          </w:p>
+        </w:tc>
+      </w:tr>
+      <w:tr>
+        <w:trPr/>
+        <w:tc>
+          <w:tcPr>
+            <w:tcW w:w="3212" w:type="dxa"/>
+            <w:tcBorders>
+              <w:start w:val="single" w:sz="4" w:space="0" w:color="000000"/>
+              <w:bottom w:val="single" w:sz="4" w:space="0" w:color="000000"/>
+            </w:tcBorders>
+          </w:tcPr>
+          <w:p>
+            <w:pPr>
+              <w:pStyle w:val="Contenudetableau"/>
+              <w:bidi w:val="0"/>
+              <w:jc w:val="start"/>
+              <w:rPr/>
+            </w:pPr>
+            <w:r>
+              <w:rPr/>
+            </w:r>
+          </w:p>
+        </w:tc>
+        <w:tc>
+          <w:tcPr>
+            <w:tcW w:w="3213" w:type="dxa"/>
+            <w:tcBorders>
+              <w:start w:val="single" w:sz="4" w:space="0" w:color="000000"/>
+              <w:bottom w:val="single" w:sz="4" w:space="0" w:color="000000"/>
+            </w:tcBorders>
+          </w:tcPr>
+          <w:p>
+            <w:pPr>
+              <w:pStyle w:val="Contenudetableau"/>
+              <w:bidi w:val="0"/>
+              <w:jc w:val="start"/>
+              <w:rPr/>
+            </w:pPr>
+            <w:r>
+              <w:rPr/>
+            </w:r>
+          </w:p>
+        </w:tc>
+        <w:tc>
+          <w:tcPr>
+            <w:tcW w:w="3213" w:type="dxa"/>
+            <w:tcBorders>
+              <w:start w:val="single" w:sz="4" w:space="0" w:color="000000"/>
+              <w:bottom w:val="single" w:sz="4" w:space="0" w:color="000000"/>
+              <w:end w:val="single" w:sz="4" w:space="0" w:color="000000"/>
+            </w:tcBorders>
+          </w:tcPr>
+          <w:p>
+            <w:pPr>
+              <w:pStyle w:val="Contenudetableau"/>
+              <w:bidi w:val="0"/>
+              <w:jc w:val="start"/>
+              <w:rPr/>
+            </w:pPr>
+            <w:r>
+              <w:rPr/>
+            </w:r>
+          </w:p>
+        </w:tc>
+      </w:tr>
+      <w:tr>
+        <w:trPr/>
+        <w:tc>
+          <w:tcPr>
+            <w:tcW w:w="3212" w:type="dxa"/>
+            <w:tcBorders>
+              <w:start w:val="single" w:sz="4" w:space="0" w:color="000000"/>
+              <w:bottom w:val="single" w:sz="4" w:space="0" w:color="000000"/>
+            </w:tcBorders>
+          </w:tcPr>
+          <w:p>
+            <w:pPr>
+              <w:pStyle w:val="Contenudetableau"/>
+              <w:bidi w:val="0"/>
+              <w:jc w:val="start"/>
+              <w:rPr/>
+            </w:pPr>
+            <w:r>
+              <w:rPr/>
+            </w:r>
+          </w:p>
+        </w:tc>
+        <w:tc>
+          <w:tcPr>
+            <w:tcW w:w="3213" w:type="dxa"/>
+            <w:tcBorders>
+              <w:start w:val="single" w:sz="4" w:space="0" w:color="000000"/>
+              <w:bottom w:val="single" w:sz="4" w:space="0" w:color="000000"/>
+            </w:tcBorders>
+          </w:tcPr>
+          <w:p>
+            <w:pPr>
+              <w:pStyle w:val="Contenudetableau"/>
+              <w:bidi w:val="0"/>
+              <w:jc w:val="start"/>
+              <w:rPr/>
+            </w:pPr>
+            <w:r>
+              <w:rPr/>
+            </w:r>
+          </w:p>
+        </w:tc>
+        <w:tc>
+          <w:tcPr>
+            <w:tcW w:w="3213" w:type="dxa"/>
+            <w:tcBorders>
+              <w:start w:val="single" w:sz="4" w:space="0" w:color="000000"/>
+              <w:bottom w:val="single" w:sz="4" w:space="0" w:color="000000"/>
+              <w:end w:val="single" w:sz="4" w:space="0" w:color="000000"/>
+            </w:tcBorders>
+          </w:tcPr>
+          <w:p>
+            <w:pPr>
+              <w:pStyle w:val="Contenudetableau"/>
+              <w:bidi w:val="0"/>
+              <w:jc w:val="start"/>
+              <w:rPr/>
+            </w:pPr>
+            <w:r>
+              <w:rPr/>
+            </w:r>
+          </w:p>
+        </w:tc>
+      </w:tr>
+    </w:tbl>
+    <w:p>
+      <w:pPr>
+        <w:pStyle w:val="Normal"/>
+        <w:bidi w:val="0"/>
+        <w:jc w:val="start"/>
+        <w:rPr/>
+      </w:pPr>
+      <w:r>
+        <w:rPr/>
+      </w:r>
+    </w:p>
+    <w:p>
+      <w:pPr>
+        <w:pStyle w:val="Normal"/>
+        <w:bidi w:val="0"/>
+        <w:jc w:val="start"/>
+        <w:rPr/>
+      </w:pPr>
+      <w:r>
+        <w:rPr/>
+        <w:t>Suppression d’un commentaire</w:t>
+      </w:r>
+    </w:p>
+    <w:tbl>
+      <w:tblPr>
+        <w:tblW w:w="5000" w:type="pct"/>
+        <w:jc w:val="start"/>
+        <w:tblInd w:w="-5" w:type="dxa"/>
+        <w:tblLayout w:type="fixed"/>
+        <w:tblCellMar>
+          <w:top w:w="55" w:type="dxa"/>
+          <w:start w:w="55" w:type="dxa"/>
+          <w:bottom w:w="55" w:type="dxa"/>
+          <w:end w:w="55" w:type="dxa"/>
+        </w:tblCellMar>
+      </w:tblPr>
+      <w:tblGrid>
+        <w:gridCol w:w="3212"/>
+        <w:gridCol w:w="3213"/>
+        <w:gridCol w:w="3213"/>
+      </w:tblGrid>
+      <w:tr>
+        <w:trPr/>
+        <w:tc>
+          <w:tcPr>
+            <w:tcW w:w="3212" w:type="dxa"/>
+            <w:tcBorders>
+              <w:top w:val="single" w:sz="4" w:space="0" w:color="000000"/>
+              <w:start w:val="single" w:sz="4" w:space="0" w:color="000000"/>
+              <w:bottom w:val="single" w:sz="4" w:space="0" w:color="000000"/>
+            </w:tcBorders>
+          </w:tcPr>
+          <w:p>
+            <w:pPr>
+              <w:pStyle w:val="Contenudetableau"/>
+              <w:bidi w:val="0"/>
+              <w:jc w:val="start"/>
+              <w:rPr/>
+            </w:pPr>
+            <w:r>
+              <w:rPr/>
+              <w:t>Etape</w:t>
+            </w:r>
+          </w:p>
+        </w:tc>
+        <w:tc>
+          <w:tcPr>
+            <w:tcW w:w="3213" w:type="dxa"/>
+            <w:tcBorders>
+              <w:top w:val="single" w:sz="4" w:space="0" w:color="000000"/>
+              <w:start w:val="single" w:sz="4" w:space="0" w:color="000000"/>
+              <w:bottom w:val="single" w:sz="4" w:space="0" w:color="000000"/>
+            </w:tcBorders>
+          </w:tcPr>
+          <w:p>
+            <w:pPr>
+              <w:pStyle w:val="Contenudetableau"/>
+              <w:bidi w:val="0"/>
+              <w:jc w:val="start"/>
+              <w:rPr/>
+            </w:pPr>
+            <w:r>
+              <w:rPr/>
+              <w:t>Action utilisateur</w:t>
+            </w:r>
+          </w:p>
+        </w:tc>
+        <w:tc>
+          <w:tcPr>
+            <w:tcW w:w="3213" w:type="dxa"/>
+            <w:tcBorders>
+              <w:top w:val="single" w:sz="4" w:space="0" w:color="000000"/>
+              <w:start w:val="single" w:sz="4" w:space="0" w:color="000000"/>
+              <w:bottom w:val="single" w:sz="4" w:space="0" w:color="000000"/>
+              <w:end w:val="single" w:sz="4" w:space="0" w:color="000000"/>
+            </w:tcBorders>
+          </w:tcPr>
+          <w:p>
+            <w:pPr>
+              <w:pStyle w:val="Contenudetableau"/>
+              <w:bidi w:val="0"/>
+              <w:jc w:val="start"/>
+              <w:rPr/>
+            </w:pPr>
+            <w:r>
+              <w:rPr/>
+              <w:t>Réponse Api</w:t>
+            </w:r>
+          </w:p>
+        </w:tc>
+      </w:tr>
+      <w:tr>
+        <w:trPr/>
+        <w:tc>
+          <w:tcPr>
+            <w:tcW w:w="3212" w:type="dxa"/>
+            <w:tcBorders>
+              <w:start w:val="single" w:sz="4" w:space="0" w:color="000000"/>
+              <w:bottom w:val="single" w:sz="4" w:space="0" w:color="000000"/>
+            </w:tcBorders>
+          </w:tcPr>
+          <w:p>
+            <w:pPr>
+              <w:pStyle w:val="Contenudetableau"/>
+              <w:bidi w:val="0"/>
+              <w:jc w:val="start"/>
+              <w:rPr/>
+            </w:pPr>
+            <w:r>
+              <w:rPr/>
+            </w:r>
+          </w:p>
+        </w:tc>
+        <w:tc>
+          <w:tcPr>
+            <w:tcW w:w="3213" w:type="dxa"/>
+            <w:tcBorders>
+              <w:start w:val="single" w:sz="4" w:space="0" w:color="000000"/>
+              <w:bottom w:val="single" w:sz="4" w:space="0" w:color="000000"/>
+            </w:tcBorders>
+          </w:tcPr>
+          <w:p>
+            <w:pPr>
+              <w:pStyle w:val="Contenudetableau"/>
+              <w:bidi w:val="0"/>
+              <w:jc w:val="start"/>
+              <w:rPr/>
+            </w:pPr>
+            <w:r>
+              <w:rPr/>
+            </w:r>
+          </w:p>
+        </w:tc>
+        <w:tc>
+          <w:tcPr>
+            <w:tcW w:w="3213" w:type="dxa"/>
+            <w:tcBorders>
+              <w:start w:val="single" w:sz="4" w:space="0" w:color="000000"/>
+              <w:bottom w:val="single" w:sz="4" w:space="0" w:color="000000"/>
+              <w:end w:val="single" w:sz="4" w:space="0" w:color="000000"/>
+            </w:tcBorders>
+          </w:tcPr>
+          <w:p>
+            <w:pPr>
+              <w:pStyle w:val="Contenudetableau"/>
+              <w:bidi w:val="0"/>
+              <w:jc w:val="start"/>
+              <w:rPr/>
+            </w:pPr>
+            <w:r>
+              <w:rPr/>
+            </w:r>
+          </w:p>
+        </w:tc>
+      </w:tr>
+      <w:tr>
+        <w:trPr/>
+        <w:tc>
+          <w:tcPr>
+            <w:tcW w:w="3212" w:type="dxa"/>
+            <w:tcBorders>
+              <w:start w:val="single" w:sz="4" w:space="0" w:color="000000"/>
+              <w:bottom w:val="single" w:sz="4" w:space="0" w:color="000000"/>
+            </w:tcBorders>
+          </w:tcPr>
+          <w:p>
+            <w:pPr>
+              <w:pStyle w:val="Contenudetableau"/>
+              <w:bidi w:val="0"/>
+              <w:jc w:val="start"/>
+              <w:rPr/>
+            </w:pPr>
+            <w:r>
+              <w:rPr/>
+            </w:r>
+          </w:p>
+        </w:tc>
+        <w:tc>
+          <w:tcPr>
+            <w:tcW w:w="3213" w:type="dxa"/>
+            <w:tcBorders>
+              <w:start w:val="single" w:sz="4" w:space="0" w:color="000000"/>
+              <w:bottom w:val="single" w:sz="4" w:space="0" w:color="000000"/>
+            </w:tcBorders>
+          </w:tcPr>
+          <w:p>
+            <w:pPr>
+              <w:pStyle w:val="Contenudetableau"/>
+              <w:bidi w:val="0"/>
+              <w:jc w:val="start"/>
+              <w:rPr/>
+            </w:pPr>
+            <w:r>
+              <w:rPr/>
+            </w:r>
+          </w:p>
+        </w:tc>
+        <w:tc>
+          <w:tcPr>
+            <w:tcW w:w="3213" w:type="dxa"/>
+            <w:tcBorders>
+              <w:start w:val="single" w:sz="4" w:space="0" w:color="000000"/>
+              <w:bottom w:val="single" w:sz="4" w:space="0" w:color="000000"/>
+              <w:end w:val="single" w:sz="4" w:space="0" w:color="000000"/>
+            </w:tcBorders>
+          </w:tcPr>
+          <w:p>
+            <w:pPr>
+              <w:pStyle w:val="Contenudetableau"/>
+              <w:bidi w:val="0"/>
+              <w:jc w:val="start"/>
+              <w:rPr/>
+            </w:pPr>
+            <w:r>
+              <w:rPr/>
+            </w:r>
+          </w:p>
+        </w:tc>
+      </w:tr>
+    </w:tbl>
+    <w:p>
+      <w:pPr>
+        <w:pStyle w:val="Normal"/>
+        <w:bidi w:val="0"/>
+        <w:jc w:val="start"/>
+        <w:rPr/>
+      </w:pPr>
+      <w:r>
+        <w:rPr/>
+      </w:r>
+    </w:p>
+    <w:p>
+      <w:pPr>
+        <w:pStyle w:val="Normal"/>
+        <w:bidi w:val="0"/>
+        <w:jc w:val="start"/>
+        <w:rPr/>
+      </w:pPr>
+      <w:r>
+        <w:rPr/>
+        <w:t>Suppression d’une etiquette</w:t>
+      </w:r>
+    </w:p>
+    <w:tbl>
+      <w:tblPr>
+        <w:tblW w:w="5000" w:type="pct"/>
+        <w:jc w:val="start"/>
+        <w:tblInd w:w="-5" w:type="dxa"/>
+        <w:tblLayout w:type="fixed"/>
+        <w:tblCellMar>
+          <w:top w:w="55" w:type="dxa"/>
+          <w:start w:w="55" w:type="dxa"/>
+          <w:bottom w:w="55" w:type="dxa"/>
+          <w:end w:w="55" w:type="dxa"/>
+        </w:tblCellMar>
+      </w:tblPr>
+      <w:tblGrid>
+        <w:gridCol w:w="3212"/>
+        <w:gridCol w:w="3213"/>
+        <w:gridCol w:w="3213"/>
+      </w:tblGrid>
+      <w:tr>
+        <w:trPr/>
+        <w:tc>
+          <w:tcPr>
+            <w:tcW w:w="3212" w:type="dxa"/>
+            <w:tcBorders>
+              <w:top w:val="single" w:sz="4" w:space="0" w:color="000000"/>
+              <w:start w:val="single" w:sz="4" w:space="0" w:color="000000"/>
+              <w:bottom w:val="single" w:sz="4" w:space="0" w:color="000000"/>
+            </w:tcBorders>
+          </w:tcPr>
+          <w:p>
+            <w:pPr>
+              <w:pStyle w:val="Contenudetableau"/>
+              <w:bidi w:val="0"/>
+              <w:jc w:val="start"/>
+              <w:rPr/>
+            </w:pPr>
+            <w:r>
+              <w:rPr/>
+              <w:t>Etape</w:t>
+            </w:r>
+          </w:p>
+        </w:tc>
+        <w:tc>
+          <w:tcPr>
+            <w:tcW w:w="3213" w:type="dxa"/>
+            <w:tcBorders>
+              <w:top w:val="single" w:sz="4" w:space="0" w:color="000000"/>
+              <w:start w:val="single" w:sz="4" w:space="0" w:color="000000"/>
+              <w:bottom w:val="single" w:sz="4" w:space="0" w:color="000000"/>
+            </w:tcBorders>
+          </w:tcPr>
+          <w:p>
+            <w:pPr>
+              <w:pStyle w:val="Contenudetableau"/>
+              <w:bidi w:val="0"/>
+              <w:jc w:val="start"/>
+              <w:rPr/>
+            </w:pPr>
+            <w:r>
+              <w:rPr/>
+              <w:t>Action utilisateur</w:t>
+            </w:r>
+          </w:p>
+        </w:tc>
+        <w:tc>
+          <w:tcPr>
+            <w:tcW w:w="3213" w:type="dxa"/>
+            <w:tcBorders>
+              <w:top w:val="single" w:sz="4" w:space="0" w:color="000000"/>
+              <w:start w:val="single" w:sz="4" w:space="0" w:color="000000"/>
+              <w:bottom w:val="single" w:sz="4" w:space="0" w:color="000000"/>
+              <w:end w:val="single" w:sz="4" w:space="0" w:color="000000"/>
+            </w:tcBorders>
+          </w:tcPr>
+          <w:p>
+            <w:pPr>
+              <w:pStyle w:val="Contenudetableau"/>
+              <w:bidi w:val="0"/>
+              <w:jc w:val="start"/>
+              <w:rPr/>
+            </w:pPr>
+            <w:r>
+              <w:rPr/>
+              <w:t>Réponse Api</w:t>
+            </w:r>
+          </w:p>
+        </w:tc>
+      </w:tr>
+      <w:tr>
+        <w:trPr/>
+        <w:tc>
+          <w:tcPr>
+            <w:tcW w:w="3212" w:type="dxa"/>
+            <w:tcBorders>
+              <w:start w:val="single" w:sz="4" w:space="0" w:color="000000"/>
+              <w:bottom w:val="single" w:sz="4" w:space="0" w:color="000000"/>
+            </w:tcBorders>
+          </w:tcPr>
+          <w:p>
+            <w:pPr>
+              <w:pStyle w:val="Contenudetableau"/>
+              <w:bidi w:val="0"/>
+              <w:jc w:val="start"/>
+              <w:rPr/>
+            </w:pPr>
+            <w:r>
+              <w:rPr/>
+            </w:r>
+          </w:p>
+        </w:tc>
+        <w:tc>
+          <w:tcPr>
+            <w:tcW w:w="3213" w:type="dxa"/>
+            <w:tcBorders>
+              <w:start w:val="single" w:sz="4" w:space="0" w:color="000000"/>
+              <w:bottom w:val="single" w:sz="4" w:space="0" w:color="000000"/>
+            </w:tcBorders>
+          </w:tcPr>
+          <w:p>
+            <w:pPr>
+              <w:pStyle w:val="Contenudetableau"/>
+              <w:bidi w:val="0"/>
+              <w:jc w:val="start"/>
+              <w:rPr/>
+            </w:pPr>
+            <w:r>
+              <w:rPr/>
+            </w:r>
+          </w:p>
+        </w:tc>
+        <w:tc>
+          <w:tcPr>
+            <w:tcW w:w="3213" w:type="dxa"/>
+            <w:tcBorders>
+              <w:start w:val="single" w:sz="4" w:space="0" w:color="000000"/>
+              <w:bottom w:val="single" w:sz="4" w:space="0" w:color="000000"/>
+              <w:end w:val="single" w:sz="4" w:space="0" w:color="000000"/>
+            </w:tcBorders>
+          </w:tcPr>
+          <w:p>
+            <w:pPr>
+              <w:pStyle w:val="Contenudetableau"/>
+              <w:bidi w:val="0"/>
+              <w:jc w:val="start"/>
+              <w:rPr/>
+            </w:pPr>
+            <w:r>
+              <w:rPr/>
+            </w:r>
+          </w:p>
+        </w:tc>
+      </w:tr>
+      <w:tr>
+        <w:trPr/>
+        <w:tc>
+          <w:tcPr>
+            <w:tcW w:w="3212" w:type="dxa"/>
+            <w:tcBorders>
+              <w:start w:val="single" w:sz="4" w:space="0" w:color="000000"/>
+              <w:bottom w:val="single" w:sz="4" w:space="0" w:color="000000"/>
+            </w:tcBorders>
+          </w:tcPr>
+          <w:p>
+            <w:pPr>
+              <w:pStyle w:val="Contenudetableau"/>
+              <w:bidi w:val="0"/>
+              <w:jc w:val="start"/>
+              <w:rPr/>
+            </w:pPr>
+            <w:r>
+              <w:rPr/>
+            </w:r>
+          </w:p>
+        </w:tc>
+        <w:tc>
+          <w:tcPr>
+            <w:tcW w:w="3213" w:type="dxa"/>
+            <w:tcBorders>
+              <w:start w:val="single" w:sz="4" w:space="0" w:color="000000"/>
+              <w:bottom w:val="single" w:sz="4" w:space="0" w:color="000000"/>
+            </w:tcBorders>
+          </w:tcPr>
+          <w:p>
+            <w:pPr>
+              <w:pStyle w:val="Contenudetableau"/>
+              <w:bidi w:val="0"/>
+              <w:jc w:val="start"/>
+              <w:rPr/>
+            </w:pPr>
+            <w:r>
+              <w:rPr/>
+            </w:r>
+          </w:p>
+        </w:tc>
+        <w:tc>
+          <w:tcPr>
+            <w:tcW w:w="3213" w:type="dxa"/>
+            <w:tcBorders>
+              <w:start w:val="single" w:sz="4" w:space="0" w:color="000000"/>
+              <w:bottom w:val="single" w:sz="4" w:space="0" w:color="000000"/>
+              <w:end w:val="single" w:sz="4" w:space="0" w:color="000000"/>
+            </w:tcBorders>
+          </w:tcPr>
+          <w:p>
+            <w:pPr>
+              <w:pStyle w:val="Contenudetableau"/>
+              <w:bidi w:val="0"/>
+              <w:jc w:val="start"/>
+              <w:rPr/>
+            </w:pPr>
+            <w:r>
+              <w:rPr/>
+            </w:r>
+          </w:p>
+        </w:tc>
+      </w:tr>
+    </w:tbl>
+    <w:p>
+      <w:pPr>
+        <w:pStyle w:val="Normal"/>
+        <w:bidi w:val="0"/>
+        <w:jc w:val="start"/>
+        <w:rPr/>
+      </w:pPr>
+      <w:r>
+        <w:rPr/>
+      </w:r>
+    </w:p>
+    <w:p>
+      <w:pPr>
+        <w:pStyle w:val="Normal"/>
+        <w:bidi w:val="0"/>
+        <w:jc w:val="start"/>
+        <w:rPr/>
+      </w:pPr>
+      <w:r>
+        <w:rPr/>
+        <w:t>Suppression d’un compte (admin)</w:t>
+      </w:r>
+    </w:p>
+    <w:tbl>
+      <w:tblPr>
+        <w:tblW w:w="5000" w:type="pct"/>
+        <w:jc w:val="start"/>
+        <w:tblInd w:w="-5" w:type="dxa"/>
+        <w:tblLayout w:type="fixed"/>
+        <w:tblCellMar>
+          <w:top w:w="55" w:type="dxa"/>
+          <w:start w:w="55" w:type="dxa"/>
+          <w:bottom w:w="55" w:type="dxa"/>
+          <w:end w:w="55" w:type="dxa"/>
+        </w:tblCellMar>
+      </w:tblPr>
+      <w:tblGrid>
+        <w:gridCol w:w="3212"/>
+        <w:gridCol w:w="3213"/>
+        <w:gridCol w:w="3213"/>
+      </w:tblGrid>
+      <w:tr>
+        <w:trPr/>
+        <w:tc>
+          <w:tcPr>
+            <w:tcW w:w="3212" w:type="dxa"/>
+            <w:tcBorders>
+              <w:top w:val="single" w:sz="4" w:space="0" w:color="000000"/>
+              <w:start w:val="single" w:sz="4" w:space="0" w:color="000000"/>
+              <w:bottom w:val="single" w:sz="4" w:space="0" w:color="000000"/>
+            </w:tcBorders>
+          </w:tcPr>
+          <w:p>
+            <w:pPr>
+              <w:pStyle w:val="Contenudetableau"/>
+              <w:bidi w:val="0"/>
+              <w:jc w:val="start"/>
+              <w:rPr/>
+            </w:pPr>
+            <w:r>
+              <w:rPr/>
+              <w:t>Etape</w:t>
+            </w:r>
+          </w:p>
+        </w:tc>
+        <w:tc>
+          <w:tcPr>
+            <w:tcW w:w="3213" w:type="dxa"/>
+            <w:tcBorders>
+              <w:top w:val="single" w:sz="4" w:space="0" w:color="000000"/>
+              <w:start w:val="single" w:sz="4" w:space="0" w:color="000000"/>
+              <w:bottom w:val="single" w:sz="4" w:space="0" w:color="000000"/>
+            </w:tcBorders>
+          </w:tcPr>
+          <w:p>
+            <w:pPr>
+              <w:pStyle w:val="Contenudetableau"/>
+              <w:bidi w:val="0"/>
+              <w:jc w:val="start"/>
+              <w:rPr/>
+            </w:pPr>
+            <w:r>
+              <w:rPr/>
+              <w:t>Action utilisateur</w:t>
+            </w:r>
+          </w:p>
+        </w:tc>
+        <w:tc>
+          <w:tcPr>
+            <w:tcW w:w="3213" w:type="dxa"/>
+            <w:tcBorders>
+              <w:top w:val="single" w:sz="4" w:space="0" w:color="000000"/>
+              <w:start w:val="single" w:sz="4" w:space="0" w:color="000000"/>
+              <w:bottom w:val="single" w:sz="4" w:space="0" w:color="000000"/>
+              <w:end w:val="single" w:sz="4" w:space="0" w:color="000000"/>
+            </w:tcBorders>
+          </w:tcPr>
+          <w:p>
+            <w:pPr>
+              <w:pStyle w:val="Contenudetableau"/>
+              <w:bidi w:val="0"/>
+              <w:jc w:val="start"/>
+              <w:rPr/>
+            </w:pPr>
+            <w:r>
+              <w:rPr/>
+              <w:t>Réponse Api</w:t>
+            </w:r>
+          </w:p>
+        </w:tc>
+      </w:tr>
+      <w:tr>
+        <w:trPr/>
+        <w:tc>
+          <w:tcPr>
+            <w:tcW w:w="3212" w:type="dxa"/>
+            <w:tcBorders>
+              <w:start w:val="single" w:sz="4" w:space="0" w:color="000000"/>
+              <w:bottom w:val="single" w:sz="4" w:space="0" w:color="000000"/>
+            </w:tcBorders>
+          </w:tcPr>
+          <w:p>
+            <w:pPr>
+              <w:pStyle w:val="Contenudetableau"/>
+              <w:bidi w:val="0"/>
+              <w:jc w:val="start"/>
+              <w:rPr/>
+            </w:pPr>
+            <w:r>
+              <w:rPr/>
+            </w:r>
+          </w:p>
+        </w:tc>
+        <w:tc>
+          <w:tcPr>
+            <w:tcW w:w="3213" w:type="dxa"/>
+            <w:tcBorders>
+              <w:start w:val="single" w:sz="4" w:space="0" w:color="000000"/>
+              <w:bottom w:val="single" w:sz="4" w:space="0" w:color="000000"/>
+            </w:tcBorders>
+          </w:tcPr>
+          <w:p>
+            <w:pPr>
+              <w:pStyle w:val="Contenudetableau"/>
+              <w:bidi w:val="0"/>
+              <w:jc w:val="start"/>
+              <w:rPr/>
+            </w:pPr>
+            <w:r>
+              <w:rPr/>
+            </w:r>
+          </w:p>
+        </w:tc>
+        <w:tc>
+          <w:tcPr>
+            <w:tcW w:w="3213" w:type="dxa"/>
+            <w:tcBorders>
+              <w:start w:val="single" w:sz="4" w:space="0" w:color="000000"/>
+              <w:bottom w:val="single" w:sz="4" w:space="0" w:color="000000"/>
+              <w:end w:val="single" w:sz="4" w:space="0" w:color="000000"/>
+            </w:tcBorders>
+          </w:tcPr>
+          <w:p>
+            <w:pPr>
+              <w:pStyle w:val="Contenudetableau"/>
+              <w:bidi w:val="0"/>
+              <w:jc w:val="start"/>
+              <w:rPr/>
+            </w:pPr>
+            <w:r>
+              <w:rPr/>
+            </w:r>
+          </w:p>
+        </w:tc>
+      </w:tr>
+      <w:tr>
+        <w:trPr/>
+        <w:tc>
+          <w:tcPr>
+            <w:tcW w:w="3212" w:type="dxa"/>
+            <w:tcBorders>
+              <w:start w:val="single" w:sz="4" w:space="0" w:color="000000"/>
+              <w:bottom w:val="single" w:sz="4" w:space="0" w:color="000000"/>
+            </w:tcBorders>
+          </w:tcPr>
+          <w:p>
+            <w:pPr>
+              <w:pStyle w:val="Contenudetableau"/>
+              <w:bidi w:val="0"/>
+              <w:jc w:val="start"/>
+              <w:rPr/>
+            </w:pPr>
+            <w:r>
+              <w:rPr/>
+            </w:r>
+          </w:p>
+        </w:tc>
+        <w:tc>
+          <w:tcPr>
+            <w:tcW w:w="3213" w:type="dxa"/>
+            <w:tcBorders>
+              <w:start w:val="single" w:sz="4" w:space="0" w:color="000000"/>
+              <w:bottom w:val="single" w:sz="4" w:space="0" w:color="000000"/>
+            </w:tcBorders>
+          </w:tcPr>
+          <w:p>
+            <w:pPr>
+              <w:pStyle w:val="Contenudetableau"/>
+              <w:bidi w:val="0"/>
+              <w:jc w:val="start"/>
+              <w:rPr/>
+            </w:pPr>
+            <w:r>
+              <w:rPr/>
+            </w:r>
+          </w:p>
+        </w:tc>
+        <w:tc>
+          <w:tcPr>
+            <w:tcW w:w="3213" w:type="dxa"/>
+            <w:tcBorders>
+              <w:start w:val="single" w:sz="4" w:space="0" w:color="000000"/>
+              <w:bottom w:val="single" w:sz="4" w:space="0" w:color="000000"/>
+              <w:end w:val="single" w:sz="4" w:space="0" w:color="000000"/>
+            </w:tcBorders>
+          </w:tcPr>
+          <w:p>
+            <w:pPr>
+              <w:pStyle w:val="Contenudetableau"/>
+              <w:bidi w:val="0"/>
+              <w:jc w:val="start"/>
+              <w:rPr/>
+            </w:pPr>
+            <w:r>
+              <w:rPr/>
+            </w:r>
+          </w:p>
+        </w:tc>
+      </w:tr>
+    </w:tbl>
     <w:p>
       <w:pPr>
         <w:pStyle w:val="Normal"/>

</xml_diff>

<commit_message>
Modification plan de test pour première ligne authentification
</commit_message>
<xml_diff>
--- a/Documents/Plans de tests.docx
+++ b/Documents/Plans de tests.docx
@@ -115,14 +115,13 @@
           <w:p>
             <w:pPr>
               <w:pStyle w:val="Contenudetableau"/>
-              <w:widowControl w:val="false"/>
-              <w:suppressLineNumbers/>
-              <w:bidi w:val="0"/>
-              <w:jc w:val="start"/>
-              <w:rPr/>
-            </w:pPr>
-            <w:r>
-              <w:rPr/>
+              <w:bidi w:val="0"/>
+              <w:jc w:val="start"/>
+              <w:rPr/>
+            </w:pPr>
+            <w:r>
+              <w:rPr/>
+              <w:t>Connexion user1</w:t>
             </w:r>
           </w:p>
         </w:tc>
@@ -137,14 +136,25 @@
           <w:p>
             <w:pPr>
               <w:pStyle w:val="Contenudetableau"/>
-              <w:widowControl w:val="false"/>
-              <w:suppressLineNumbers/>
-              <w:bidi w:val="0"/>
-              <w:jc w:val="start"/>
-              <w:rPr/>
-            </w:pPr>
-            <w:r>
-              <w:rPr/>
+              <w:bidi w:val="0"/>
+              <w:jc w:val="start"/>
+              <w:rPr/>
+            </w:pPr>
+            <w:r>
+              <w:rPr/>
+              <w:t xml:space="preserve">Connexion avec les identifiants bosswaza </w:t>
+            </w:r>
+          </w:p>
+          <w:p>
+            <w:pPr>
+              <w:pStyle w:val="Contenudetableau"/>
+              <w:bidi w:val="0"/>
+              <w:jc w:val="start"/>
+              <w:rPr/>
+            </w:pPr>
+            <w:r>
+              <w:rPr/>
+              <w:t xml:space="preserve">Requête GET </w:t>
             </w:r>
           </w:p>
         </w:tc>
@@ -160,14 +170,13 @@
           <w:p>
             <w:pPr>
               <w:pStyle w:val="Contenudetableau"/>
-              <w:widowControl w:val="false"/>
-              <w:suppressLineNumbers/>
-              <w:bidi w:val="0"/>
-              <w:jc w:val="start"/>
-              <w:rPr/>
-            </w:pPr>
-            <w:r>
-              <w:rPr/>
+              <w:bidi w:val="0"/>
+              <w:jc w:val="start"/>
+              <w:rPr/>
+            </w:pPr>
+            <w:r>
+              <w:rPr/>
+              <w:t>Identifiants corrects, création token (stocké localement) et retour http 200</w:t>
             </w:r>
           </w:p>
         </w:tc>

</xml_diff>

<commit_message>
Plan de test (en cours)
</commit_message>
<xml_diff>
--- a/Documents/Plans de tests.docx
+++ b/Documents/Plans de tests.docx
@@ -121,7 +121,7 @@
             </w:pPr>
             <w:r>
               <w:rPr/>
-              <w:t>Connexion user1</w:t>
+              <w:t>Connexion bosswaza</w:t>
             </w:r>
           </w:p>
         </w:tc>
@@ -446,59 +446,56 @@
           <w:p>
             <w:pPr>
               <w:pStyle w:val="Contenudetableau"/>
-              <w:widowControl w:val="false"/>
-              <w:suppressLineNumbers/>
-              <w:bidi w:val="0"/>
-              <w:jc w:val="start"/>
-              <w:rPr/>
-            </w:pPr>
-            <w:r>
-              <w:rPr/>
-            </w:r>
-          </w:p>
-        </w:tc>
-        <w:tc>
-          <w:tcPr>
-            <w:tcW w:w="3213" w:type="dxa"/>
-            <w:tcBorders>
-              <w:start w:val="single" w:sz="4" w:space="0" w:color="000000"/>
-              <w:bottom w:val="single" w:sz="4" w:space="0" w:color="000000"/>
-            </w:tcBorders>
-          </w:tcPr>
-          <w:p>
-            <w:pPr>
-              <w:pStyle w:val="Contenudetableau"/>
-              <w:widowControl w:val="false"/>
-              <w:suppressLineNumbers/>
-              <w:bidi w:val="0"/>
-              <w:jc w:val="start"/>
-              <w:rPr/>
-            </w:pPr>
-            <w:r>
-              <w:rPr/>
-            </w:r>
-          </w:p>
-        </w:tc>
-        <w:tc>
-          <w:tcPr>
-            <w:tcW w:w="3213" w:type="dxa"/>
-            <w:tcBorders>
-              <w:start w:val="single" w:sz="4" w:space="0" w:color="000000"/>
-              <w:bottom w:val="single" w:sz="4" w:space="0" w:color="000000"/>
-              <w:end w:val="single" w:sz="4" w:space="0" w:color="000000"/>
-            </w:tcBorders>
-          </w:tcPr>
-          <w:p>
-            <w:pPr>
-              <w:pStyle w:val="Contenudetableau"/>
-              <w:widowControl w:val="false"/>
-              <w:suppressLineNumbers/>
-              <w:bidi w:val="0"/>
-              <w:jc w:val="start"/>
-              <w:rPr/>
-            </w:pPr>
-            <w:r>
-              <w:rPr/>
+              <w:bidi w:val="0"/>
+              <w:jc w:val="start"/>
+              <w:rPr/>
+            </w:pPr>
+            <w:r>
+              <w:rPr/>
+              <w:t>Inscription user1</w:t>
+            </w:r>
+          </w:p>
+        </w:tc>
+        <w:tc>
+          <w:tcPr>
+            <w:tcW w:w="3213" w:type="dxa"/>
+            <w:tcBorders>
+              <w:start w:val="single" w:sz="4" w:space="0" w:color="000000"/>
+              <w:bottom w:val="single" w:sz="4" w:space="0" w:color="000000"/>
+            </w:tcBorders>
+          </w:tcPr>
+          <w:p>
+            <w:pPr>
+              <w:pStyle w:val="Contenudetableau"/>
+              <w:bidi w:val="0"/>
+              <w:jc w:val="start"/>
+              <w:rPr/>
+            </w:pPr>
+            <w:r>
+              <w:rPr/>
+              <w:t>Remplissage des champs du formulaire d’inscription</w:t>
+            </w:r>
+          </w:p>
+        </w:tc>
+        <w:tc>
+          <w:tcPr>
+            <w:tcW w:w="3213" w:type="dxa"/>
+            <w:tcBorders>
+              <w:start w:val="single" w:sz="4" w:space="0" w:color="000000"/>
+              <w:bottom w:val="single" w:sz="4" w:space="0" w:color="000000"/>
+              <w:end w:val="single" w:sz="4" w:space="0" w:color="000000"/>
+            </w:tcBorders>
+          </w:tcPr>
+          <w:p>
+            <w:pPr>
+              <w:pStyle w:val="Contenudetableau"/>
+              <w:bidi w:val="0"/>
+              <w:jc w:val="start"/>
+              <w:rPr/>
+            </w:pPr>
+            <w:r>
+              <w:rPr/>
+              <w:t>Création du compte, redirection vers la page de connexion et retour http 200</w:t>
             </w:r>
           </w:p>
         </w:tc>
@@ -698,6 +695,94 @@
           <w:p>
             <w:pPr>
               <w:pStyle w:val="Contenudetableau"/>
+              <w:bidi w:val="0"/>
+              <w:jc w:val="start"/>
+              <w:rPr/>
+            </w:pPr>
+            <w:r>
+              <w:rPr/>
+              <w:t>Connexion user1</w:t>
+            </w:r>
+          </w:p>
+        </w:tc>
+        <w:tc>
+          <w:tcPr>
+            <w:tcW w:w="3213" w:type="dxa"/>
+            <w:tcBorders>
+              <w:start w:val="single" w:sz="4" w:space="0" w:color="000000"/>
+              <w:bottom w:val="single" w:sz="4" w:space="0" w:color="000000"/>
+            </w:tcBorders>
+          </w:tcPr>
+          <w:p>
+            <w:pPr>
+              <w:pStyle w:val="Contenudetableau"/>
+              <w:bidi w:val="0"/>
+              <w:jc w:val="start"/>
+              <w:rPr/>
+            </w:pPr>
+            <w:r>
+              <w:rPr/>
+              <w:t>Connexion</w:t>
+            </w:r>
+          </w:p>
+        </w:tc>
+        <w:tc>
+          <w:tcPr>
+            <w:tcW w:w="3213" w:type="dxa"/>
+            <w:tcBorders>
+              <w:start w:val="single" w:sz="4" w:space="0" w:color="000000"/>
+              <w:bottom w:val="single" w:sz="4" w:space="0" w:color="000000"/>
+              <w:end w:val="single" w:sz="4" w:space="0" w:color="000000"/>
+            </w:tcBorders>
+          </w:tcPr>
+          <w:p>
+            <w:pPr>
+              <w:pStyle w:val="Contenudetableau"/>
+              <w:bidi w:val="0"/>
+              <w:jc w:val="start"/>
+              <w:rPr/>
+            </w:pPr>
+            <w:r>
+              <w:rPr/>
+              <w:t>Identifiants corrects, création token (stocké localement) et retour http 200</w:t>
+            </w:r>
+          </w:p>
+        </w:tc>
+      </w:tr>
+      <w:tr>
+        <w:trPr/>
+        <w:tc>
+          <w:tcPr>
+            <w:tcW w:w="3212" w:type="dxa"/>
+            <w:tcBorders>
+              <w:start w:val="single" w:sz="4" w:space="0" w:color="000000"/>
+              <w:bottom w:val="single" w:sz="4" w:space="0" w:color="000000"/>
+            </w:tcBorders>
+          </w:tcPr>
+          <w:p>
+            <w:pPr>
+              <w:pStyle w:val="Contenudetableau"/>
+              <w:bidi w:val="0"/>
+              <w:jc w:val="start"/>
+              <w:rPr/>
+            </w:pPr>
+            <w:r>
+              <w:rPr/>
+              <w:t>Accès à la page</w:t>
+            </w:r>
+          </w:p>
+        </w:tc>
+        <w:tc>
+          <w:tcPr>
+            <w:tcW w:w="3213" w:type="dxa"/>
+            <w:tcBorders>
+              <w:start w:val="single" w:sz="4" w:space="0" w:color="000000"/>
+              <w:bottom w:val="single" w:sz="4" w:space="0" w:color="000000"/>
+            </w:tcBorders>
+          </w:tcPr>
+          <w:p>
+            <w:pPr>
+              <w:pStyle w:val="Contenudetableau"/>
               <w:widowControl w:val="false"/>
               <w:suppressLineNumbers/>
               <w:bidi w:val="0"/>
@@ -715,112 +800,19 @@
             <w:tcBorders>
               <w:start w:val="single" w:sz="4" w:space="0" w:color="000000"/>
               <w:bottom w:val="single" w:sz="4" w:space="0" w:color="000000"/>
-            </w:tcBorders>
-          </w:tcPr>
-          <w:p>
-            <w:pPr>
-              <w:pStyle w:val="Contenudetableau"/>
-              <w:widowControl w:val="false"/>
-              <w:suppressLineNumbers/>
-              <w:bidi w:val="0"/>
-              <w:jc w:val="start"/>
-              <w:rPr/>
-            </w:pPr>
-            <w:r>
-              <w:rPr/>
-            </w:r>
-          </w:p>
-        </w:tc>
-        <w:tc>
-          <w:tcPr>
-            <w:tcW w:w="3213" w:type="dxa"/>
-            <w:tcBorders>
-              <w:start w:val="single" w:sz="4" w:space="0" w:color="000000"/>
-              <w:bottom w:val="single" w:sz="4" w:space="0" w:color="000000"/>
-              <w:end w:val="single" w:sz="4" w:space="0" w:color="000000"/>
-            </w:tcBorders>
-          </w:tcPr>
-          <w:p>
-            <w:pPr>
-              <w:pStyle w:val="Contenudetableau"/>
-              <w:widowControl w:val="false"/>
-              <w:suppressLineNumbers/>
-              <w:bidi w:val="0"/>
-              <w:jc w:val="start"/>
-              <w:rPr/>
-            </w:pPr>
-            <w:r>
-              <w:rPr/>
-            </w:r>
-          </w:p>
-        </w:tc>
-      </w:tr>
-      <w:tr>
-        <w:trPr/>
-        <w:tc>
-          <w:tcPr>
-            <w:tcW w:w="3212" w:type="dxa"/>
-            <w:tcBorders>
-              <w:start w:val="single" w:sz="4" w:space="0" w:color="000000"/>
-              <w:bottom w:val="single" w:sz="4" w:space="0" w:color="000000"/>
-            </w:tcBorders>
-          </w:tcPr>
-          <w:p>
-            <w:pPr>
-              <w:pStyle w:val="Contenudetableau"/>
-              <w:widowControl w:val="false"/>
-              <w:suppressLineNumbers/>
-              <w:bidi w:val="0"/>
-              <w:jc w:val="start"/>
-              <w:rPr/>
-            </w:pPr>
-            <w:r>
-              <w:rPr/>
-            </w:r>
-          </w:p>
-        </w:tc>
-        <w:tc>
-          <w:tcPr>
-            <w:tcW w:w="3213" w:type="dxa"/>
-            <w:tcBorders>
-              <w:start w:val="single" w:sz="4" w:space="0" w:color="000000"/>
-              <w:bottom w:val="single" w:sz="4" w:space="0" w:color="000000"/>
-            </w:tcBorders>
-          </w:tcPr>
-          <w:p>
-            <w:pPr>
-              <w:pStyle w:val="Contenudetableau"/>
-              <w:widowControl w:val="false"/>
-              <w:suppressLineNumbers/>
-              <w:bidi w:val="0"/>
-              <w:jc w:val="start"/>
-              <w:rPr/>
-            </w:pPr>
-            <w:r>
-              <w:rPr/>
-            </w:r>
-          </w:p>
-        </w:tc>
-        <w:tc>
-          <w:tcPr>
-            <w:tcW w:w="3213" w:type="dxa"/>
-            <w:tcBorders>
-              <w:start w:val="single" w:sz="4" w:space="0" w:color="000000"/>
-              <w:bottom w:val="single" w:sz="4" w:space="0" w:color="000000"/>
-              <w:end w:val="single" w:sz="4" w:space="0" w:color="000000"/>
-            </w:tcBorders>
-          </w:tcPr>
-          <w:p>
-            <w:pPr>
-              <w:pStyle w:val="Contenudetableau"/>
-              <w:widowControl w:val="false"/>
-              <w:suppressLineNumbers/>
-              <w:bidi w:val="0"/>
-              <w:jc w:val="start"/>
-              <w:rPr/>
-            </w:pPr>
-            <w:r>
-              <w:rPr/>
+              <w:end w:val="single" w:sz="4" w:space="0" w:color="000000"/>
+            </w:tcBorders>
+          </w:tcPr>
+          <w:p>
+            <w:pPr>
+              <w:pStyle w:val="Contenudetableau"/>
+              <w:bidi w:val="0"/>
+              <w:jc w:val="start"/>
+              <w:rPr/>
+            </w:pPr>
+            <w:r>
+              <w:rPr/>
+              <w:t>Affichage des tableaux de l’utilisateur et retour http 200</w:t>
             </w:r>
           </w:p>
         </w:tc>
@@ -956,111 +948,116 @@
             </w:pPr>
             <w:r>
               <w:rPr/>
-            </w:r>
-          </w:p>
-        </w:tc>
-        <w:tc>
-          <w:tcPr>
-            <w:tcW w:w="3213" w:type="dxa"/>
-            <w:tcBorders>
-              <w:start w:val="single" w:sz="4" w:space="0" w:color="000000"/>
-              <w:bottom w:val="single" w:sz="4" w:space="0" w:color="000000"/>
-            </w:tcBorders>
-          </w:tcPr>
-          <w:p>
-            <w:pPr>
-              <w:pStyle w:val="Contenudetableau"/>
-              <w:bidi w:val="0"/>
-              <w:jc w:val="start"/>
-              <w:rPr/>
-            </w:pPr>
-            <w:r>
-              <w:rPr/>
-            </w:r>
-          </w:p>
-        </w:tc>
-        <w:tc>
-          <w:tcPr>
-            <w:tcW w:w="3213" w:type="dxa"/>
-            <w:tcBorders>
-              <w:start w:val="single" w:sz="4" w:space="0" w:color="000000"/>
-              <w:bottom w:val="single" w:sz="4" w:space="0" w:color="000000"/>
-              <w:end w:val="single" w:sz="4" w:space="0" w:color="000000"/>
-            </w:tcBorders>
-          </w:tcPr>
-          <w:p>
-            <w:pPr>
-              <w:pStyle w:val="Contenudetableau"/>
-              <w:bidi w:val="0"/>
-              <w:jc w:val="start"/>
-              <w:rPr/>
-            </w:pPr>
-            <w:r>
-              <w:rPr/>
-            </w:r>
-          </w:p>
-        </w:tc>
-      </w:tr>
-      <w:tr>
-        <w:trPr/>
-        <w:tc>
-          <w:tcPr>
-            <w:tcW w:w="3212" w:type="dxa"/>
-            <w:tcBorders>
-              <w:start w:val="single" w:sz="4" w:space="0" w:color="000000"/>
-              <w:bottom w:val="single" w:sz="4" w:space="0" w:color="000000"/>
-            </w:tcBorders>
-          </w:tcPr>
-          <w:p>
-            <w:pPr>
-              <w:pStyle w:val="Contenudetableau"/>
-              <w:bidi w:val="0"/>
-              <w:jc w:val="start"/>
-              <w:rPr/>
-            </w:pPr>
-            <w:r>
-              <w:rPr/>
-            </w:r>
-          </w:p>
-        </w:tc>
-        <w:tc>
-          <w:tcPr>
-            <w:tcW w:w="3213" w:type="dxa"/>
-            <w:tcBorders>
-              <w:start w:val="single" w:sz="4" w:space="0" w:color="000000"/>
-              <w:bottom w:val="single" w:sz="4" w:space="0" w:color="000000"/>
-            </w:tcBorders>
-          </w:tcPr>
-          <w:p>
-            <w:pPr>
-              <w:pStyle w:val="Contenudetableau"/>
-              <w:bidi w:val="0"/>
-              <w:jc w:val="start"/>
-              <w:rPr/>
-            </w:pPr>
-            <w:r>
-              <w:rPr/>
-            </w:r>
-          </w:p>
-        </w:tc>
-        <w:tc>
-          <w:tcPr>
-            <w:tcW w:w="3213" w:type="dxa"/>
-            <w:tcBorders>
-              <w:start w:val="single" w:sz="4" w:space="0" w:color="000000"/>
-              <w:bottom w:val="single" w:sz="4" w:space="0" w:color="000000"/>
-              <w:end w:val="single" w:sz="4" w:space="0" w:color="000000"/>
-            </w:tcBorders>
-          </w:tcPr>
-          <w:p>
-            <w:pPr>
-              <w:pStyle w:val="Contenudetableau"/>
-              <w:bidi w:val="0"/>
-              <w:jc w:val="start"/>
-              <w:rPr/>
-            </w:pPr>
-            <w:r>
-              <w:rPr/>
+              <w:t>Connexion bosswaza</w:t>
+            </w:r>
+          </w:p>
+        </w:tc>
+        <w:tc>
+          <w:tcPr>
+            <w:tcW w:w="3213" w:type="dxa"/>
+            <w:tcBorders>
+              <w:start w:val="single" w:sz="4" w:space="0" w:color="000000"/>
+              <w:bottom w:val="single" w:sz="4" w:space="0" w:color="000000"/>
+            </w:tcBorders>
+          </w:tcPr>
+          <w:p>
+            <w:pPr>
+              <w:pStyle w:val="Contenudetableau"/>
+              <w:bidi w:val="0"/>
+              <w:jc w:val="start"/>
+              <w:rPr/>
+            </w:pPr>
+            <w:r>
+              <w:rPr/>
+              <w:t>Connexion</w:t>
+            </w:r>
+          </w:p>
+        </w:tc>
+        <w:tc>
+          <w:tcPr>
+            <w:tcW w:w="3213" w:type="dxa"/>
+            <w:tcBorders>
+              <w:start w:val="single" w:sz="4" w:space="0" w:color="000000"/>
+              <w:bottom w:val="single" w:sz="4" w:space="0" w:color="000000"/>
+              <w:end w:val="single" w:sz="4" w:space="0" w:color="000000"/>
+            </w:tcBorders>
+          </w:tcPr>
+          <w:p>
+            <w:pPr>
+              <w:pStyle w:val="Contenudetableau"/>
+              <w:bidi w:val="0"/>
+              <w:jc w:val="start"/>
+              <w:rPr/>
+            </w:pPr>
+            <w:r>
+              <w:rPr/>
+              <w:t>Identifiants corrects, création token (stocké localement) et retour http 200</w:t>
+            </w:r>
+          </w:p>
+        </w:tc>
+      </w:tr>
+      <w:tr>
+        <w:trPr/>
+        <w:tc>
+          <w:tcPr>
+            <w:tcW w:w="3212" w:type="dxa"/>
+            <w:tcBorders>
+              <w:start w:val="single" w:sz="4" w:space="0" w:color="000000"/>
+              <w:bottom w:val="single" w:sz="4" w:space="0" w:color="000000"/>
+            </w:tcBorders>
+          </w:tcPr>
+          <w:p>
+            <w:pPr>
+              <w:pStyle w:val="Contenudetableau"/>
+              <w:bidi w:val="0"/>
+              <w:jc w:val="start"/>
+              <w:rPr/>
+            </w:pPr>
+            <w:r>
+              <w:rPr/>
+              <w:t>Accès à la page</w:t>
+            </w:r>
+          </w:p>
+        </w:tc>
+        <w:tc>
+          <w:tcPr>
+            <w:tcW w:w="3213" w:type="dxa"/>
+            <w:tcBorders>
+              <w:start w:val="single" w:sz="4" w:space="0" w:color="000000"/>
+              <w:bottom w:val="single" w:sz="4" w:space="0" w:color="000000"/>
+            </w:tcBorders>
+          </w:tcPr>
+          <w:p>
+            <w:pPr>
+              <w:pStyle w:val="Contenudetableau"/>
+              <w:bidi w:val="0"/>
+              <w:jc w:val="start"/>
+              <w:rPr/>
+            </w:pPr>
+            <w:r>
+              <w:rPr/>
+            </w:r>
+          </w:p>
+        </w:tc>
+        <w:tc>
+          <w:tcPr>
+            <w:tcW w:w="3213" w:type="dxa"/>
+            <w:tcBorders>
+              <w:start w:val="single" w:sz="4" w:space="0" w:color="000000"/>
+              <w:bottom w:val="single" w:sz="4" w:space="0" w:color="000000"/>
+              <w:end w:val="single" w:sz="4" w:space="0" w:color="000000"/>
+            </w:tcBorders>
+          </w:tcPr>
+          <w:p>
+            <w:pPr>
+              <w:pStyle w:val="Contenudetableau"/>
+              <w:bidi w:val="0"/>
+              <w:jc w:val="start"/>
+              <w:rPr/>
+            </w:pPr>
+            <w:r>
+              <w:rPr/>
+              <w:t>Affichage de tous les tableaux de la base</w:t>
             </w:r>
           </w:p>
         </w:tc>
@@ -1196,116 +1193,223 @@
             </w:pPr>
             <w:r>
               <w:rPr/>
-            </w:r>
-          </w:p>
-        </w:tc>
-        <w:tc>
-          <w:tcPr>
-            <w:tcW w:w="3213" w:type="dxa"/>
-            <w:tcBorders>
-              <w:start w:val="single" w:sz="4" w:space="0" w:color="000000"/>
-              <w:bottom w:val="single" w:sz="4" w:space="0" w:color="000000"/>
-            </w:tcBorders>
-          </w:tcPr>
-          <w:p>
-            <w:pPr>
-              <w:pStyle w:val="Contenudetableau"/>
-              <w:bidi w:val="0"/>
-              <w:jc w:val="start"/>
-              <w:rPr/>
-            </w:pPr>
-            <w:r>
-              <w:rPr/>
-            </w:r>
-          </w:p>
-        </w:tc>
-        <w:tc>
-          <w:tcPr>
-            <w:tcW w:w="3213" w:type="dxa"/>
-            <w:tcBorders>
-              <w:start w:val="single" w:sz="4" w:space="0" w:color="000000"/>
-              <w:bottom w:val="single" w:sz="4" w:space="0" w:color="000000"/>
-              <w:end w:val="single" w:sz="4" w:space="0" w:color="000000"/>
-            </w:tcBorders>
-          </w:tcPr>
-          <w:p>
-            <w:pPr>
-              <w:pStyle w:val="Contenudetableau"/>
-              <w:bidi w:val="0"/>
-              <w:jc w:val="start"/>
-              <w:rPr/>
-            </w:pPr>
-            <w:r>
-              <w:rPr/>
-            </w:r>
-          </w:p>
-        </w:tc>
-      </w:tr>
-      <w:tr>
-        <w:trPr/>
-        <w:tc>
-          <w:tcPr>
-            <w:tcW w:w="3212" w:type="dxa"/>
-            <w:tcBorders>
-              <w:start w:val="single" w:sz="4" w:space="0" w:color="000000"/>
-              <w:bottom w:val="single" w:sz="4" w:space="0" w:color="000000"/>
-            </w:tcBorders>
-          </w:tcPr>
-          <w:p>
-            <w:pPr>
-              <w:pStyle w:val="Contenudetableau"/>
-              <w:bidi w:val="0"/>
-              <w:jc w:val="start"/>
-              <w:rPr/>
-            </w:pPr>
-            <w:r>
-              <w:rPr/>
-            </w:r>
-          </w:p>
-        </w:tc>
-        <w:tc>
-          <w:tcPr>
-            <w:tcW w:w="3213" w:type="dxa"/>
-            <w:tcBorders>
-              <w:start w:val="single" w:sz="4" w:space="0" w:color="000000"/>
-              <w:bottom w:val="single" w:sz="4" w:space="0" w:color="000000"/>
-            </w:tcBorders>
-          </w:tcPr>
-          <w:p>
-            <w:pPr>
-              <w:pStyle w:val="Contenudetableau"/>
-              <w:bidi w:val="0"/>
-              <w:jc w:val="start"/>
-              <w:rPr/>
-            </w:pPr>
-            <w:r>
-              <w:rPr/>
-            </w:r>
-          </w:p>
-        </w:tc>
-        <w:tc>
-          <w:tcPr>
-            <w:tcW w:w="3213" w:type="dxa"/>
-            <w:tcBorders>
-              <w:start w:val="single" w:sz="4" w:space="0" w:color="000000"/>
-              <w:bottom w:val="single" w:sz="4" w:space="0" w:color="000000"/>
-              <w:end w:val="single" w:sz="4" w:space="0" w:color="000000"/>
-            </w:tcBorders>
-          </w:tcPr>
-          <w:p>
-            <w:pPr>
-              <w:pStyle w:val="Contenudetableau"/>
-              <w:bidi w:val="0"/>
-              <w:jc w:val="start"/>
-              <w:rPr/>
-            </w:pPr>
-            <w:r>
-              <w:rPr/>
+              <w:t>Connexion bosswaza</w:t>
+            </w:r>
+          </w:p>
+        </w:tc>
+        <w:tc>
+          <w:tcPr>
+            <w:tcW w:w="3213" w:type="dxa"/>
+            <w:tcBorders>
+              <w:start w:val="single" w:sz="4" w:space="0" w:color="000000"/>
+              <w:bottom w:val="single" w:sz="4" w:space="0" w:color="000000"/>
+            </w:tcBorders>
+          </w:tcPr>
+          <w:p>
+            <w:pPr>
+              <w:pStyle w:val="Contenudetableau"/>
+              <w:bidi w:val="0"/>
+              <w:jc w:val="start"/>
+              <w:rPr/>
+            </w:pPr>
+            <w:r>
+              <w:rPr/>
+              <w:t>Connexion</w:t>
+            </w:r>
+          </w:p>
+        </w:tc>
+        <w:tc>
+          <w:tcPr>
+            <w:tcW w:w="3213" w:type="dxa"/>
+            <w:tcBorders>
+              <w:start w:val="single" w:sz="4" w:space="0" w:color="000000"/>
+              <w:bottom w:val="single" w:sz="4" w:space="0" w:color="000000"/>
+              <w:end w:val="single" w:sz="4" w:space="0" w:color="000000"/>
+            </w:tcBorders>
+          </w:tcPr>
+          <w:p>
+            <w:pPr>
+              <w:pStyle w:val="Contenudetableau"/>
+              <w:bidi w:val="0"/>
+              <w:jc w:val="start"/>
+              <w:rPr/>
+            </w:pPr>
+            <w:r>
+              <w:rPr/>
+              <w:t>Identifiants corrects, création token (stocké localement) et retour http 200</w:t>
+            </w:r>
+          </w:p>
+        </w:tc>
+      </w:tr>
+      <w:tr>
+        <w:trPr/>
+        <w:tc>
+          <w:tcPr>
+            <w:tcW w:w="3212" w:type="dxa"/>
+            <w:tcBorders>
+              <w:start w:val="single" w:sz="4" w:space="0" w:color="000000"/>
+              <w:bottom w:val="single" w:sz="4" w:space="0" w:color="000000"/>
+            </w:tcBorders>
+          </w:tcPr>
+          <w:p>
+            <w:pPr>
+              <w:pStyle w:val="Contenudetableau"/>
+              <w:bidi w:val="0"/>
+              <w:jc w:val="start"/>
+              <w:rPr/>
+            </w:pPr>
+            <w:r>
+              <w:rPr/>
+              <w:t>Accès à la page</w:t>
+            </w:r>
+          </w:p>
+        </w:tc>
+        <w:tc>
+          <w:tcPr>
+            <w:tcW w:w="3213" w:type="dxa"/>
+            <w:tcBorders>
+              <w:start w:val="single" w:sz="4" w:space="0" w:color="000000"/>
+              <w:bottom w:val="single" w:sz="4" w:space="0" w:color="000000"/>
+            </w:tcBorders>
+          </w:tcPr>
+          <w:p>
+            <w:pPr>
+              <w:pStyle w:val="Contenudetableau"/>
+              <w:widowControl w:val="false"/>
+              <w:suppressLineNumbers/>
+              <w:bidi w:val="0"/>
+              <w:jc w:val="start"/>
+              <w:rPr/>
+            </w:pPr>
+            <w:r>
+              <w:rPr/>
+            </w:r>
+          </w:p>
+        </w:tc>
+        <w:tc>
+          <w:tcPr>
+            <w:tcW w:w="3213" w:type="dxa"/>
+            <w:tcBorders>
+              <w:start w:val="single" w:sz="4" w:space="0" w:color="000000"/>
+              <w:bottom w:val="single" w:sz="4" w:space="0" w:color="000000"/>
+              <w:end w:val="single" w:sz="4" w:space="0" w:color="000000"/>
+            </w:tcBorders>
+          </w:tcPr>
+          <w:p>
+            <w:pPr>
+              <w:pStyle w:val="Contenudetableau"/>
+              <w:bidi w:val="0"/>
+              <w:jc w:val="start"/>
+              <w:rPr/>
+            </w:pPr>
+            <w:r>
+              <w:rPr/>
+              <w:t>Affichage de tous les tableaux et retour http 200</w:t>
+            </w:r>
+          </w:p>
+        </w:tc>
+      </w:tr>
+      <w:tr>
+        <w:trPr/>
+        <w:tc>
+          <w:tcPr>
+            <w:tcW w:w="3212" w:type="dxa"/>
+            <w:tcBorders>
+              <w:start w:val="single" w:sz="4" w:space="0" w:color="000000"/>
+              <w:bottom w:val="single" w:sz="4" w:space="0" w:color="000000"/>
+            </w:tcBorders>
+          </w:tcPr>
+          <w:p>
+            <w:pPr>
+              <w:pStyle w:val="Contenudetableau"/>
+              <w:bidi w:val="0"/>
+              <w:jc w:val="start"/>
+              <w:rPr/>
+            </w:pPr>
+            <w:r>
+              <w:rPr/>
+              <w:t>Accès au tableau d’id tab_roadmap_2026</w:t>
+            </w:r>
+          </w:p>
+        </w:tc>
+        <w:tc>
+          <w:tcPr>
+            <w:tcW w:w="3213" w:type="dxa"/>
+            <w:tcBorders>
+              <w:start w:val="single" w:sz="4" w:space="0" w:color="000000"/>
+              <w:bottom w:val="single" w:sz="4" w:space="0" w:color="000000"/>
+            </w:tcBorders>
+          </w:tcPr>
+          <w:p>
+            <w:pPr>
+              <w:pStyle w:val="Contenudetableau"/>
+              <w:bidi w:val="0"/>
+              <w:jc w:val="start"/>
+              <w:rPr/>
+            </w:pPr>
+            <w:r>
+              <w:rPr/>
+              <w:t>Clic sur le tableau de sa liste</w:t>
+            </w:r>
+          </w:p>
+        </w:tc>
+        <w:tc>
+          <w:tcPr>
+            <w:tcW w:w="3213" w:type="dxa"/>
+            <w:tcBorders>
+              <w:start w:val="single" w:sz="4" w:space="0" w:color="000000"/>
+              <w:bottom w:val="single" w:sz="4" w:space="0" w:color="000000"/>
+              <w:end w:val="single" w:sz="4" w:space="0" w:color="000000"/>
+            </w:tcBorders>
+          </w:tcPr>
+          <w:p>
+            <w:pPr>
+              <w:pStyle w:val="Contenudetableau"/>
+              <w:bidi w:val="0"/>
+              <w:jc w:val="start"/>
+              <w:rPr/>
+            </w:pPr>
+            <w:r>
+              <w:rPr/>
+              <w:t>Affichage du tableau ainsi que ses listes et cartes associer et retour http 200</w:t>
             </w:r>
           </w:p>
         </w:tc>
       </w:tr>
     </w:tbl>
+    <w:p>
+      <w:pPr>
+        <w:pStyle w:val="Normal"/>
+        <w:bidi w:val="0"/>
+        <w:jc w:val="start"/>
+        <w:rPr/>
+      </w:pPr>
+      <w:r>
+        <w:rPr/>
+      </w:r>
+    </w:p>
+    <w:p>
+      <w:pPr>
+        <w:pStyle w:val="Normal"/>
+        <w:bidi w:val="0"/>
+        <w:jc w:val="start"/>
+        <w:rPr/>
+      </w:pPr>
+      <w:r>
+        <w:rPr/>
+      </w:r>
+    </w:p>
+    <w:p>
+      <w:pPr>
+        <w:pStyle w:val="Normal"/>
+        <w:bidi w:val="0"/>
+        <w:jc w:val="start"/>
+        <w:rPr/>
+      </w:pPr>
+      <w:r>
+        <w:rPr/>
+      </w:r>
+    </w:p>
     <w:p>
       <w:pPr>
         <w:pStyle w:val="Normal"/>
@@ -1436,111 +1540,252 @@
             </w:pPr>
             <w:r>
               <w:rPr/>
-            </w:r>
-          </w:p>
-        </w:tc>
-        <w:tc>
-          <w:tcPr>
-            <w:tcW w:w="3213" w:type="dxa"/>
-            <w:tcBorders>
-              <w:start w:val="single" w:sz="4" w:space="0" w:color="000000"/>
-              <w:bottom w:val="single" w:sz="4" w:space="0" w:color="000000"/>
-            </w:tcBorders>
-          </w:tcPr>
-          <w:p>
-            <w:pPr>
-              <w:pStyle w:val="Contenudetableau"/>
-              <w:bidi w:val="0"/>
-              <w:jc w:val="start"/>
-              <w:rPr/>
-            </w:pPr>
-            <w:r>
-              <w:rPr/>
-            </w:r>
-          </w:p>
-        </w:tc>
-        <w:tc>
-          <w:tcPr>
-            <w:tcW w:w="3213" w:type="dxa"/>
-            <w:tcBorders>
-              <w:start w:val="single" w:sz="4" w:space="0" w:color="000000"/>
-              <w:bottom w:val="single" w:sz="4" w:space="0" w:color="000000"/>
-              <w:end w:val="single" w:sz="4" w:space="0" w:color="000000"/>
-            </w:tcBorders>
-          </w:tcPr>
-          <w:p>
-            <w:pPr>
-              <w:pStyle w:val="Contenudetableau"/>
-              <w:bidi w:val="0"/>
-              <w:jc w:val="start"/>
-              <w:rPr/>
-            </w:pPr>
-            <w:r>
-              <w:rPr/>
-            </w:r>
-          </w:p>
-        </w:tc>
-      </w:tr>
-      <w:tr>
-        <w:trPr/>
-        <w:tc>
-          <w:tcPr>
-            <w:tcW w:w="3212" w:type="dxa"/>
-            <w:tcBorders>
-              <w:start w:val="single" w:sz="4" w:space="0" w:color="000000"/>
-              <w:bottom w:val="single" w:sz="4" w:space="0" w:color="000000"/>
-            </w:tcBorders>
-          </w:tcPr>
-          <w:p>
-            <w:pPr>
-              <w:pStyle w:val="Contenudetableau"/>
-              <w:bidi w:val="0"/>
-              <w:jc w:val="start"/>
-              <w:rPr/>
-            </w:pPr>
-            <w:r>
-              <w:rPr/>
-            </w:r>
-          </w:p>
-        </w:tc>
-        <w:tc>
-          <w:tcPr>
-            <w:tcW w:w="3213" w:type="dxa"/>
-            <w:tcBorders>
-              <w:start w:val="single" w:sz="4" w:space="0" w:color="000000"/>
-              <w:bottom w:val="single" w:sz="4" w:space="0" w:color="000000"/>
-            </w:tcBorders>
-          </w:tcPr>
-          <w:p>
-            <w:pPr>
-              <w:pStyle w:val="Contenudetableau"/>
-              <w:bidi w:val="0"/>
-              <w:jc w:val="start"/>
-              <w:rPr/>
-            </w:pPr>
-            <w:r>
-              <w:rPr/>
-            </w:r>
-          </w:p>
-        </w:tc>
-        <w:tc>
-          <w:tcPr>
-            <w:tcW w:w="3213" w:type="dxa"/>
-            <w:tcBorders>
-              <w:start w:val="single" w:sz="4" w:space="0" w:color="000000"/>
-              <w:bottom w:val="single" w:sz="4" w:space="0" w:color="000000"/>
-              <w:end w:val="single" w:sz="4" w:space="0" w:color="000000"/>
-            </w:tcBorders>
-          </w:tcPr>
-          <w:p>
-            <w:pPr>
-              <w:pStyle w:val="Contenudetableau"/>
-              <w:bidi w:val="0"/>
-              <w:jc w:val="start"/>
-              <w:rPr/>
-            </w:pPr>
-            <w:r>
-              <w:rPr/>
+              <w:t>Connexion bosswaza</w:t>
+            </w:r>
+          </w:p>
+        </w:tc>
+        <w:tc>
+          <w:tcPr>
+            <w:tcW w:w="3213" w:type="dxa"/>
+            <w:tcBorders>
+              <w:start w:val="single" w:sz="4" w:space="0" w:color="000000"/>
+              <w:bottom w:val="single" w:sz="4" w:space="0" w:color="000000"/>
+            </w:tcBorders>
+          </w:tcPr>
+          <w:p>
+            <w:pPr>
+              <w:pStyle w:val="Contenudetableau"/>
+              <w:bidi w:val="0"/>
+              <w:jc w:val="start"/>
+              <w:rPr/>
+            </w:pPr>
+            <w:r>
+              <w:rPr/>
+              <w:t>Connexion</w:t>
+            </w:r>
+          </w:p>
+        </w:tc>
+        <w:tc>
+          <w:tcPr>
+            <w:tcW w:w="3213" w:type="dxa"/>
+            <w:tcBorders>
+              <w:start w:val="single" w:sz="4" w:space="0" w:color="000000"/>
+              <w:bottom w:val="single" w:sz="4" w:space="0" w:color="000000"/>
+              <w:end w:val="single" w:sz="4" w:space="0" w:color="000000"/>
+            </w:tcBorders>
+          </w:tcPr>
+          <w:p>
+            <w:pPr>
+              <w:pStyle w:val="Contenudetableau"/>
+              <w:bidi w:val="0"/>
+              <w:jc w:val="start"/>
+              <w:rPr/>
+            </w:pPr>
+            <w:r>
+              <w:rPr/>
+              <w:t>Identifiants corrects, création token (stocké localement) et retour http 200</w:t>
+            </w:r>
+          </w:p>
+        </w:tc>
+      </w:tr>
+      <w:tr>
+        <w:trPr/>
+        <w:tc>
+          <w:tcPr>
+            <w:tcW w:w="3212" w:type="dxa"/>
+            <w:tcBorders>
+              <w:start w:val="single" w:sz="4" w:space="0" w:color="000000"/>
+              <w:bottom w:val="single" w:sz="4" w:space="0" w:color="000000"/>
+            </w:tcBorders>
+          </w:tcPr>
+          <w:p>
+            <w:pPr>
+              <w:pStyle w:val="Contenudetableau"/>
+              <w:bidi w:val="0"/>
+              <w:jc w:val="start"/>
+              <w:rPr/>
+            </w:pPr>
+            <w:r>
+              <w:rPr/>
+              <w:t>Accès à la page</w:t>
+            </w:r>
+          </w:p>
+        </w:tc>
+        <w:tc>
+          <w:tcPr>
+            <w:tcW w:w="3213" w:type="dxa"/>
+            <w:tcBorders>
+              <w:start w:val="single" w:sz="4" w:space="0" w:color="000000"/>
+              <w:bottom w:val="single" w:sz="4" w:space="0" w:color="000000"/>
+            </w:tcBorders>
+          </w:tcPr>
+          <w:p>
+            <w:pPr>
+              <w:pStyle w:val="Contenudetableau"/>
+              <w:widowControl w:val="false"/>
+              <w:suppressLineNumbers/>
+              <w:bidi w:val="0"/>
+              <w:jc w:val="start"/>
+              <w:rPr/>
+            </w:pPr>
+            <w:r>
+              <w:rPr/>
+            </w:r>
+          </w:p>
+        </w:tc>
+        <w:tc>
+          <w:tcPr>
+            <w:tcW w:w="3213" w:type="dxa"/>
+            <w:tcBorders>
+              <w:start w:val="single" w:sz="4" w:space="0" w:color="000000"/>
+              <w:bottom w:val="single" w:sz="4" w:space="0" w:color="000000"/>
+              <w:end w:val="single" w:sz="4" w:space="0" w:color="000000"/>
+            </w:tcBorders>
+          </w:tcPr>
+          <w:p>
+            <w:pPr>
+              <w:pStyle w:val="Contenudetableau"/>
+              <w:bidi w:val="0"/>
+              <w:jc w:val="start"/>
+              <w:rPr/>
+            </w:pPr>
+            <w:r>
+              <w:rPr/>
+              <w:t>Affichage de tous les tableaux et retour http 200</w:t>
+            </w:r>
+          </w:p>
+        </w:tc>
+      </w:tr>
+      <w:tr>
+        <w:trPr/>
+        <w:tc>
+          <w:tcPr>
+            <w:tcW w:w="3212" w:type="dxa"/>
+            <w:tcBorders>
+              <w:start w:val="single" w:sz="4" w:space="0" w:color="000000"/>
+              <w:bottom w:val="single" w:sz="4" w:space="0" w:color="000000"/>
+            </w:tcBorders>
+          </w:tcPr>
+          <w:p>
+            <w:pPr>
+              <w:pStyle w:val="Contenudetableau"/>
+              <w:bidi w:val="0"/>
+              <w:jc w:val="start"/>
+              <w:rPr/>
+            </w:pPr>
+            <w:r>
+              <w:rPr/>
+              <w:t>Accès au tableau d’id tab_roadmap_2026</w:t>
+            </w:r>
+          </w:p>
+        </w:tc>
+        <w:tc>
+          <w:tcPr>
+            <w:tcW w:w="3213" w:type="dxa"/>
+            <w:tcBorders>
+              <w:start w:val="single" w:sz="4" w:space="0" w:color="000000"/>
+              <w:bottom w:val="single" w:sz="4" w:space="0" w:color="000000"/>
+            </w:tcBorders>
+          </w:tcPr>
+          <w:p>
+            <w:pPr>
+              <w:pStyle w:val="Contenudetableau"/>
+              <w:bidi w:val="0"/>
+              <w:jc w:val="start"/>
+              <w:rPr/>
+            </w:pPr>
+            <w:r>
+              <w:rPr/>
+              <w:t>Clic sur le tableau de sa liste</w:t>
+            </w:r>
+          </w:p>
+        </w:tc>
+        <w:tc>
+          <w:tcPr>
+            <w:tcW w:w="3213" w:type="dxa"/>
+            <w:tcBorders>
+              <w:start w:val="single" w:sz="4" w:space="0" w:color="000000"/>
+              <w:bottom w:val="single" w:sz="4" w:space="0" w:color="000000"/>
+              <w:end w:val="single" w:sz="4" w:space="0" w:color="000000"/>
+            </w:tcBorders>
+          </w:tcPr>
+          <w:p>
+            <w:pPr>
+              <w:pStyle w:val="Contenudetableau"/>
+              <w:bidi w:val="0"/>
+              <w:jc w:val="start"/>
+              <w:rPr/>
+            </w:pPr>
+            <w:r>
+              <w:rPr/>
+              <w:t>Affichage du tableau ainsi que ses listes et cartes associées et retour http 200</w:t>
+            </w:r>
+          </w:p>
+        </w:tc>
+      </w:tr>
+      <w:tr>
+        <w:trPr/>
+        <w:tc>
+          <w:tcPr>
+            <w:tcW w:w="3212" w:type="dxa"/>
+            <w:tcBorders>
+              <w:start w:val="single" w:sz="4" w:space="0" w:color="000000"/>
+              <w:bottom w:val="single" w:sz="4" w:space="0" w:color="000000"/>
+            </w:tcBorders>
+          </w:tcPr>
+          <w:p>
+            <w:pPr>
+              <w:pStyle w:val="Contenudetableau"/>
+              <w:bidi w:val="0"/>
+              <w:jc w:val="start"/>
+              <w:rPr/>
+            </w:pPr>
+            <w:r>
+              <w:rPr/>
+              <w:t xml:space="preserve">Accès à la carte d’id </w:t>
+            </w:r>
+          </w:p>
+        </w:tc>
+        <w:tc>
+          <w:tcPr>
+            <w:tcW w:w="3213" w:type="dxa"/>
+            <w:tcBorders>
+              <w:start w:val="single" w:sz="4" w:space="0" w:color="000000"/>
+              <w:bottom w:val="single" w:sz="4" w:space="0" w:color="000000"/>
+            </w:tcBorders>
+          </w:tcPr>
+          <w:p>
+            <w:pPr>
+              <w:pStyle w:val="Contenudetableau"/>
+              <w:bidi w:val="0"/>
+              <w:jc w:val="start"/>
+              <w:rPr/>
+            </w:pPr>
+            <w:r>
+              <w:rPr/>
+              <w:t>Clic sur la carte</w:t>
+            </w:r>
+          </w:p>
+        </w:tc>
+        <w:tc>
+          <w:tcPr>
+            <w:tcW w:w="3213" w:type="dxa"/>
+            <w:tcBorders>
+              <w:start w:val="single" w:sz="4" w:space="0" w:color="000000"/>
+              <w:bottom w:val="single" w:sz="4" w:space="0" w:color="000000"/>
+              <w:end w:val="single" w:sz="4" w:space="0" w:color="000000"/>
+            </w:tcBorders>
+          </w:tcPr>
+          <w:p>
+            <w:pPr>
+              <w:pStyle w:val="Contenudetableau"/>
+              <w:bidi w:val="0"/>
+              <w:jc w:val="start"/>
+              <w:rPr/>
+            </w:pPr>
+            <w:r>
+              <w:rPr/>
+              <w:t>Affichage de la carte et de ses informations associées et retour http 200</w:t>
             </w:r>
           </w:p>
         </w:tc>
@@ -1567,6 +1812,387 @@
       <w:r>
         <w:rPr/>
         <w:t>Affichage log d’un tableau</w:t>
+      </w:r>
+    </w:p>
+    <w:tbl>
+      <w:tblPr>
+        <w:tblW w:w="9659" w:type="dxa"/>
+        <w:jc w:val="start"/>
+        <w:tblInd w:w="-26" w:type="dxa"/>
+        <w:tblLayout w:type="fixed"/>
+        <w:tblCellMar>
+          <w:top w:w="55" w:type="dxa"/>
+          <w:start w:w="55" w:type="dxa"/>
+          <w:bottom w:w="55" w:type="dxa"/>
+          <w:end w:w="55" w:type="dxa"/>
+        </w:tblCellMar>
+      </w:tblPr>
+      <w:tblGrid>
+        <w:gridCol w:w="3229"/>
+        <w:gridCol w:w="3218"/>
+        <w:gridCol w:w="3212"/>
+      </w:tblGrid>
+      <w:tr>
+        <w:trPr/>
+        <w:tc>
+          <w:tcPr>
+            <w:tcW w:w="3229" w:type="dxa"/>
+            <w:tcBorders>
+              <w:top w:val="single" w:sz="4" w:space="0" w:color="000000"/>
+              <w:start w:val="single" w:sz="4" w:space="0" w:color="000000"/>
+              <w:bottom w:val="single" w:sz="4" w:space="0" w:color="000000"/>
+            </w:tcBorders>
+          </w:tcPr>
+          <w:p>
+            <w:pPr>
+              <w:pStyle w:val="Contenudetableau"/>
+              <w:bidi w:val="0"/>
+              <w:jc w:val="start"/>
+              <w:rPr/>
+            </w:pPr>
+            <w:r>
+              <w:rPr/>
+              <w:t>Etape</w:t>
+            </w:r>
+          </w:p>
+        </w:tc>
+        <w:tc>
+          <w:tcPr>
+            <w:tcW w:w="3218" w:type="dxa"/>
+            <w:tcBorders>
+              <w:top w:val="single" w:sz="4" w:space="0" w:color="000000"/>
+              <w:start w:val="single" w:sz="4" w:space="0" w:color="000000"/>
+              <w:bottom w:val="single" w:sz="4" w:space="0" w:color="000000"/>
+            </w:tcBorders>
+          </w:tcPr>
+          <w:p>
+            <w:pPr>
+              <w:pStyle w:val="Contenudetableau"/>
+              <w:bidi w:val="0"/>
+              <w:jc w:val="start"/>
+              <w:rPr/>
+            </w:pPr>
+            <w:r>
+              <w:rPr/>
+              <w:t>Action utilisateur</w:t>
+            </w:r>
+          </w:p>
+        </w:tc>
+        <w:tc>
+          <w:tcPr>
+            <w:tcW w:w="3212" w:type="dxa"/>
+            <w:tcBorders>
+              <w:top w:val="single" w:sz="4" w:space="0" w:color="000000"/>
+              <w:start w:val="single" w:sz="4" w:space="0" w:color="000000"/>
+              <w:bottom w:val="single" w:sz="4" w:space="0" w:color="000000"/>
+              <w:end w:val="single" w:sz="4" w:space="0" w:color="000000"/>
+            </w:tcBorders>
+          </w:tcPr>
+          <w:p>
+            <w:pPr>
+              <w:pStyle w:val="Contenudetableau"/>
+              <w:bidi w:val="0"/>
+              <w:jc w:val="start"/>
+              <w:rPr/>
+            </w:pPr>
+            <w:r>
+              <w:rPr/>
+              <w:t>Réponse Api</w:t>
+            </w:r>
+          </w:p>
+        </w:tc>
+      </w:tr>
+      <w:tr>
+        <w:trPr/>
+        <w:tc>
+          <w:tcPr>
+            <w:tcW w:w="3229" w:type="dxa"/>
+            <w:tcBorders>
+              <w:start w:val="single" w:sz="4" w:space="0" w:color="000000"/>
+              <w:bottom w:val="single" w:sz="4" w:space="0" w:color="000000"/>
+            </w:tcBorders>
+          </w:tcPr>
+          <w:p>
+            <w:pPr>
+              <w:pStyle w:val="Contenudetableau"/>
+              <w:bidi w:val="0"/>
+              <w:jc w:val="start"/>
+              <w:rPr/>
+            </w:pPr>
+            <w:r>
+              <w:rPr/>
+              <w:t>Connexion bosswaza</w:t>
+            </w:r>
+          </w:p>
+        </w:tc>
+        <w:tc>
+          <w:tcPr>
+            <w:tcW w:w="3218" w:type="dxa"/>
+            <w:tcBorders>
+              <w:start w:val="single" w:sz="4" w:space="0" w:color="000000"/>
+              <w:bottom w:val="single" w:sz="4" w:space="0" w:color="000000"/>
+            </w:tcBorders>
+          </w:tcPr>
+          <w:p>
+            <w:pPr>
+              <w:pStyle w:val="Contenudetableau"/>
+              <w:bidi w:val="0"/>
+              <w:jc w:val="start"/>
+              <w:rPr/>
+            </w:pPr>
+            <w:r>
+              <w:rPr/>
+              <w:t>Connexion</w:t>
+            </w:r>
+          </w:p>
+        </w:tc>
+        <w:tc>
+          <w:tcPr>
+            <w:tcW w:w="3212" w:type="dxa"/>
+            <w:tcBorders>
+              <w:start w:val="single" w:sz="4" w:space="0" w:color="000000"/>
+              <w:bottom w:val="single" w:sz="4" w:space="0" w:color="000000"/>
+              <w:end w:val="single" w:sz="4" w:space="0" w:color="000000"/>
+            </w:tcBorders>
+          </w:tcPr>
+          <w:p>
+            <w:pPr>
+              <w:pStyle w:val="Contenudetableau"/>
+              <w:bidi w:val="0"/>
+              <w:jc w:val="start"/>
+              <w:rPr/>
+            </w:pPr>
+            <w:r>
+              <w:rPr/>
+              <w:t>Identifiants corrects, création token (stocké localement) et retour http 200</w:t>
+            </w:r>
+          </w:p>
+        </w:tc>
+      </w:tr>
+      <w:tr>
+        <w:trPr/>
+        <w:tc>
+          <w:tcPr>
+            <w:tcW w:w="3229" w:type="dxa"/>
+            <w:tcBorders>
+              <w:start w:val="single" w:sz="4" w:space="0" w:color="000000"/>
+              <w:bottom w:val="single" w:sz="4" w:space="0" w:color="000000"/>
+            </w:tcBorders>
+          </w:tcPr>
+          <w:p>
+            <w:pPr>
+              <w:pStyle w:val="Contenudetableau"/>
+              <w:bidi w:val="0"/>
+              <w:jc w:val="start"/>
+              <w:rPr/>
+            </w:pPr>
+            <w:r>
+              <w:rPr/>
+              <w:t>Accès à la page</w:t>
+            </w:r>
+          </w:p>
+        </w:tc>
+        <w:tc>
+          <w:tcPr>
+            <w:tcW w:w="3218" w:type="dxa"/>
+            <w:tcBorders>
+              <w:start w:val="single" w:sz="4" w:space="0" w:color="000000"/>
+              <w:bottom w:val="single" w:sz="4" w:space="0" w:color="000000"/>
+            </w:tcBorders>
+          </w:tcPr>
+          <w:p>
+            <w:pPr>
+              <w:pStyle w:val="Contenudetableau"/>
+              <w:widowControl w:val="false"/>
+              <w:suppressLineNumbers/>
+              <w:bidi w:val="0"/>
+              <w:jc w:val="start"/>
+              <w:rPr/>
+            </w:pPr>
+            <w:r>
+              <w:rPr/>
+            </w:r>
+          </w:p>
+        </w:tc>
+        <w:tc>
+          <w:tcPr>
+            <w:tcW w:w="3212" w:type="dxa"/>
+            <w:tcBorders>
+              <w:start w:val="single" w:sz="4" w:space="0" w:color="000000"/>
+              <w:bottom w:val="single" w:sz="4" w:space="0" w:color="000000"/>
+              <w:end w:val="single" w:sz="4" w:space="0" w:color="000000"/>
+            </w:tcBorders>
+          </w:tcPr>
+          <w:p>
+            <w:pPr>
+              <w:pStyle w:val="Contenudetableau"/>
+              <w:bidi w:val="0"/>
+              <w:jc w:val="start"/>
+              <w:rPr/>
+            </w:pPr>
+            <w:r>
+              <w:rPr/>
+              <w:t>Affichage de tous les tableaux et retour http 200</w:t>
+            </w:r>
+          </w:p>
+        </w:tc>
+      </w:tr>
+      <w:tr>
+        <w:trPr/>
+        <w:tc>
+          <w:tcPr>
+            <w:tcW w:w="3229" w:type="dxa"/>
+            <w:tcBorders>
+              <w:start w:val="single" w:sz="4" w:space="0" w:color="000000"/>
+              <w:bottom w:val="single" w:sz="4" w:space="0" w:color="000000"/>
+            </w:tcBorders>
+          </w:tcPr>
+          <w:p>
+            <w:pPr>
+              <w:pStyle w:val="Contenudetableau"/>
+              <w:bidi w:val="0"/>
+              <w:jc w:val="start"/>
+              <w:rPr/>
+            </w:pPr>
+            <w:r>
+              <w:rPr/>
+              <w:t>Accès au tableau d’id tab_roadmap_2026</w:t>
+            </w:r>
+          </w:p>
+        </w:tc>
+        <w:tc>
+          <w:tcPr>
+            <w:tcW w:w="3218" w:type="dxa"/>
+            <w:tcBorders>
+              <w:start w:val="single" w:sz="4" w:space="0" w:color="000000"/>
+              <w:bottom w:val="single" w:sz="4" w:space="0" w:color="000000"/>
+            </w:tcBorders>
+          </w:tcPr>
+          <w:p>
+            <w:pPr>
+              <w:pStyle w:val="Contenudetableau"/>
+              <w:bidi w:val="0"/>
+              <w:jc w:val="start"/>
+              <w:rPr/>
+            </w:pPr>
+            <w:r>
+              <w:rPr/>
+              <w:t>Clic sur le tableau de sa liste</w:t>
+            </w:r>
+          </w:p>
+        </w:tc>
+        <w:tc>
+          <w:tcPr>
+            <w:tcW w:w="3212" w:type="dxa"/>
+            <w:tcBorders>
+              <w:start w:val="single" w:sz="4" w:space="0" w:color="000000"/>
+              <w:bottom w:val="single" w:sz="4" w:space="0" w:color="000000"/>
+              <w:end w:val="single" w:sz="4" w:space="0" w:color="000000"/>
+            </w:tcBorders>
+          </w:tcPr>
+          <w:p>
+            <w:pPr>
+              <w:pStyle w:val="Contenudetableau"/>
+              <w:bidi w:val="0"/>
+              <w:jc w:val="start"/>
+              <w:rPr/>
+            </w:pPr>
+            <w:r>
+              <w:rPr/>
+              <w:t>Affichage du tableau ainsi que ses listes et cartes associées et retour http 200</w:t>
+            </w:r>
+          </w:p>
+        </w:tc>
+      </w:tr>
+      <w:tr>
+        <w:trPr/>
+        <w:tc>
+          <w:tcPr>
+            <w:tcW w:w="3229" w:type="dxa"/>
+            <w:tcBorders>
+              <w:start w:val="single" w:sz="4" w:space="0" w:color="000000"/>
+              <w:bottom w:val="single" w:sz="4" w:space="0" w:color="000000"/>
+            </w:tcBorders>
+          </w:tcPr>
+          <w:p>
+            <w:pPr>
+              <w:pStyle w:val="Contenudetableau"/>
+              <w:bidi w:val="0"/>
+              <w:jc w:val="start"/>
+              <w:rPr/>
+            </w:pPr>
+            <w:r>
+              <w:rPr/>
+              <w:t>Accès aux logs du tableau</w:t>
+            </w:r>
+          </w:p>
+        </w:tc>
+        <w:tc>
+          <w:tcPr>
+            <w:tcW w:w="3218" w:type="dxa"/>
+            <w:tcBorders>
+              <w:start w:val="single" w:sz="4" w:space="0" w:color="000000"/>
+              <w:bottom w:val="single" w:sz="4" w:space="0" w:color="000000"/>
+            </w:tcBorders>
+          </w:tcPr>
+          <w:p>
+            <w:pPr>
+              <w:pStyle w:val="Contenudetableau"/>
+              <w:bidi w:val="0"/>
+              <w:jc w:val="start"/>
+              <w:rPr/>
+            </w:pPr>
+            <w:r>
+              <w:rPr/>
+              <w:t>Clic sur le bouton Logs</w:t>
+            </w:r>
+          </w:p>
+        </w:tc>
+        <w:tc>
+          <w:tcPr>
+            <w:tcW w:w="3212" w:type="dxa"/>
+            <w:tcBorders>
+              <w:start w:val="single" w:sz="4" w:space="0" w:color="000000"/>
+              <w:bottom w:val="single" w:sz="4" w:space="0" w:color="000000"/>
+              <w:end w:val="single" w:sz="4" w:space="0" w:color="000000"/>
+            </w:tcBorders>
+          </w:tcPr>
+          <w:p>
+            <w:pPr>
+              <w:pStyle w:val="Contenudetableau"/>
+              <w:bidi w:val="0"/>
+              <w:jc w:val="start"/>
+              <w:rPr/>
+            </w:pPr>
+            <w:r>
+              <w:rPr/>
+              <w:t xml:space="preserve">Affichage des logs du tableau </w:t>
+            </w:r>
+          </w:p>
+        </w:tc>
+      </w:tr>
+    </w:tbl>
+    <w:p>
+      <w:pPr>
+        <w:pStyle w:val="Normal"/>
+        <w:bidi w:val="0"/>
+        <w:jc w:val="start"/>
+        <w:rPr/>
+      </w:pPr>
+      <w:r>
+        <w:rPr/>
+      </w:r>
+    </w:p>
+    <w:p>
+      <w:pPr>
+        <w:pStyle w:val="Normal"/>
+        <w:bidi w:val="0"/>
+        <w:jc w:val="start"/>
+        <w:rPr/>
+      </w:pPr>
+      <w:r>
+        <w:rPr/>
+        <w:t>Affichage liste des logs (admin)</w:t>
       </w:r>
     </w:p>
     <w:tbl>
@@ -1676,111 +2302,185 @@
             </w:pPr>
             <w:r>
               <w:rPr/>
-            </w:r>
-          </w:p>
-        </w:tc>
-        <w:tc>
-          <w:tcPr>
-            <w:tcW w:w="3213" w:type="dxa"/>
-            <w:tcBorders>
-              <w:start w:val="single" w:sz="4" w:space="0" w:color="000000"/>
-              <w:bottom w:val="single" w:sz="4" w:space="0" w:color="000000"/>
-            </w:tcBorders>
-          </w:tcPr>
-          <w:p>
-            <w:pPr>
-              <w:pStyle w:val="Contenudetableau"/>
-              <w:bidi w:val="0"/>
-              <w:jc w:val="start"/>
-              <w:rPr/>
-            </w:pPr>
-            <w:r>
-              <w:rPr/>
-            </w:r>
-          </w:p>
-        </w:tc>
-        <w:tc>
-          <w:tcPr>
-            <w:tcW w:w="3213" w:type="dxa"/>
-            <w:tcBorders>
-              <w:start w:val="single" w:sz="4" w:space="0" w:color="000000"/>
-              <w:bottom w:val="single" w:sz="4" w:space="0" w:color="000000"/>
-              <w:end w:val="single" w:sz="4" w:space="0" w:color="000000"/>
-            </w:tcBorders>
-          </w:tcPr>
-          <w:p>
-            <w:pPr>
-              <w:pStyle w:val="Contenudetableau"/>
-              <w:bidi w:val="0"/>
-              <w:jc w:val="start"/>
-              <w:rPr/>
-            </w:pPr>
-            <w:r>
-              <w:rPr/>
-            </w:r>
-          </w:p>
-        </w:tc>
-      </w:tr>
-      <w:tr>
-        <w:trPr/>
-        <w:tc>
-          <w:tcPr>
-            <w:tcW w:w="3212" w:type="dxa"/>
-            <w:tcBorders>
-              <w:start w:val="single" w:sz="4" w:space="0" w:color="000000"/>
-              <w:bottom w:val="single" w:sz="4" w:space="0" w:color="000000"/>
-            </w:tcBorders>
-          </w:tcPr>
-          <w:p>
-            <w:pPr>
-              <w:pStyle w:val="Contenudetableau"/>
-              <w:bidi w:val="0"/>
-              <w:jc w:val="start"/>
-              <w:rPr/>
-            </w:pPr>
-            <w:r>
-              <w:rPr/>
-            </w:r>
-          </w:p>
-        </w:tc>
-        <w:tc>
-          <w:tcPr>
-            <w:tcW w:w="3213" w:type="dxa"/>
-            <w:tcBorders>
-              <w:start w:val="single" w:sz="4" w:space="0" w:color="000000"/>
-              <w:bottom w:val="single" w:sz="4" w:space="0" w:color="000000"/>
-            </w:tcBorders>
-          </w:tcPr>
-          <w:p>
-            <w:pPr>
-              <w:pStyle w:val="Contenudetableau"/>
-              <w:bidi w:val="0"/>
-              <w:jc w:val="start"/>
-              <w:rPr/>
-            </w:pPr>
-            <w:r>
-              <w:rPr/>
-            </w:r>
-          </w:p>
-        </w:tc>
-        <w:tc>
-          <w:tcPr>
-            <w:tcW w:w="3213" w:type="dxa"/>
-            <w:tcBorders>
-              <w:start w:val="single" w:sz="4" w:space="0" w:color="000000"/>
-              <w:bottom w:val="single" w:sz="4" w:space="0" w:color="000000"/>
-              <w:end w:val="single" w:sz="4" w:space="0" w:color="000000"/>
-            </w:tcBorders>
-          </w:tcPr>
-          <w:p>
-            <w:pPr>
-              <w:pStyle w:val="Contenudetableau"/>
-              <w:bidi w:val="0"/>
-              <w:jc w:val="start"/>
-              <w:rPr/>
-            </w:pPr>
-            <w:r>
-              <w:rPr/>
+              <w:t>Connexion bosswaza</w:t>
+            </w:r>
+          </w:p>
+        </w:tc>
+        <w:tc>
+          <w:tcPr>
+            <w:tcW w:w="3213" w:type="dxa"/>
+            <w:tcBorders>
+              <w:start w:val="single" w:sz="4" w:space="0" w:color="000000"/>
+              <w:bottom w:val="single" w:sz="4" w:space="0" w:color="000000"/>
+            </w:tcBorders>
+          </w:tcPr>
+          <w:p>
+            <w:pPr>
+              <w:pStyle w:val="Contenudetableau"/>
+              <w:bidi w:val="0"/>
+              <w:jc w:val="start"/>
+              <w:rPr/>
+            </w:pPr>
+            <w:r>
+              <w:rPr/>
+              <w:t>Connexion</w:t>
+            </w:r>
+          </w:p>
+        </w:tc>
+        <w:tc>
+          <w:tcPr>
+            <w:tcW w:w="3213" w:type="dxa"/>
+            <w:tcBorders>
+              <w:start w:val="single" w:sz="4" w:space="0" w:color="000000"/>
+              <w:bottom w:val="single" w:sz="4" w:space="0" w:color="000000"/>
+              <w:end w:val="single" w:sz="4" w:space="0" w:color="000000"/>
+            </w:tcBorders>
+          </w:tcPr>
+          <w:p>
+            <w:pPr>
+              <w:pStyle w:val="Contenudetableau"/>
+              <w:bidi w:val="0"/>
+              <w:jc w:val="start"/>
+              <w:rPr/>
+            </w:pPr>
+            <w:r>
+              <w:rPr/>
+              <w:t>Identifiants corrects, création token (stocké localement) et retour http 200</w:t>
+            </w:r>
+          </w:p>
+        </w:tc>
+      </w:tr>
+      <w:tr>
+        <w:trPr/>
+        <w:tc>
+          <w:tcPr>
+            <w:tcW w:w="3212" w:type="dxa"/>
+            <w:tcBorders>
+              <w:start w:val="single" w:sz="4" w:space="0" w:color="000000"/>
+              <w:bottom w:val="single" w:sz="4" w:space="0" w:color="000000"/>
+            </w:tcBorders>
+          </w:tcPr>
+          <w:p>
+            <w:pPr>
+              <w:pStyle w:val="Contenudetableau"/>
+              <w:bidi w:val="0"/>
+              <w:jc w:val="start"/>
+              <w:rPr/>
+            </w:pPr>
+            <w:r>
+              <w:rPr/>
+              <w:t>Accès à la page</w:t>
+            </w:r>
+          </w:p>
+        </w:tc>
+        <w:tc>
+          <w:tcPr>
+            <w:tcW w:w="3213" w:type="dxa"/>
+            <w:tcBorders>
+              <w:start w:val="single" w:sz="4" w:space="0" w:color="000000"/>
+              <w:bottom w:val="single" w:sz="4" w:space="0" w:color="000000"/>
+            </w:tcBorders>
+          </w:tcPr>
+          <w:p>
+            <w:pPr>
+              <w:pStyle w:val="Contenudetableau"/>
+              <w:widowControl w:val="false"/>
+              <w:suppressLineNumbers/>
+              <w:bidi w:val="0"/>
+              <w:jc w:val="start"/>
+              <w:rPr/>
+            </w:pPr>
+            <w:r>
+              <w:rPr/>
+            </w:r>
+          </w:p>
+        </w:tc>
+        <w:tc>
+          <w:tcPr>
+            <w:tcW w:w="3213" w:type="dxa"/>
+            <w:tcBorders>
+              <w:start w:val="single" w:sz="4" w:space="0" w:color="000000"/>
+              <w:bottom w:val="single" w:sz="4" w:space="0" w:color="000000"/>
+              <w:end w:val="single" w:sz="4" w:space="0" w:color="000000"/>
+            </w:tcBorders>
+          </w:tcPr>
+          <w:p>
+            <w:pPr>
+              <w:pStyle w:val="Contenudetableau"/>
+              <w:bidi w:val="0"/>
+              <w:jc w:val="start"/>
+              <w:rPr/>
+            </w:pPr>
+            <w:r>
+              <w:rPr/>
+              <w:t>Affichage de tous les tableaux et retour http 200</w:t>
+            </w:r>
+          </w:p>
+        </w:tc>
+      </w:tr>
+      <w:tr>
+        <w:trPr/>
+        <w:tc>
+          <w:tcPr>
+            <w:tcW w:w="3212" w:type="dxa"/>
+            <w:tcBorders>
+              <w:start w:val="single" w:sz="4" w:space="0" w:color="000000"/>
+              <w:bottom w:val="single" w:sz="4" w:space="0" w:color="000000"/>
+            </w:tcBorders>
+          </w:tcPr>
+          <w:p>
+            <w:pPr>
+              <w:pStyle w:val="Contenudetableau"/>
+              <w:bidi w:val="0"/>
+              <w:jc w:val="start"/>
+              <w:rPr/>
+            </w:pPr>
+            <w:r>
+              <w:rPr/>
+              <w:t>Accès à la liste des logs</w:t>
+            </w:r>
+          </w:p>
+        </w:tc>
+        <w:tc>
+          <w:tcPr>
+            <w:tcW w:w="3213" w:type="dxa"/>
+            <w:tcBorders>
+              <w:start w:val="single" w:sz="4" w:space="0" w:color="000000"/>
+              <w:bottom w:val="single" w:sz="4" w:space="0" w:color="000000"/>
+            </w:tcBorders>
+          </w:tcPr>
+          <w:p>
+            <w:pPr>
+              <w:pStyle w:val="Contenudetableau"/>
+              <w:bidi w:val="0"/>
+              <w:jc w:val="start"/>
+              <w:rPr/>
+            </w:pPr>
+            <w:r>
+              <w:rPr/>
+              <w:t>Clic sur le bouton Logs</w:t>
+            </w:r>
+          </w:p>
+        </w:tc>
+        <w:tc>
+          <w:tcPr>
+            <w:tcW w:w="3213" w:type="dxa"/>
+            <w:tcBorders>
+              <w:start w:val="single" w:sz="4" w:space="0" w:color="000000"/>
+              <w:bottom w:val="single" w:sz="4" w:space="0" w:color="000000"/>
+              <w:end w:val="single" w:sz="4" w:space="0" w:color="000000"/>
+            </w:tcBorders>
+          </w:tcPr>
+          <w:p>
+            <w:pPr>
+              <w:pStyle w:val="Contenudetableau"/>
+              <w:bidi w:val="0"/>
+              <w:jc w:val="start"/>
+              <w:rPr/>
+            </w:pPr>
+            <w:r>
+              <w:rPr/>
+              <w:t>Affichage de tous les logs et retour http 200</w:t>
             </w:r>
           </w:p>
         </w:tc>
@@ -1806,7 +2506,117 @@
       </w:pPr>
       <w:r>
         <w:rPr/>
-        <w:t>Affichage liste des logs (admin)</w:t>
+      </w:r>
+    </w:p>
+    <w:p>
+      <w:pPr>
+        <w:pStyle w:val="Normal"/>
+        <w:bidi w:val="0"/>
+        <w:jc w:val="start"/>
+        <w:rPr/>
+      </w:pPr>
+      <w:r>
+        <w:rPr/>
+      </w:r>
+    </w:p>
+    <w:p>
+      <w:pPr>
+        <w:pStyle w:val="Normal"/>
+        <w:bidi w:val="0"/>
+        <w:jc w:val="start"/>
+        <w:rPr/>
+      </w:pPr>
+      <w:r>
+        <w:rPr/>
+      </w:r>
+    </w:p>
+    <w:p>
+      <w:pPr>
+        <w:pStyle w:val="Normal"/>
+        <w:bidi w:val="0"/>
+        <w:jc w:val="start"/>
+        <w:rPr/>
+      </w:pPr>
+      <w:r>
+        <w:rPr/>
+      </w:r>
+    </w:p>
+    <w:p>
+      <w:pPr>
+        <w:pStyle w:val="Normal"/>
+        <w:bidi w:val="0"/>
+        <w:jc w:val="start"/>
+        <w:rPr/>
+      </w:pPr>
+      <w:r>
+        <w:rPr/>
+      </w:r>
+    </w:p>
+    <w:p>
+      <w:pPr>
+        <w:pStyle w:val="Normal"/>
+        <w:bidi w:val="0"/>
+        <w:jc w:val="start"/>
+        <w:rPr/>
+      </w:pPr>
+      <w:r>
+        <w:rPr/>
+      </w:r>
+    </w:p>
+    <w:p>
+      <w:pPr>
+        <w:pStyle w:val="Normal"/>
+        <w:bidi w:val="0"/>
+        <w:jc w:val="start"/>
+        <w:rPr/>
+      </w:pPr>
+      <w:r>
+        <w:rPr/>
+      </w:r>
+    </w:p>
+    <w:p>
+      <w:pPr>
+        <w:pStyle w:val="Normal"/>
+        <w:bidi w:val="0"/>
+        <w:jc w:val="start"/>
+        <w:rPr/>
+      </w:pPr>
+      <w:r>
+        <w:rPr/>
+      </w:r>
+    </w:p>
+    <w:p>
+      <w:pPr>
+        <w:pStyle w:val="Normal"/>
+        <w:bidi w:val="0"/>
+        <w:jc w:val="start"/>
+        <w:rPr/>
+      </w:pPr>
+      <w:r>
+        <w:rPr/>
+      </w:r>
+    </w:p>
+    <w:p>
+      <w:pPr>
+        <w:pStyle w:val="Normal"/>
+        <w:bidi w:val="0"/>
+        <w:jc w:val="start"/>
+        <w:rPr/>
+      </w:pPr>
+      <w:r>
+        <w:rPr/>
+      </w:r>
+    </w:p>
+    <w:p>
+      <w:pPr>
+        <w:pStyle w:val="Normal"/>
+        <w:bidi w:val="0"/>
+        <w:jc w:val="start"/>
+        <w:rPr/>
+      </w:pPr>
+      <w:r>
+        <w:rPr/>
+        <w:t>Affichage des informations du compte</w:t>
       </w:r>
     </w:p>
     <w:tbl>
@@ -1916,111 +2726,185 @@
             </w:pPr>
             <w:r>
               <w:rPr/>
-            </w:r>
-          </w:p>
-        </w:tc>
-        <w:tc>
-          <w:tcPr>
-            <w:tcW w:w="3213" w:type="dxa"/>
-            <w:tcBorders>
-              <w:start w:val="single" w:sz="4" w:space="0" w:color="000000"/>
-              <w:bottom w:val="single" w:sz="4" w:space="0" w:color="000000"/>
-            </w:tcBorders>
-          </w:tcPr>
-          <w:p>
-            <w:pPr>
-              <w:pStyle w:val="Contenudetableau"/>
-              <w:bidi w:val="0"/>
-              <w:jc w:val="start"/>
-              <w:rPr/>
-            </w:pPr>
-            <w:r>
-              <w:rPr/>
-            </w:r>
-          </w:p>
-        </w:tc>
-        <w:tc>
-          <w:tcPr>
-            <w:tcW w:w="3213" w:type="dxa"/>
-            <w:tcBorders>
-              <w:start w:val="single" w:sz="4" w:space="0" w:color="000000"/>
-              <w:bottom w:val="single" w:sz="4" w:space="0" w:color="000000"/>
-              <w:end w:val="single" w:sz="4" w:space="0" w:color="000000"/>
-            </w:tcBorders>
-          </w:tcPr>
-          <w:p>
-            <w:pPr>
-              <w:pStyle w:val="Contenudetableau"/>
-              <w:bidi w:val="0"/>
-              <w:jc w:val="start"/>
-              <w:rPr/>
-            </w:pPr>
-            <w:r>
-              <w:rPr/>
-            </w:r>
-          </w:p>
-        </w:tc>
-      </w:tr>
-      <w:tr>
-        <w:trPr/>
-        <w:tc>
-          <w:tcPr>
-            <w:tcW w:w="3212" w:type="dxa"/>
-            <w:tcBorders>
-              <w:start w:val="single" w:sz="4" w:space="0" w:color="000000"/>
-              <w:bottom w:val="single" w:sz="4" w:space="0" w:color="000000"/>
-            </w:tcBorders>
-          </w:tcPr>
-          <w:p>
-            <w:pPr>
-              <w:pStyle w:val="Contenudetableau"/>
-              <w:bidi w:val="0"/>
-              <w:jc w:val="start"/>
-              <w:rPr/>
-            </w:pPr>
-            <w:r>
-              <w:rPr/>
-            </w:r>
-          </w:p>
-        </w:tc>
-        <w:tc>
-          <w:tcPr>
-            <w:tcW w:w="3213" w:type="dxa"/>
-            <w:tcBorders>
-              <w:start w:val="single" w:sz="4" w:space="0" w:color="000000"/>
-              <w:bottom w:val="single" w:sz="4" w:space="0" w:color="000000"/>
-            </w:tcBorders>
-          </w:tcPr>
-          <w:p>
-            <w:pPr>
-              <w:pStyle w:val="Contenudetableau"/>
-              <w:bidi w:val="0"/>
-              <w:jc w:val="start"/>
-              <w:rPr/>
-            </w:pPr>
-            <w:r>
-              <w:rPr/>
-            </w:r>
-          </w:p>
-        </w:tc>
-        <w:tc>
-          <w:tcPr>
-            <w:tcW w:w="3213" w:type="dxa"/>
-            <w:tcBorders>
-              <w:start w:val="single" w:sz="4" w:space="0" w:color="000000"/>
-              <w:bottom w:val="single" w:sz="4" w:space="0" w:color="000000"/>
-              <w:end w:val="single" w:sz="4" w:space="0" w:color="000000"/>
-            </w:tcBorders>
-          </w:tcPr>
-          <w:p>
-            <w:pPr>
-              <w:pStyle w:val="Contenudetableau"/>
-              <w:bidi w:val="0"/>
-              <w:jc w:val="start"/>
-              <w:rPr/>
-            </w:pPr>
-            <w:r>
-              <w:rPr/>
+              <w:t>Connexion bosswaza</w:t>
+            </w:r>
+          </w:p>
+        </w:tc>
+        <w:tc>
+          <w:tcPr>
+            <w:tcW w:w="3213" w:type="dxa"/>
+            <w:tcBorders>
+              <w:start w:val="single" w:sz="4" w:space="0" w:color="000000"/>
+              <w:bottom w:val="single" w:sz="4" w:space="0" w:color="000000"/>
+            </w:tcBorders>
+          </w:tcPr>
+          <w:p>
+            <w:pPr>
+              <w:pStyle w:val="Contenudetableau"/>
+              <w:bidi w:val="0"/>
+              <w:jc w:val="start"/>
+              <w:rPr/>
+            </w:pPr>
+            <w:r>
+              <w:rPr/>
+              <w:t>Connexion</w:t>
+            </w:r>
+          </w:p>
+        </w:tc>
+        <w:tc>
+          <w:tcPr>
+            <w:tcW w:w="3213" w:type="dxa"/>
+            <w:tcBorders>
+              <w:start w:val="single" w:sz="4" w:space="0" w:color="000000"/>
+              <w:bottom w:val="single" w:sz="4" w:space="0" w:color="000000"/>
+              <w:end w:val="single" w:sz="4" w:space="0" w:color="000000"/>
+            </w:tcBorders>
+          </w:tcPr>
+          <w:p>
+            <w:pPr>
+              <w:pStyle w:val="Contenudetableau"/>
+              <w:bidi w:val="0"/>
+              <w:jc w:val="start"/>
+              <w:rPr/>
+            </w:pPr>
+            <w:r>
+              <w:rPr/>
+              <w:t>Identifiants corrects, création token (stocké localement) et retour http 200</w:t>
+            </w:r>
+          </w:p>
+        </w:tc>
+      </w:tr>
+      <w:tr>
+        <w:trPr/>
+        <w:tc>
+          <w:tcPr>
+            <w:tcW w:w="3212" w:type="dxa"/>
+            <w:tcBorders>
+              <w:start w:val="single" w:sz="4" w:space="0" w:color="000000"/>
+              <w:bottom w:val="single" w:sz="4" w:space="0" w:color="000000"/>
+            </w:tcBorders>
+          </w:tcPr>
+          <w:p>
+            <w:pPr>
+              <w:pStyle w:val="Contenudetableau"/>
+              <w:bidi w:val="0"/>
+              <w:jc w:val="start"/>
+              <w:rPr/>
+            </w:pPr>
+            <w:r>
+              <w:rPr/>
+              <w:t>Accès à la page</w:t>
+            </w:r>
+          </w:p>
+        </w:tc>
+        <w:tc>
+          <w:tcPr>
+            <w:tcW w:w="3213" w:type="dxa"/>
+            <w:tcBorders>
+              <w:start w:val="single" w:sz="4" w:space="0" w:color="000000"/>
+              <w:bottom w:val="single" w:sz="4" w:space="0" w:color="000000"/>
+            </w:tcBorders>
+          </w:tcPr>
+          <w:p>
+            <w:pPr>
+              <w:pStyle w:val="Contenudetableau"/>
+              <w:widowControl w:val="false"/>
+              <w:suppressLineNumbers/>
+              <w:bidi w:val="0"/>
+              <w:jc w:val="start"/>
+              <w:rPr/>
+            </w:pPr>
+            <w:r>
+              <w:rPr/>
+            </w:r>
+          </w:p>
+        </w:tc>
+        <w:tc>
+          <w:tcPr>
+            <w:tcW w:w="3213" w:type="dxa"/>
+            <w:tcBorders>
+              <w:start w:val="single" w:sz="4" w:space="0" w:color="000000"/>
+              <w:bottom w:val="single" w:sz="4" w:space="0" w:color="000000"/>
+              <w:end w:val="single" w:sz="4" w:space="0" w:color="000000"/>
+            </w:tcBorders>
+          </w:tcPr>
+          <w:p>
+            <w:pPr>
+              <w:pStyle w:val="Contenudetableau"/>
+              <w:bidi w:val="0"/>
+              <w:jc w:val="start"/>
+              <w:rPr/>
+            </w:pPr>
+            <w:r>
+              <w:rPr/>
+              <w:t>Affichage de tous les tableaux et retour http 200</w:t>
+            </w:r>
+          </w:p>
+        </w:tc>
+      </w:tr>
+      <w:tr>
+        <w:trPr/>
+        <w:tc>
+          <w:tcPr>
+            <w:tcW w:w="3212" w:type="dxa"/>
+            <w:tcBorders>
+              <w:start w:val="single" w:sz="4" w:space="0" w:color="000000"/>
+              <w:bottom w:val="single" w:sz="4" w:space="0" w:color="000000"/>
+            </w:tcBorders>
+          </w:tcPr>
+          <w:p>
+            <w:pPr>
+              <w:pStyle w:val="Contenudetableau"/>
+              <w:bidi w:val="0"/>
+              <w:jc w:val="start"/>
+              <w:rPr/>
+            </w:pPr>
+            <w:r>
+              <w:rPr/>
+              <w:t>Accès à la page de compte</w:t>
+            </w:r>
+          </w:p>
+        </w:tc>
+        <w:tc>
+          <w:tcPr>
+            <w:tcW w:w="3213" w:type="dxa"/>
+            <w:tcBorders>
+              <w:start w:val="single" w:sz="4" w:space="0" w:color="000000"/>
+              <w:bottom w:val="single" w:sz="4" w:space="0" w:color="000000"/>
+            </w:tcBorders>
+          </w:tcPr>
+          <w:p>
+            <w:pPr>
+              <w:pStyle w:val="Contenudetableau"/>
+              <w:bidi w:val="0"/>
+              <w:jc w:val="start"/>
+              <w:rPr/>
+            </w:pPr>
+            <w:r>
+              <w:rPr/>
+              <w:t>Clic sur le bouton Mon compte</w:t>
+            </w:r>
+          </w:p>
+        </w:tc>
+        <w:tc>
+          <w:tcPr>
+            <w:tcW w:w="3213" w:type="dxa"/>
+            <w:tcBorders>
+              <w:start w:val="single" w:sz="4" w:space="0" w:color="000000"/>
+              <w:bottom w:val="single" w:sz="4" w:space="0" w:color="000000"/>
+              <w:end w:val="single" w:sz="4" w:space="0" w:color="000000"/>
+            </w:tcBorders>
+          </w:tcPr>
+          <w:p>
+            <w:pPr>
+              <w:pStyle w:val="Contenudetableau"/>
+              <w:bidi w:val="0"/>
+              <w:jc w:val="start"/>
+              <w:rPr/>
+            </w:pPr>
+            <w:r>
+              <w:rPr/>
+              <w:t>Affichage des informations du compte + Liste des logs récents (admin) + Liste des tableaux récents (admin) + Statistiques (admin)</w:t>
             </w:r>
           </w:p>
         </w:tc>
@@ -2046,7 +2930,7 @@
       </w:pPr>
       <w:r>
         <w:rPr/>
-        <w:t>Affichage des informations du compte</w:t>
+        <w:t>Affichage des statistiques (admin)</w:t>
       </w:r>
     </w:p>
     <w:tbl>
@@ -2156,111 +3040,252 @@
             </w:pPr>
             <w:r>
               <w:rPr/>
-            </w:r>
-          </w:p>
-        </w:tc>
-        <w:tc>
-          <w:tcPr>
-            <w:tcW w:w="3213" w:type="dxa"/>
-            <w:tcBorders>
-              <w:start w:val="single" w:sz="4" w:space="0" w:color="000000"/>
-              <w:bottom w:val="single" w:sz="4" w:space="0" w:color="000000"/>
-            </w:tcBorders>
-          </w:tcPr>
-          <w:p>
-            <w:pPr>
-              <w:pStyle w:val="Contenudetableau"/>
-              <w:bidi w:val="0"/>
-              <w:jc w:val="start"/>
-              <w:rPr/>
-            </w:pPr>
-            <w:r>
-              <w:rPr/>
-            </w:r>
-          </w:p>
-        </w:tc>
-        <w:tc>
-          <w:tcPr>
-            <w:tcW w:w="3213" w:type="dxa"/>
-            <w:tcBorders>
-              <w:start w:val="single" w:sz="4" w:space="0" w:color="000000"/>
-              <w:bottom w:val="single" w:sz="4" w:space="0" w:color="000000"/>
-              <w:end w:val="single" w:sz="4" w:space="0" w:color="000000"/>
-            </w:tcBorders>
-          </w:tcPr>
-          <w:p>
-            <w:pPr>
-              <w:pStyle w:val="Contenudetableau"/>
-              <w:bidi w:val="0"/>
-              <w:jc w:val="start"/>
-              <w:rPr/>
-            </w:pPr>
-            <w:r>
-              <w:rPr/>
-            </w:r>
-          </w:p>
-        </w:tc>
-      </w:tr>
-      <w:tr>
-        <w:trPr/>
-        <w:tc>
-          <w:tcPr>
-            <w:tcW w:w="3212" w:type="dxa"/>
-            <w:tcBorders>
-              <w:start w:val="single" w:sz="4" w:space="0" w:color="000000"/>
-              <w:bottom w:val="single" w:sz="4" w:space="0" w:color="000000"/>
-            </w:tcBorders>
-          </w:tcPr>
-          <w:p>
-            <w:pPr>
-              <w:pStyle w:val="Contenudetableau"/>
-              <w:bidi w:val="0"/>
-              <w:jc w:val="start"/>
-              <w:rPr/>
-            </w:pPr>
-            <w:r>
-              <w:rPr/>
-            </w:r>
-          </w:p>
-        </w:tc>
-        <w:tc>
-          <w:tcPr>
-            <w:tcW w:w="3213" w:type="dxa"/>
-            <w:tcBorders>
-              <w:start w:val="single" w:sz="4" w:space="0" w:color="000000"/>
-              <w:bottom w:val="single" w:sz="4" w:space="0" w:color="000000"/>
-            </w:tcBorders>
-          </w:tcPr>
-          <w:p>
-            <w:pPr>
-              <w:pStyle w:val="Contenudetableau"/>
-              <w:bidi w:val="0"/>
-              <w:jc w:val="start"/>
-              <w:rPr/>
-            </w:pPr>
-            <w:r>
-              <w:rPr/>
-            </w:r>
-          </w:p>
-        </w:tc>
-        <w:tc>
-          <w:tcPr>
-            <w:tcW w:w="3213" w:type="dxa"/>
-            <w:tcBorders>
-              <w:start w:val="single" w:sz="4" w:space="0" w:color="000000"/>
-              <w:bottom w:val="single" w:sz="4" w:space="0" w:color="000000"/>
-              <w:end w:val="single" w:sz="4" w:space="0" w:color="000000"/>
-            </w:tcBorders>
-          </w:tcPr>
-          <w:p>
-            <w:pPr>
-              <w:pStyle w:val="Contenudetableau"/>
-              <w:bidi w:val="0"/>
-              <w:jc w:val="start"/>
-              <w:rPr/>
-            </w:pPr>
-            <w:r>
-              <w:rPr/>
+              <w:t>Connexion bosswaza</w:t>
+            </w:r>
+          </w:p>
+        </w:tc>
+        <w:tc>
+          <w:tcPr>
+            <w:tcW w:w="3213" w:type="dxa"/>
+            <w:tcBorders>
+              <w:start w:val="single" w:sz="4" w:space="0" w:color="000000"/>
+              <w:bottom w:val="single" w:sz="4" w:space="0" w:color="000000"/>
+            </w:tcBorders>
+          </w:tcPr>
+          <w:p>
+            <w:pPr>
+              <w:pStyle w:val="Contenudetableau"/>
+              <w:bidi w:val="0"/>
+              <w:jc w:val="start"/>
+              <w:rPr/>
+            </w:pPr>
+            <w:r>
+              <w:rPr/>
+              <w:t>Connexion</w:t>
+            </w:r>
+          </w:p>
+        </w:tc>
+        <w:tc>
+          <w:tcPr>
+            <w:tcW w:w="3213" w:type="dxa"/>
+            <w:tcBorders>
+              <w:start w:val="single" w:sz="4" w:space="0" w:color="000000"/>
+              <w:bottom w:val="single" w:sz="4" w:space="0" w:color="000000"/>
+              <w:end w:val="single" w:sz="4" w:space="0" w:color="000000"/>
+            </w:tcBorders>
+          </w:tcPr>
+          <w:p>
+            <w:pPr>
+              <w:pStyle w:val="Contenudetableau"/>
+              <w:bidi w:val="0"/>
+              <w:jc w:val="start"/>
+              <w:rPr/>
+            </w:pPr>
+            <w:r>
+              <w:rPr/>
+              <w:t>Identifiants corrects, création token (stocké localement) et retour http 200</w:t>
+            </w:r>
+          </w:p>
+        </w:tc>
+      </w:tr>
+      <w:tr>
+        <w:trPr/>
+        <w:tc>
+          <w:tcPr>
+            <w:tcW w:w="3212" w:type="dxa"/>
+            <w:tcBorders>
+              <w:start w:val="single" w:sz="4" w:space="0" w:color="000000"/>
+              <w:bottom w:val="single" w:sz="4" w:space="0" w:color="000000"/>
+            </w:tcBorders>
+          </w:tcPr>
+          <w:p>
+            <w:pPr>
+              <w:pStyle w:val="Contenudetableau"/>
+              <w:bidi w:val="0"/>
+              <w:jc w:val="start"/>
+              <w:rPr/>
+            </w:pPr>
+            <w:r>
+              <w:rPr/>
+              <w:t>Accès à la page</w:t>
+            </w:r>
+          </w:p>
+        </w:tc>
+        <w:tc>
+          <w:tcPr>
+            <w:tcW w:w="3213" w:type="dxa"/>
+            <w:tcBorders>
+              <w:start w:val="single" w:sz="4" w:space="0" w:color="000000"/>
+              <w:bottom w:val="single" w:sz="4" w:space="0" w:color="000000"/>
+            </w:tcBorders>
+          </w:tcPr>
+          <w:p>
+            <w:pPr>
+              <w:pStyle w:val="Contenudetableau"/>
+              <w:widowControl w:val="false"/>
+              <w:suppressLineNumbers/>
+              <w:bidi w:val="0"/>
+              <w:jc w:val="start"/>
+              <w:rPr/>
+            </w:pPr>
+            <w:r>
+              <w:rPr/>
+            </w:r>
+          </w:p>
+        </w:tc>
+        <w:tc>
+          <w:tcPr>
+            <w:tcW w:w="3213" w:type="dxa"/>
+            <w:tcBorders>
+              <w:start w:val="single" w:sz="4" w:space="0" w:color="000000"/>
+              <w:bottom w:val="single" w:sz="4" w:space="0" w:color="000000"/>
+              <w:end w:val="single" w:sz="4" w:space="0" w:color="000000"/>
+            </w:tcBorders>
+          </w:tcPr>
+          <w:p>
+            <w:pPr>
+              <w:pStyle w:val="Contenudetableau"/>
+              <w:bidi w:val="0"/>
+              <w:jc w:val="start"/>
+              <w:rPr/>
+            </w:pPr>
+            <w:r>
+              <w:rPr/>
+              <w:t>Affichage de tous les tableaux et retour http 200</w:t>
+            </w:r>
+          </w:p>
+        </w:tc>
+      </w:tr>
+      <w:tr>
+        <w:trPr/>
+        <w:tc>
+          <w:tcPr>
+            <w:tcW w:w="3212" w:type="dxa"/>
+            <w:tcBorders>
+              <w:start w:val="single" w:sz="4" w:space="0" w:color="000000"/>
+              <w:bottom w:val="single" w:sz="4" w:space="0" w:color="000000"/>
+            </w:tcBorders>
+          </w:tcPr>
+          <w:p>
+            <w:pPr>
+              <w:pStyle w:val="Contenudetableau"/>
+              <w:bidi w:val="0"/>
+              <w:jc w:val="start"/>
+              <w:rPr/>
+            </w:pPr>
+            <w:r>
+              <w:rPr/>
+              <w:t>Accès à la page de compte</w:t>
+            </w:r>
+          </w:p>
+        </w:tc>
+        <w:tc>
+          <w:tcPr>
+            <w:tcW w:w="3213" w:type="dxa"/>
+            <w:tcBorders>
+              <w:start w:val="single" w:sz="4" w:space="0" w:color="000000"/>
+              <w:bottom w:val="single" w:sz="4" w:space="0" w:color="000000"/>
+            </w:tcBorders>
+          </w:tcPr>
+          <w:p>
+            <w:pPr>
+              <w:pStyle w:val="Contenudetableau"/>
+              <w:bidi w:val="0"/>
+              <w:jc w:val="start"/>
+              <w:rPr/>
+            </w:pPr>
+            <w:r>
+              <w:rPr/>
+              <w:t>Clic sur le bouton Mon compte</w:t>
+            </w:r>
+          </w:p>
+        </w:tc>
+        <w:tc>
+          <w:tcPr>
+            <w:tcW w:w="3213" w:type="dxa"/>
+            <w:tcBorders>
+              <w:start w:val="single" w:sz="4" w:space="0" w:color="000000"/>
+              <w:bottom w:val="single" w:sz="4" w:space="0" w:color="000000"/>
+              <w:end w:val="single" w:sz="4" w:space="0" w:color="000000"/>
+            </w:tcBorders>
+          </w:tcPr>
+          <w:p>
+            <w:pPr>
+              <w:pStyle w:val="Contenudetableau"/>
+              <w:bidi w:val="0"/>
+              <w:jc w:val="start"/>
+              <w:rPr/>
+            </w:pPr>
+            <w:r>
+              <w:rPr/>
+              <w:t>Affichage des informations du compte + Liste des logs récents (admin) + Liste des tableaux récents (admin) + Statistiques (admin)</w:t>
+            </w:r>
+          </w:p>
+        </w:tc>
+      </w:tr>
+      <w:tr>
+        <w:trPr/>
+        <w:tc>
+          <w:tcPr>
+            <w:tcW w:w="3212" w:type="dxa"/>
+            <w:tcBorders>
+              <w:start w:val="single" w:sz="4" w:space="0" w:color="000000"/>
+              <w:bottom w:val="single" w:sz="4" w:space="0" w:color="000000"/>
+            </w:tcBorders>
+          </w:tcPr>
+          <w:p>
+            <w:pPr>
+              <w:pStyle w:val="Contenudetableau"/>
+              <w:bidi w:val="0"/>
+              <w:jc w:val="start"/>
+              <w:rPr/>
+            </w:pPr>
+            <w:r>
+              <w:rPr/>
+              <w:t>Accès aux statistiques</w:t>
+            </w:r>
+          </w:p>
+        </w:tc>
+        <w:tc>
+          <w:tcPr>
+            <w:tcW w:w="3213" w:type="dxa"/>
+            <w:tcBorders>
+              <w:start w:val="single" w:sz="4" w:space="0" w:color="000000"/>
+              <w:bottom w:val="single" w:sz="4" w:space="0" w:color="000000"/>
+            </w:tcBorders>
+          </w:tcPr>
+          <w:p>
+            <w:pPr>
+              <w:pStyle w:val="Contenudetableau"/>
+              <w:bidi w:val="0"/>
+              <w:jc w:val="start"/>
+              <w:rPr/>
+            </w:pPr>
+            <w:r>
+              <w:rPr/>
+              <w:t>Clic sur le bouton Statistique</w:t>
+            </w:r>
+          </w:p>
+        </w:tc>
+        <w:tc>
+          <w:tcPr>
+            <w:tcW w:w="3213" w:type="dxa"/>
+            <w:tcBorders>
+              <w:start w:val="single" w:sz="4" w:space="0" w:color="000000"/>
+              <w:bottom w:val="single" w:sz="4" w:space="0" w:color="000000"/>
+              <w:end w:val="single" w:sz="4" w:space="0" w:color="000000"/>
+            </w:tcBorders>
+          </w:tcPr>
+          <w:p>
+            <w:pPr>
+              <w:pStyle w:val="Contenudetableau"/>
+              <w:bidi w:val="0"/>
+              <w:jc w:val="start"/>
+              <w:rPr/>
+            </w:pPr>
+            <w:r>
+              <w:rPr/>
+              <w:t>Affichage des statistiques de l’application</w:t>
             </w:r>
           </w:p>
         </w:tc>
@@ -2286,7 +3311,7 @@
       </w:pPr>
       <w:r>
         <w:rPr/>
-        <w:t>Affichage des statistiques (admin)</w:t>
+        <w:t>Drag and drop (carte dans une même liste)</w:t>
       </w:r>
     </w:p>
     <w:tbl>
@@ -2396,111 +3421,252 @@
             </w:pPr>
             <w:r>
               <w:rPr/>
-            </w:r>
-          </w:p>
-        </w:tc>
-        <w:tc>
-          <w:tcPr>
-            <w:tcW w:w="3213" w:type="dxa"/>
-            <w:tcBorders>
-              <w:start w:val="single" w:sz="4" w:space="0" w:color="000000"/>
-              <w:bottom w:val="single" w:sz="4" w:space="0" w:color="000000"/>
-            </w:tcBorders>
-          </w:tcPr>
-          <w:p>
-            <w:pPr>
-              <w:pStyle w:val="Contenudetableau"/>
-              <w:bidi w:val="0"/>
-              <w:jc w:val="start"/>
-              <w:rPr/>
-            </w:pPr>
-            <w:r>
-              <w:rPr/>
-            </w:r>
-          </w:p>
-        </w:tc>
-        <w:tc>
-          <w:tcPr>
-            <w:tcW w:w="3213" w:type="dxa"/>
-            <w:tcBorders>
-              <w:start w:val="single" w:sz="4" w:space="0" w:color="000000"/>
-              <w:bottom w:val="single" w:sz="4" w:space="0" w:color="000000"/>
-              <w:end w:val="single" w:sz="4" w:space="0" w:color="000000"/>
-            </w:tcBorders>
-          </w:tcPr>
-          <w:p>
-            <w:pPr>
-              <w:pStyle w:val="Contenudetableau"/>
-              <w:bidi w:val="0"/>
-              <w:jc w:val="start"/>
-              <w:rPr/>
-            </w:pPr>
-            <w:r>
-              <w:rPr/>
-            </w:r>
-          </w:p>
-        </w:tc>
-      </w:tr>
-      <w:tr>
-        <w:trPr/>
-        <w:tc>
-          <w:tcPr>
-            <w:tcW w:w="3212" w:type="dxa"/>
-            <w:tcBorders>
-              <w:start w:val="single" w:sz="4" w:space="0" w:color="000000"/>
-              <w:bottom w:val="single" w:sz="4" w:space="0" w:color="000000"/>
-            </w:tcBorders>
-          </w:tcPr>
-          <w:p>
-            <w:pPr>
-              <w:pStyle w:val="Contenudetableau"/>
-              <w:bidi w:val="0"/>
-              <w:jc w:val="start"/>
-              <w:rPr/>
-            </w:pPr>
-            <w:r>
-              <w:rPr/>
-            </w:r>
-          </w:p>
-        </w:tc>
-        <w:tc>
-          <w:tcPr>
-            <w:tcW w:w="3213" w:type="dxa"/>
-            <w:tcBorders>
-              <w:start w:val="single" w:sz="4" w:space="0" w:color="000000"/>
-              <w:bottom w:val="single" w:sz="4" w:space="0" w:color="000000"/>
-            </w:tcBorders>
-          </w:tcPr>
-          <w:p>
-            <w:pPr>
-              <w:pStyle w:val="Contenudetableau"/>
-              <w:bidi w:val="0"/>
-              <w:jc w:val="start"/>
-              <w:rPr/>
-            </w:pPr>
-            <w:r>
-              <w:rPr/>
-            </w:r>
-          </w:p>
-        </w:tc>
-        <w:tc>
-          <w:tcPr>
-            <w:tcW w:w="3213" w:type="dxa"/>
-            <w:tcBorders>
-              <w:start w:val="single" w:sz="4" w:space="0" w:color="000000"/>
-              <w:bottom w:val="single" w:sz="4" w:space="0" w:color="000000"/>
-              <w:end w:val="single" w:sz="4" w:space="0" w:color="000000"/>
-            </w:tcBorders>
-          </w:tcPr>
-          <w:p>
-            <w:pPr>
-              <w:pStyle w:val="Contenudetableau"/>
-              <w:bidi w:val="0"/>
-              <w:jc w:val="start"/>
-              <w:rPr/>
-            </w:pPr>
-            <w:r>
-              <w:rPr/>
+              <w:t>Connexion bosswaza</w:t>
+            </w:r>
+          </w:p>
+        </w:tc>
+        <w:tc>
+          <w:tcPr>
+            <w:tcW w:w="3213" w:type="dxa"/>
+            <w:tcBorders>
+              <w:start w:val="single" w:sz="4" w:space="0" w:color="000000"/>
+              <w:bottom w:val="single" w:sz="4" w:space="0" w:color="000000"/>
+            </w:tcBorders>
+          </w:tcPr>
+          <w:p>
+            <w:pPr>
+              <w:pStyle w:val="Contenudetableau"/>
+              <w:bidi w:val="0"/>
+              <w:jc w:val="start"/>
+              <w:rPr/>
+            </w:pPr>
+            <w:r>
+              <w:rPr/>
+              <w:t>Connexion</w:t>
+            </w:r>
+          </w:p>
+        </w:tc>
+        <w:tc>
+          <w:tcPr>
+            <w:tcW w:w="3213" w:type="dxa"/>
+            <w:tcBorders>
+              <w:start w:val="single" w:sz="4" w:space="0" w:color="000000"/>
+              <w:bottom w:val="single" w:sz="4" w:space="0" w:color="000000"/>
+              <w:end w:val="single" w:sz="4" w:space="0" w:color="000000"/>
+            </w:tcBorders>
+          </w:tcPr>
+          <w:p>
+            <w:pPr>
+              <w:pStyle w:val="Contenudetableau"/>
+              <w:bidi w:val="0"/>
+              <w:jc w:val="start"/>
+              <w:rPr/>
+            </w:pPr>
+            <w:r>
+              <w:rPr/>
+              <w:t>Identifiants corrects, création token (stocké localement) et retour http 200</w:t>
+            </w:r>
+          </w:p>
+        </w:tc>
+      </w:tr>
+      <w:tr>
+        <w:trPr/>
+        <w:tc>
+          <w:tcPr>
+            <w:tcW w:w="3212" w:type="dxa"/>
+            <w:tcBorders>
+              <w:start w:val="single" w:sz="4" w:space="0" w:color="000000"/>
+              <w:bottom w:val="single" w:sz="4" w:space="0" w:color="000000"/>
+            </w:tcBorders>
+          </w:tcPr>
+          <w:p>
+            <w:pPr>
+              <w:pStyle w:val="Contenudetableau"/>
+              <w:bidi w:val="0"/>
+              <w:jc w:val="start"/>
+              <w:rPr/>
+            </w:pPr>
+            <w:r>
+              <w:rPr/>
+              <w:t>Accès à la page</w:t>
+            </w:r>
+          </w:p>
+        </w:tc>
+        <w:tc>
+          <w:tcPr>
+            <w:tcW w:w="3213" w:type="dxa"/>
+            <w:tcBorders>
+              <w:start w:val="single" w:sz="4" w:space="0" w:color="000000"/>
+              <w:bottom w:val="single" w:sz="4" w:space="0" w:color="000000"/>
+            </w:tcBorders>
+          </w:tcPr>
+          <w:p>
+            <w:pPr>
+              <w:pStyle w:val="Contenudetableau"/>
+              <w:widowControl w:val="false"/>
+              <w:suppressLineNumbers/>
+              <w:bidi w:val="0"/>
+              <w:jc w:val="start"/>
+              <w:rPr/>
+            </w:pPr>
+            <w:r>
+              <w:rPr/>
+            </w:r>
+          </w:p>
+        </w:tc>
+        <w:tc>
+          <w:tcPr>
+            <w:tcW w:w="3213" w:type="dxa"/>
+            <w:tcBorders>
+              <w:start w:val="single" w:sz="4" w:space="0" w:color="000000"/>
+              <w:bottom w:val="single" w:sz="4" w:space="0" w:color="000000"/>
+              <w:end w:val="single" w:sz="4" w:space="0" w:color="000000"/>
+            </w:tcBorders>
+          </w:tcPr>
+          <w:p>
+            <w:pPr>
+              <w:pStyle w:val="Contenudetableau"/>
+              <w:bidi w:val="0"/>
+              <w:jc w:val="start"/>
+              <w:rPr/>
+            </w:pPr>
+            <w:r>
+              <w:rPr/>
+              <w:t>Affichage de tous les tableaux et retour http 200</w:t>
+            </w:r>
+          </w:p>
+        </w:tc>
+      </w:tr>
+      <w:tr>
+        <w:trPr/>
+        <w:tc>
+          <w:tcPr>
+            <w:tcW w:w="3212" w:type="dxa"/>
+            <w:tcBorders>
+              <w:start w:val="single" w:sz="4" w:space="0" w:color="000000"/>
+              <w:bottom w:val="single" w:sz="4" w:space="0" w:color="000000"/>
+            </w:tcBorders>
+          </w:tcPr>
+          <w:p>
+            <w:pPr>
+              <w:pStyle w:val="Contenudetableau"/>
+              <w:bidi w:val="0"/>
+              <w:jc w:val="start"/>
+              <w:rPr/>
+            </w:pPr>
+            <w:r>
+              <w:rPr/>
+              <w:t>Accès au tableau d’id tab_roadmap_2026</w:t>
+            </w:r>
+          </w:p>
+        </w:tc>
+        <w:tc>
+          <w:tcPr>
+            <w:tcW w:w="3213" w:type="dxa"/>
+            <w:tcBorders>
+              <w:start w:val="single" w:sz="4" w:space="0" w:color="000000"/>
+              <w:bottom w:val="single" w:sz="4" w:space="0" w:color="000000"/>
+            </w:tcBorders>
+          </w:tcPr>
+          <w:p>
+            <w:pPr>
+              <w:pStyle w:val="Contenudetableau"/>
+              <w:bidi w:val="0"/>
+              <w:jc w:val="start"/>
+              <w:rPr/>
+            </w:pPr>
+            <w:r>
+              <w:rPr/>
+              <w:t>Clic sur le tableau de sa liste</w:t>
+            </w:r>
+          </w:p>
+        </w:tc>
+        <w:tc>
+          <w:tcPr>
+            <w:tcW w:w="3213" w:type="dxa"/>
+            <w:tcBorders>
+              <w:start w:val="single" w:sz="4" w:space="0" w:color="000000"/>
+              <w:bottom w:val="single" w:sz="4" w:space="0" w:color="000000"/>
+              <w:end w:val="single" w:sz="4" w:space="0" w:color="000000"/>
+            </w:tcBorders>
+          </w:tcPr>
+          <w:p>
+            <w:pPr>
+              <w:pStyle w:val="Contenudetableau"/>
+              <w:bidi w:val="0"/>
+              <w:jc w:val="start"/>
+              <w:rPr/>
+            </w:pPr>
+            <w:r>
+              <w:rPr/>
+              <w:t>Affichage du tableau ainsi que ses listes et cartes associées et retour http 200</w:t>
+            </w:r>
+          </w:p>
+        </w:tc>
+      </w:tr>
+      <w:tr>
+        <w:trPr/>
+        <w:tc>
+          <w:tcPr>
+            <w:tcW w:w="3212" w:type="dxa"/>
+            <w:tcBorders>
+              <w:start w:val="single" w:sz="4" w:space="0" w:color="000000"/>
+              <w:bottom w:val="single" w:sz="4" w:space="0" w:color="000000"/>
+            </w:tcBorders>
+          </w:tcPr>
+          <w:p>
+            <w:pPr>
+              <w:pStyle w:val="Contenudetableau"/>
+              <w:bidi w:val="0"/>
+              <w:jc w:val="start"/>
+              <w:rPr/>
+            </w:pPr>
+            <w:r>
+              <w:rPr/>
+              <w:t xml:space="preserve">Passage de la carte d’id en dessous de la carte d’id </w:t>
+            </w:r>
+          </w:p>
+        </w:tc>
+        <w:tc>
+          <w:tcPr>
+            <w:tcW w:w="3213" w:type="dxa"/>
+            <w:tcBorders>
+              <w:start w:val="single" w:sz="4" w:space="0" w:color="000000"/>
+              <w:bottom w:val="single" w:sz="4" w:space="0" w:color="000000"/>
+            </w:tcBorders>
+          </w:tcPr>
+          <w:p>
+            <w:pPr>
+              <w:pStyle w:val="Contenudetableau"/>
+              <w:bidi w:val="0"/>
+              <w:jc w:val="start"/>
+              <w:rPr/>
+            </w:pPr>
+            <w:r>
+              <w:rPr/>
+              <w:t>Déplacement de la carte</w:t>
+            </w:r>
+          </w:p>
+        </w:tc>
+        <w:tc>
+          <w:tcPr>
+            <w:tcW w:w="3213" w:type="dxa"/>
+            <w:tcBorders>
+              <w:start w:val="single" w:sz="4" w:space="0" w:color="000000"/>
+              <w:bottom w:val="single" w:sz="4" w:space="0" w:color="000000"/>
+              <w:end w:val="single" w:sz="4" w:space="0" w:color="000000"/>
+            </w:tcBorders>
+          </w:tcPr>
+          <w:p>
+            <w:pPr>
+              <w:pStyle w:val="Contenudetableau"/>
+              <w:bidi w:val="0"/>
+              <w:jc w:val="start"/>
+              <w:rPr/>
+            </w:pPr>
+            <w:r>
+              <w:rPr/>
+              <w:t>Affichage du nouvel ordre des cartes + retour http 200</w:t>
             </w:r>
           </w:p>
         </w:tc>
@@ -2526,7 +3692,62 @@
       </w:pPr>
       <w:r>
         <w:rPr/>
-        <w:t>Drag and drop (carte dans une même liste)</w:t>
+      </w:r>
+    </w:p>
+    <w:p>
+      <w:pPr>
+        <w:pStyle w:val="Normal"/>
+        <w:bidi w:val="0"/>
+        <w:jc w:val="start"/>
+        <w:rPr/>
+      </w:pPr>
+      <w:r>
+        <w:rPr/>
+      </w:r>
+    </w:p>
+    <w:p>
+      <w:pPr>
+        <w:pStyle w:val="Normal"/>
+        <w:bidi w:val="0"/>
+        <w:jc w:val="start"/>
+        <w:rPr/>
+      </w:pPr>
+      <w:r>
+        <w:rPr/>
+      </w:r>
+    </w:p>
+    <w:p>
+      <w:pPr>
+        <w:pStyle w:val="Normal"/>
+        <w:bidi w:val="0"/>
+        <w:jc w:val="start"/>
+        <w:rPr/>
+      </w:pPr>
+      <w:r>
+        <w:rPr/>
+      </w:r>
+    </w:p>
+    <w:p>
+      <w:pPr>
+        <w:pStyle w:val="Normal"/>
+        <w:bidi w:val="0"/>
+        <w:jc w:val="start"/>
+        <w:rPr/>
+      </w:pPr>
+      <w:r>
+        <w:rPr/>
+      </w:r>
+    </w:p>
+    <w:p>
+      <w:pPr>
+        <w:pStyle w:val="Normal"/>
+        <w:bidi w:val="0"/>
+        <w:jc w:val="start"/>
+        <w:rPr/>
+      </w:pPr>
+      <w:r>
+        <w:rPr/>
+        <w:t>Drag and drop (carte d’une liste à une autre)</w:t>
       </w:r>
     </w:p>
     <w:tbl>
@@ -2636,111 +3857,264 @@
             </w:pPr>
             <w:r>
               <w:rPr/>
-            </w:r>
-          </w:p>
-        </w:tc>
-        <w:tc>
-          <w:tcPr>
-            <w:tcW w:w="3213" w:type="dxa"/>
-            <w:tcBorders>
-              <w:start w:val="single" w:sz="4" w:space="0" w:color="000000"/>
-              <w:bottom w:val="single" w:sz="4" w:space="0" w:color="000000"/>
-            </w:tcBorders>
-          </w:tcPr>
-          <w:p>
-            <w:pPr>
-              <w:pStyle w:val="Contenudetableau"/>
-              <w:bidi w:val="0"/>
-              <w:jc w:val="start"/>
-              <w:rPr/>
-            </w:pPr>
-            <w:r>
-              <w:rPr/>
-            </w:r>
-          </w:p>
-        </w:tc>
-        <w:tc>
-          <w:tcPr>
-            <w:tcW w:w="3213" w:type="dxa"/>
-            <w:tcBorders>
-              <w:start w:val="single" w:sz="4" w:space="0" w:color="000000"/>
-              <w:bottom w:val="single" w:sz="4" w:space="0" w:color="000000"/>
-              <w:end w:val="single" w:sz="4" w:space="0" w:color="000000"/>
-            </w:tcBorders>
-          </w:tcPr>
-          <w:p>
-            <w:pPr>
-              <w:pStyle w:val="Contenudetableau"/>
-              <w:bidi w:val="0"/>
-              <w:jc w:val="start"/>
-              <w:rPr/>
-            </w:pPr>
-            <w:r>
-              <w:rPr/>
-            </w:r>
-          </w:p>
-        </w:tc>
-      </w:tr>
-      <w:tr>
-        <w:trPr/>
-        <w:tc>
-          <w:tcPr>
-            <w:tcW w:w="3212" w:type="dxa"/>
-            <w:tcBorders>
-              <w:start w:val="single" w:sz="4" w:space="0" w:color="000000"/>
-              <w:bottom w:val="single" w:sz="4" w:space="0" w:color="000000"/>
-            </w:tcBorders>
-          </w:tcPr>
-          <w:p>
-            <w:pPr>
-              <w:pStyle w:val="Contenudetableau"/>
-              <w:bidi w:val="0"/>
-              <w:jc w:val="start"/>
-              <w:rPr/>
-            </w:pPr>
-            <w:r>
-              <w:rPr/>
-            </w:r>
-          </w:p>
-        </w:tc>
-        <w:tc>
-          <w:tcPr>
-            <w:tcW w:w="3213" w:type="dxa"/>
-            <w:tcBorders>
-              <w:start w:val="single" w:sz="4" w:space="0" w:color="000000"/>
-              <w:bottom w:val="single" w:sz="4" w:space="0" w:color="000000"/>
-            </w:tcBorders>
-          </w:tcPr>
-          <w:p>
-            <w:pPr>
-              <w:pStyle w:val="Contenudetableau"/>
-              <w:bidi w:val="0"/>
-              <w:jc w:val="start"/>
-              <w:rPr/>
-            </w:pPr>
-            <w:r>
-              <w:rPr/>
-            </w:r>
-          </w:p>
-        </w:tc>
-        <w:tc>
-          <w:tcPr>
-            <w:tcW w:w="3213" w:type="dxa"/>
-            <w:tcBorders>
-              <w:start w:val="single" w:sz="4" w:space="0" w:color="000000"/>
-              <w:bottom w:val="single" w:sz="4" w:space="0" w:color="000000"/>
-              <w:end w:val="single" w:sz="4" w:space="0" w:color="000000"/>
-            </w:tcBorders>
-          </w:tcPr>
-          <w:p>
-            <w:pPr>
-              <w:pStyle w:val="Contenudetableau"/>
-              <w:bidi w:val="0"/>
-              <w:jc w:val="start"/>
-              <w:rPr/>
-            </w:pPr>
-            <w:r>
-              <w:rPr/>
+              <w:t>Connexion bosswaza</w:t>
+            </w:r>
+          </w:p>
+        </w:tc>
+        <w:tc>
+          <w:tcPr>
+            <w:tcW w:w="3213" w:type="dxa"/>
+            <w:tcBorders>
+              <w:start w:val="single" w:sz="4" w:space="0" w:color="000000"/>
+              <w:bottom w:val="single" w:sz="4" w:space="0" w:color="000000"/>
+            </w:tcBorders>
+          </w:tcPr>
+          <w:p>
+            <w:pPr>
+              <w:pStyle w:val="Contenudetableau"/>
+              <w:bidi w:val="0"/>
+              <w:jc w:val="start"/>
+              <w:rPr/>
+            </w:pPr>
+            <w:r>
+              <w:rPr/>
+              <w:t>Connexion</w:t>
+            </w:r>
+          </w:p>
+        </w:tc>
+        <w:tc>
+          <w:tcPr>
+            <w:tcW w:w="3213" w:type="dxa"/>
+            <w:tcBorders>
+              <w:start w:val="single" w:sz="4" w:space="0" w:color="000000"/>
+              <w:bottom w:val="single" w:sz="4" w:space="0" w:color="000000"/>
+              <w:end w:val="single" w:sz="4" w:space="0" w:color="000000"/>
+            </w:tcBorders>
+          </w:tcPr>
+          <w:p>
+            <w:pPr>
+              <w:pStyle w:val="Contenudetableau"/>
+              <w:bidi w:val="0"/>
+              <w:jc w:val="start"/>
+              <w:rPr/>
+            </w:pPr>
+            <w:r>
+              <w:rPr/>
+              <w:t>Identifiants corrects, création token (stocké localement) et retour http 200</w:t>
+            </w:r>
+          </w:p>
+        </w:tc>
+      </w:tr>
+      <w:tr>
+        <w:trPr/>
+        <w:tc>
+          <w:tcPr>
+            <w:tcW w:w="3212" w:type="dxa"/>
+            <w:tcBorders>
+              <w:start w:val="single" w:sz="4" w:space="0" w:color="000000"/>
+              <w:bottom w:val="single" w:sz="4" w:space="0" w:color="000000"/>
+            </w:tcBorders>
+          </w:tcPr>
+          <w:p>
+            <w:pPr>
+              <w:pStyle w:val="Contenudetableau"/>
+              <w:bidi w:val="0"/>
+              <w:jc w:val="start"/>
+              <w:rPr/>
+            </w:pPr>
+            <w:r>
+              <w:rPr/>
+              <w:t>Accès à la page</w:t>
+            </w:r>
+          </w:p>
+        </w:tc>
+        <w:tc>
+          <w:tcPr>
+            <w:tcW w:w="3213" w:type="dxa"/>
+            <w:tcBorders>
+              <w:start w:val="single" w:sz="4" w:space="0" w:color="000000"/>
+              <w:bottom w:val="single" w:sz="4" w:space="0" w:color="000000"/>
+            </w:tcBorders>
+          </w:tcPr>
+          <w:p>
+            <w:pPr>
+              <w:pStyle w:val="Contenudetableau"/>
+              <w:widowControl w:val="false"/>
+              <w:suppressLineNumbers/>
+              <w:bidi w:val="0"/>
+              <w:jc w:val="start"/>
+              <w:rPr/>
+            </w:pPr>
+            <w:r>
+              <w:rPr/>
+            </w:r>
+          </w:p>
+        </w:tc>
+        <w:tc>
+          <w:tcPr>
+            <w:tcW w:w="3213" w:type="dxa"/>
+            <w:tcBorders>
+              <w:start w:val="single" w:sz="4" w:space="0" w:color="000000"/>
+              <w:bottom w:val="single" w:sz="4" w:space="0" w:color="000000"/>
+              <w:end w:val="single" w:sz="4" w:space="0" w:color="000000"/>
+            </w:tcBorders>
+          </w:tcPr>
+          <w:p>
+            <w:pPr>
+              <w:pStyle w:val="Contenudetableau"/>
+              <w:bidi w:val="0"/>
+              <w:jc w:val="start"/>
+              <w:rPr/>
+            </w:pPr>
+            <w:r>
+              <w:rPr/>
+              <w:t>Affichage de tous les tableaux et retour http 200</w:t>
+            </w:r>
+          </w:p>
+        </w:tc>
+      </w:tr>
+      <w:tr>
+        <w:trPr/>
+        <w:tc>
+          <w:tcPr>
+            <w:tcW w:w="3212" w:type="dxa"/>
+            <w:tcBorders>
+              <w:start w:val="single" w:sz="4" w:space="0" w:color="000000"/>
+              <w:bottom w:val="single" w:sz="4" w:space="0" w:color="000000"/>
+            </w:tcBorders>
+          </w:tcPr>
+          <w:p>
+            <w:pPr>
+              <w:pStyle w:val="Contenudetableau"/>
+              <w:bidi w:val="0"/>
+              <w:jc w:val="start"/>
+              <w:rPr/>
+            </w:pPr>
+            <w:r>
+              <w:rPr/>
+              <w:t>Accès au tableau d’id tab_roadmap_2026</w:t>
+            </w:r>
+          </w:p>
+        </w:tc>
+        <w:tc>
+          <w:tcPr>
+            <w:tcW w:w="3213" w:type="dxa"/>
+            <w:tcBorders>
+              <w:start w:val="single" w:sz="4" w:space="0" w:color="000000"/>
+              <w:bottom w:val="single" w:sz="4" w:space="0" w:color="000000"/>
+            </w:tcBorders>
+          </w:tcPr>
+          <w:p>
+            <w:pPr>
+              <w:pStyle w:val="Contenudetableau"/>
+              <w:bidi w:val="0"/>
+              <w:jc w:val="start"/>
+              <w:rPr/>
+            </w:pPr>
+            <w:r>
+              <w:rPr/>
+              <w:t>Clic sur le tableau de sa liste</w:t>
+            </w:r>
+          </w:p>
+        </w:tc>
+        <w:tc>
+          <w:tcPr>
+            <w:tcW w:w="3213" w:type="dxa"/>
+            <w:tcBorders>
+              <w:start w:val="single" w:sz="4" w:space="0" w:color="000000"/>
+              <w:bottom w:val="single" w:sz="4" w:space="0" w:color="000000"/>
+              <w:end w:val="single" w:sz="4" w:space="0" w:color="000000"/>
+            </w:tcBorders>
+          </w:tcPr>
+          <w:p>
+            <w:pPr>
+              <w:pStyle w:val="Contenudetableau"/>
+              <w:bidi w:val="0"/>
+              <w:jc w:val="start"/>
+              <w:rPr/>
+            </w:pPr>
+            <w:r>
+              <w:rPr/>
+              <w:t>Affichage du tableau ainsi que ses listes et cartes associées et retour http 200</w:t>
+            </w:r>
+          </w:p>
+        </w:tc>
+      </w:tr>
+      <w:tr>
+        <w:trPr/>
+        <w:tc>
+          <w:tcPr>
+            <w:tcW w:w="3212" w:type="dxa"/>
+            <w:tcBorders>
+              <w:start w:val="single" w:sz="4" w:space="0" w:color="000000"/>
+              <w:bottom w:val="single" w:sz="4" w:space="0" w:color="000000"/>
+            </w:tcBorders>
+          </w:tcPr>
+          <w:p>
+            <w:pPr>
+              <w:pStyle w:val="Contenudetableau"/>
+              <w:bidi w:val="0"/>
+              <w:jc w:val="start"/>
+              <w:rPr/>
+            </w:pPr>
+            <w:r>
+              <w:rPr/>
+              <w:t xml:space="preserve">Passage de la carte d’id </w:t>
+            </w:r>
+            <w:r>
+              <w:rPr/>
+              <w:t xml:space="preserve">de la liste d’id </w:t>
+            </w:r>
+            <w:r>
+              <w:rPr/>
+              <w:t xml:space="preserve"> en dessous de la carte d’id </w:t>
+            </w:r>
+            <w:r>
+              <w:rPr/>
+              <w:t xml:space="preserve">dans la liste d’id </w:t>
+            </w:r>
+          </w:p>
+        </w:tc>
+        <w:tc>
+          <w:tcPr>
+            <w:tcW w:w="3213" w:type="dxa"/>
+            <w:tcBorders>
+              <w:start w:val="single" w:sz="4" w:space="0" w:color="000000"/>
+              <w:bottom w:val="single" w:sz="4" w:space="0" w:color="000000"/>
+            </w:tcBorders>
+          </w:tcPr>
+          <w:p>
+            <w:pPr>
+              <w:pStyle w:val="Contenudetableau"/>
+              <w:bidi w:val="0"/>
+              <w:jc w:val="start"/>
+              <w:rPr/>
+            </w:pPr>
+            <w:r>
+              <w:rPr/>
+              <w:t>Déplacement de la carte</w:t>
+            </w:r>
+          </w:p>
+        </w:tc>
+        <w:tc>
+          <w:tcPr>
+            <w:tcW w:w="3213" w:type="dxa"/>
+            <w:tcBorders>
+              <w:start w:val="single" w:sz="4" w:space="0" w:color="000000"/>
+              <w:bottom w:val="single" w:sz="4" w:space="0" w:color="000000"/>
+              <w:end w:val="single" w:sz="4" w:space="0" w:color="000000"/>
+            </w:tcBorders>
+          </w:tcPr>
+          <w:p>
+            <w:pPr>
+              <w:pStyle w:val="Contenudetableau"/>
+              <w:bidi w:val="0"/>
+              <w:jc w:val="start"/>
+              <w:rPr/>
+            </w:pPr>
+            <w:r>
+              <w:rPr/>
+              <w:t>Affichage du nouvel ordre des cartes + retour http 200</w:t>
             </w:r>
           </w:p>
         </w:tc>
@@ -2766,7 +4140,7 @@
       </w:pPr>
       <w:r>
         <w:rPr/>
-        <w:t>Drag and drop (carte d’une liste à une autre)</w:t>
+        <w:t>Drag and drop (changement de l’ordre des listes)</w:t>
       </w:r>
     </w:p>
     <w:tbl>
@@ -2876,111 +4250,268 @@
             </w:pPr>
             <w:r>
               <w:rPr/>
-            </w:r>
-          </w:p>
-        </w:tc>
-        <w:tc>
-          <w:tcPr>
-            <w:tcW w:w="3213" w:type="dxa"/>
-            <w:tcBorders>
-              <w:start w:val="single" w:sz="4" w:space="0" w:color="000000"/>
-              <w:bottom w:val="single" w:sz="4" w:space="0" w:color="000000"/>
-            </w:tcBorders>
-          </w:tcPr>
-          <w:p>
-            <w:pPr>
-              <w:pStyle w:val="Contenudetableau"/>
-              <w:bidi w:val="0"/>
-              <w:jc w:val="start"/>
-              <w:rPr/>
-            </w:pPr>
-            <w:r>
-              <w:rPr/>
-            </w:r>
-          </w:p>
-        </w:tc>
-        <w:tc>
-          <w:tcPr>
-            <w:tcW w:w="3213" w:type="dxa"/>
-            <w:tcBorders>
-              <w:start w:val="single" w:sz="4" w:space="0" w:color="000000"/>
-              <w:bottom w:val="single" w:sz="4" w:space="0" w:color="000000"/>
-              <w:end w:val="single" w:sz="4" w:space="0" w:color="000000"/>
-            </w:tcBorders>
-          </w:tcPr>
-          <w:p>
-            <w:pPr>
-              <w:pStyle w:val="Contenudetableau"/>
-              <w:bidi w:val="0"/>
-              <w:jc w:val="start"/>
-              <w:rPr/>
-            </w:pPr>
-            <w:r>
-              <w:rPr/>
-            </w:r>
-          </w:p>
-        </w:tc>
-      </w:tr>
-      <w:tr>
-        <w:trPr/>
-        <w:tc>
-          <w:tcPr>
-            <w:tcW w:w="3212" w:type="dxa"/>
-            <w:tcBorders>
-              <w:start w:val="single" w:sz="4" w:space="0" w:color="000000"/>
-              <w:bottom w:val="single" w:sz="4" w:space="0" w:color="000000"/>
-            </w:tcBorders>
-          </w:tcPr>
-          <w:p>
-            <w:pPr>
-              <w:pStyle w:val="Contenudetableau"/>
-              <w:bidi w:val="0"/>
-              <w:jc w:val="start"/>
-              <w:rPr/>
-            </w:pPr>
-            <w:r>
-              <w:rPr/>
-            </w:r>
-          </w:p>
-        </w:tc>
-        <w:tc>
-          <w:tcPr>
-            <w:tcW w:w="3213" w:type="dxa"/>
-            <w:tcBorders>
-              <w:start w:val="single" w:sz="4" w:space="0" w:color="000000"/>
-              <w:bottom w:val="single" w:sz="4" w:space="0" w:color="000000"/>
-            </w:tcBorders>
-          </w:tcPr>
-          <w:p>
-            <w:pPr>
-              <w:pStyle w:val="Contenudetableau"/>
-              <w:bidi w:val="0"/>
-              <w:jc w:val="start"/>
-              <w:rPr/>
-            </w:pPr>
-            <w:r>
-              <w:rPr/>
-            </w:r>
-          </w:p>
-        </w:tc>
-        <w:tc>
-          <w:tcPr>
-            <w:tcW w:w="3213" w:type="dxa"/>
-            <w:tcBorders>
-              <w:start w:val="single" w:sz="4" w:space="0" w:color="000000"/>
-              <w:bottom w:val="single" w:sz="4" w:space="0" w:color="000000"/>
-              <w:end w:val="single" w:sz="4" w:space="0" w:color="000000"/>
-            </w:tcBorders>
-          </w:tcPr>
-          <w:p>
-            <w:pPr>
-              <w:pStyle w:val="Contenudetableau"/>
-              <w:bidi w:val="0"/>
-              <w:jc w:val="start"/>
-              <w:rPr/>
-            </w:pPr>
-            <w:r>
-              <w:rPr/>
+              <w:t>Connexion bosswaza</w:t>
+            </w:r>
+          </w:p>
+        </w:tc>
+        <w:tc>
+          <w:tcPr>
+            <w:tcW w:w="3213" w:type="dxa"/>
+            <w:tcBorders>
+              <w:start w:val="single" w:sz="4" w:space="0" w:color="000000"/>
+              <w:bottom w:val="single" w:sz="4" w:space="0" w:color="000000"/>
+            </w:tcBorders>
+          </w:tcPr>
+          <w:p>
+            <w:pPr>
+              <w:pStyle w:val="Contenudetableau"/>
+              <w:bidi w:val="0"/>
+              <w:jc w:val="start"/>
+              <w:rPr/>
+            </w:pPr>
+            <w:r>
+              <w:rPr/>
+              <w:t>Connexion</w:t>
+            </w:r>
+          </w:p>
+        </w:tc>
+        <w:tc>
+          <w:tcPr>
+            <w:tcW w:w="3213" w:type="dxa"/>
+            <w:tcBorders>
+              <w:start w:val="single" w:sz="4" w:space="0" w:color="000000"/>
+              <w:bottom w:val="single" w:sz="4" w:space="0" w:color="000000"/>
+              <w:end w:val="single" w:sz="4" w:space="0" w:color="000000"/>
+            </w:tcBorders>
+          </w:tcPr>
+          <w:p>
+            <w:pPr>
+              <w:pStyle w:val="Contenudetableau"/>
+              <w:bidi w:val="0"/>
+              <w:jc w:val="start"/>
+              <w:rPr/>
+            </w:pPr>
+            <w:r>
+              <w:rPr/>
+              <w:t>Identifiants corrects, création token (stocké localement) et retour http 200</w:t>
+            </w:r>
+          </w:p>
+        </w:tc>
+      </w:tr>
+      <w:tr>
+        <w:trPr/>
+        <w:tc>
+          <w:tcPr>
+            <w:tcW w:w="3212" w:type="dxa"/>
+            <w:tcBorders>
+              <w:start w:val="single" w:sz="4" w:space="0" w:color="000000"/>
+              <w:bottom w:val="single" w:sz="4" w:space="0" w:color="000000"/>
+            </w:tcBorders>
+          </w:tcPr>
+          <w:p>
+            <w:pPr>
+              <w:pStyle w:val="Contenudetableau"/>
+              <w:bidi w:val="0"/>
+              <w:jc w:val="start"/>
+              <w:rPr/>
+            </w:pPr>
+            <w:r>
+              <w:rPr/>
+              <w:t>Accès à la page</w:t>
+            </w:r>
+          </w:p>
+        </w:tc>
+        <w:tc>
+          <w:tcPr>
+            <w:tcW w:w="3213" w:type="dxa"/>
+            <w:tcBorders>
+              <w:start w:val="single" w:sz="4" w:space="0" w:color="000000"/>
+              <w:bottom w:val="single" w:sz="4" w:space="0" w:color="000000"/>
+            </w:tcBorders>
+          </w:tcPr>
+          <w:p>
+            <w:pPr>
+              <w:pStyle w:val="Contenudetableau"/>
+              <w:widowControl w:val="false"/>
+              <w:suppressLineNumbers/>
+              <w:bidi w:val="0"/>
+              <w:jc w:val="start"/>
+              <w:rPr/>
+            </w:pPr>
+            <w:r>
+              <w:rPr/>
+            </w:r>
+          </w:p>
+        </w:tc>
+        <w:tc>
+          <w:tcPr>
+            <w:tcW w:w="3213" w:type="dxa"/>
+            <w:tcBorders>
+              <w:start w:val="single" w:sz="4" w:space="0" w:color="000000"/>
+              <w:bottom w:val="single" w:sz="4" w:space="0" w:color="000000"/>
+              <w:end w:val="single" w:sz="4" w:space="0" w:color="000000"/>
+            </w:tcBorders>
+          </w:tcPr>
+          <w:p>
+            <w:pPr>
+              <w:pStyle w:val="Contenudetableau"/>
+              <w:bidi w:val="0"/>
+              <w:jc w:val="start"/>
+              <w:rPr/>
+            </w:pPr>
+            <w:r>
+              <w:rPr/>
+              <w:t>Affichage de tous les tableaux et retour http 200</w:t>
+            </w:r>
+          </w:p>
+        </w:tc>
+      </w:tr>
+      <w:tr>
+        <w:trPr/>
+        <w:tc>
+          <w:tcPr>
+            <w:tcW w:w="3212" w:type="dxa"/>
+            <w:tcBorders>
+              <w:start w:val="single" w:sz="4" w:space="0" w:color="000000"/>
+              <w:bottom w:val="single" w:sz="4" w:space="0" w:color="000000"/>
+            </w:tcBorders>
+          </w:tcPr>
+          <w:p>
+            <w:pPr>
+              <w:pStyle w:val="Contenudetableau"/>
+              <w:bidi w:val="0"/>
+              <w:jc w:val="start"/>
+              <w:rPr/>
+            </w:pPr>
+            <w:r>
+              <w:rPr/>
+              <w:t>Accès au tableau d’id tab_roadmap_2026</w:t>
+            </w:r>
+          </w:p>
+        </w:tc>
+        <w:tc>
+          <w:tcPr>
+            <w:tcW w:w="3213" w:type="dxa"/>
+            <w:tcBorders>
+              <w:start w:val="single" w:sz="4" w:space="0" w:color="000000"/>
+              <w:bottom w:val="single" w:sz="4" w:space="0" w:color="000000"/>
+            </w:tcBorders>
+          </w:tcPr>
+          <w:p>
+            <w:pPr>
+              <w:pStyle w:val="Contenudetableau"/>
+              <w:bidi w:val="0"/>
+              <w:jc w:val="start"/>
+              <w:rPr/>
+            </w:pPr>
+            <w:r>
+              <w:rPr/>
+              <w:t>Clic sur le tableau de sa liste</w:t>
+            </w:r>
+          </w:p>
+        </w:tc>
+        <w:tc>
+          <w:tcPr>
+            <w:tcW w:w="3213" w:type="dxa"/>
+            <w:tcBorders>
+              <w:start w:val="single" w:sz="4" w:space="0" w:color="000000"/>
+              <w:bottom w:val="single" w:sz="4" w:space="0" w:color="000000"/>
+              <w:end w:val="single" w:sz="4" w:space="0" w:color="000000"/>
+            </w:tcBorders>
+          </w:tcPr>
+          <w:p>
+            <w:pPr>
+              <w:pStyle w:val="Contenudetableau"/>
+              <w:bidi w:val="0"/>
+              <w:jc w:val="start"/>
+              <w:rPr/>
+            </w:pPr>
+            <w:r>
+              <w:rPr/>
+              <w:t>Affichage du tableau ainsi que ses listes et cartes associées et retour http 200</w:t>
+            </w:r>
+          </w:p>
+        </w:tc>
+      </w:tr>
+      <w:tr>
+        <w:trPr/>
+        <w:tc>
+          <w:tcPr>
+            <w:tcW w:w="3212" w:type="dxa"/>
+            <w:tcBorders>
+              <w:start w:val="single" w:sz="4" w:space="0" w:color="000000"/>
+              <w:bottom w:val="single" w:sz="4" w:space="0" w:color="000000"/>
+            </w:tcBorders>
+          </w:tcPr>
+          <w:p>
+            <w:pPr>
+              <w:pStyle w:val="Contenudetableau"/>
+              <w:bidi w:val="0"/>
+              <w:jc w:val="start"/>
+              <w:rPr/>
+            </w:pPr>
+            <w:r>
+              <w:rPr/>
+              <w:t xml:space="preserve">Passage de la </w:t>
+            </w:r>
+            <w:r>
+              <w:rPr/>
+              <w:t>liste d’id avant la liste d’id</w:t>
+            </w:r>
+          </w:p>
+        </w:tc>
+        <w:tc>
+          <w:tcPr>
+            <w:tcW w:w="3213" w:type="dxa"/>
+            <w:tcBorders>
+              <w:start w:val="single" w:sz="4" w:space="0" w:color="000000"/>
+              <w:bottom w:val="single" w:sz="4" w:space="0" w:color="000000"/>
+            </w:tcBorders>
+          </w:tcPr>
+          <w:p>
+            <w:pPr>
+              <w:pStyle w:val="Contenudetableau"/>
+              <w:bidi w:val="0"/>
+              <w:jc w:val="start"/>
+              <w:rPr/>
+            </w:pPr>
+            <w:r>
+              <w:rPr/>
+              <w:t xml:space="preserve">Déplacement de la </w:t>
+            </w:r>
+            <w:r>
+              <w:rPr/>
+              <w:t>liste</w:t>
+            </w:r>
+          </w:p>
+        </w:tc>
+        <w:tc>
+          <w:tcPr>
+            <w:tcW w:w="3213" w:type="dxa"/>
+            <w:tcBorders>
+              <w:start w:val="single" w:sz="4" w:space="0" w:color="000000"/>
+              <w:bottom w:val="single" w:sz="4" w:space="0" w:color="000000"/>
+              <w:end w:val="single" w:sz="4" w:space="0" w:color="000000"/>
+            </w:tcBorders>
+          </w:tcPr>
+          <w:p>
+            <w:pPr>
+              <w:pStyle w:val="Contenudetableau"/>
+              <w:bidi w:val="0"/>
+              <w:jc w:val="start"/>
+              <w:rPr/>
+            </w:pPr>
+            <w:r>
+              <w:rPr/>
+              <w:t xml:space="preserve">Affichage du nouvel ordre des </w:t>
+            </w:r>
+            <w:r>
+              <w:rPr/>
+              <w:t>listes</w:t>
+            </w:r>
+            <w:r>
+              <w:rPr/>
+              <w:t xml:space="preserve"> + retour http 200</w:t>
             </w:r>
           </w:p>
         </w:tc>
@@ -3006,7 +4537,7 @@
       </w:pPr>
       <w:r>
         <w:rPr/>
-        <w:t>Drag and drop (changement de l’ordre des listes)</w:t>
+        <w:t>Modification profil</w:t>
       </w:r>
     </w:p>
     <w:tbl>
@@ -3246,7 +4777,7 @@
       </w:pPr>
       <w:r>
         <w:rPr/>
-        <w:t>Modification profil</w:t>
+        <w:t>Modification d’un tableau</w:t>
       </w:r>
     </w:p>
     <w:tbl>
@@ -3486,7 +5017,7 @@
       </w:pPr>
       <w:r>
         <w:rPr/>
-        <w:t>Modification d’un tableau</w:t>
+        <w:t>Modification d’une liste</w:t>
       </w:r>
     </w:p>
     <w:tbl>
@@ -3726,7 +5257,7 @@
       </w:pPr>
       <w:r>
         <w:rPr/>
-        <w:t>Modification d’une liste</w:t>
+        <w:t>Modification d’une carte</w:t>
       </w:r>
     </w:p>
     <w:tbl>
@@ -3966,7 +5497,7 @@
       </w:pPr>
       <w:r>
         <w:rPr/>
-        <w:t>Modification d’une carte</w:t>
+        <w:t>Modification d’une etiquette</w:t>
       </w:r>
     </w:p>
     <w:tbl>
@@ -4206,7 +5737,7 @@
       </w:pPr>
       <w:r>
         <w:rPr/>
-        <w:t>Modification d’une etiquette</w:t>
+        <w:t>Modification d’un journal (archivage)</w:t>
       </w:r>
     </w:p>
     <w:tbl>
@@ -4446,7 +5977,7 @@
       </w:pPr>
       <w:r>
         <w:rPr/>
-        <w:t>Modification d’un journal (archivage)</w:t>
+        <w:t>Modification de mot de passe</w:t>
       </w:r>
     </w:p>
     <w:tbl>
@@ -4666,6 +6197,497 @@
         </w:tc>
       </w:tr>
     </w:tbl>
+    <w:p>
+      <w:pPr>
+        <w:pStyle w:val="Normal"/>
+        <w:bidi w:val="0"/>
+        <w:jc w:val="start"/>
+        <w:rPr/>
+      </w:pPr>
+      <w:r>
+        <w:rPr/>
+      </w:r>
+    </w:p>
+    <w:p>
+      <w:pPr>
+        <w:pStyle w:val="Normal"/>
+        <w:bidi w:val="0"/>
+        <w:jc w:val="start"/>
+        <w:rPr/>
+      </w:pPr>
+      <w:r>
+        <w:rPr/>
+        <w:t>Modification rôle (compte → admin)</w:t>
+      </w:r>
+    </w:p>
+    <w:tbl>
+      <w:tblPr>
+        <w:tblW w:w="5000" w:type="pct"/>
+        <w:jc w:val="start"/>
+        <w:tblInd w:w="-5" w:type="dxa"/>
+        <w:tblLayout w:type="fixed"/>
+        <w:tblCellMar>
+          <w:top w:w="55" w:type="dxa"/>
+          <w:start w:w="55" w:type="dxa"/>
+          <w:bottom w:w="55" w:type="dxa"/>
+          <w:end w:w="55" w:type="dxa"/>
+        </w:tblCellMar>
+      </w:tblPr>
+      <w:tblGrid>
+        <w:gridCol w:w="3212"/>
+        <w:gridCol w:w="3213"/>
+        <w:gridCol w:w="3213"/>
+      </w:tblGrid>
+      <w:tr>
+        <w:trPr/>
+        <w:tc>
+          <w:tcPr>
+            <w:tcW w:w="3212" w:type="dxa"/>
+            <w:tcBorders>
+              <w:top w:val="single" w:sz="4" w:space="0" w:color="000000"/>
+              <w:start w:val="single" w:sz="4" w:space="0" w:color="000000"/>
+              <w:bottom w:val="single" w:sz="4" w:space="0" w:color="000000"/>
+            </w:tcBorders>
+          </w:tcPr>
+          <w:p>
+            <w:pPr>
+              <w:pStyle w:val="Contenudetableau"/>
+              <w:bidi w:val="0"/>
+              <w:jc w:val="start"/>
+              <w:rPr/>
+            </w:pPr>
+            <w:r>
+              <w:rPr/>
+              <w:t>Etape</w:t>
+            </w:r>
+          </w:p>
+        </w:tc>
+        <w:tc>
+          <w:tcPr>
+            <w:tcW w:w="3213" w:type="dxa"/>
+            <w:tcBorders>
+              <w:top w:val="single" w:sz="4" w:space="0" w:color="000000"/>
+              <w:start w:val="single" w:sz="4" w:space="0" w:color="000000"/>
+              <w:bottom w:val="single" w:sz="4" w:space="0" w:color="000000"/>
+            </w:tcBorders>
+          </w:tcPr>
+          <w:p>
+            <w:pPr>
+              <w:pStyle w:val="Contenudetableau"/>
+              <w:bidi w:val="0"/>
+              <w:jc w:val="start"/>
+              <w:rPr/>
+            </w:pPr>
+            <w:r>
+              <w:rPr/>
+              <w:t>Action utilisateur</w:t>
+            </w:r>
+          </w:p>
+        </w:tc>
+        <w:tc>
+          <w:tcPr>
+            <w:tcW w:w="3213" w:type="dxa"/>
+            <w:tcBorders>
+              <w:top w:val="single" w:sz="4" w:space="0" w:color="000000"/>
+              <w:start w:val="single" w:sz="4" w:space="0" w:color="000000"/>
+              <w:bottom w:val="single" w:sz="4" w:space="0" w:color="000000"/>
+              <w:end w:val="single" w:sz="4" w:space="0" w:color="000000"/>
+            </w:tcBorders>
+          </w:tcPr>
+          <w:p>
+            <w:pPr>
+              <w:pStyle w:val="Contenudetableau"/>
+              <w:bidi w:val="0"/>
+              <w:jc w:val="start"/>
+              <w:rPr/>
+            </w:pPr>
+            <w:r>
+              <w:rPr/>
+              <w:t>Réponse Api</w:t>
+            </w:r>
+          </w:p>
+        </w:tc>
+      </w:tr>
+      <w:tr>
+        <w:trPr/>
+        <w:tc>
+          <w:tcPr>
+            <w:tcW w:w="3212" w:type="dxa"/>
+            <w:tcBorders>
+              <w:start w:val="single" w:sz="4" w:space="0" w:color="000000"/>
+              <w:bottom w:val="single" w:sz="4" w:space="0" w:color="000000"/>
+            </w:tcBorders>
+          </w:tcPr>
+          <w:p>
+            <w:pPr>
+              <w:pStyle w:val="Contenudetableau"/>
+              <w:bidi w:val="0"/>
+              <w:jc w:val="start"/>
+              <w:rPr/>
+            </w:pPr>
+            <w:r>
+              <w:rPr/>
+            </w:r>
+          </w:p>
+        </w:tc>
+        <w:tc>
+          <w:tcPr>
+            <w:tcW w:w="3213" w:type="dxa"/>
+            <w:tcBorders>
+              <w:start w:val="single" w:sz="4" w:space="0" w:color="000000"/>
+              <w:bottom w:val="single" w:sz="4" w:space="0" w:color="000000"/>
+            </w:tcBorders>
+          </w:tcPr>
+          <w:p>
+            <w:pPr>
+              <w:pStyle w:val="Contenudetableau"/>
+              <w:bidi w:val="0"/>
+              <w:jc w:val="start"/>
+              <w:rPr/>
+            </w:pPr>
+            <w:r>
+              <w:rPr/>
+            </w:r>
+          </w:p>
+        </w:tc>
+        <w:tc>
+          <w:tcPr>
+            <w:tcW w:w="3213" w:type="dxa"/>
+            <w:tcBorders>
+              <w:start w:val="single" w:sz="4" w:space="0" w:color="000000"/>
+              <w:bottom w:val="single" w:sz="4" w:space="0" w:color="000000"/>
+              <w:end w:val="single" w:sz="4" w:space="0" w:color="000000"/>
+            </w:tcBorders>
+          </w:tcPr>
+          <w:p>
+            <w:pPr>
+              <w:pStyle w:val="Contenudetableau"/>
+              <w:bidi w:val="0"/>
+              <w:jc w:val="start"/>
+              <w:rPr/>
+            </w:pPr>
+            <w:r>
+              <w:rPr/>
+            </w:r>
+          </w:p>
+        </w:tc>
+      </w:tr>
+      <w:tr>
+        <w:trPr/>
+        <w:tc>
+          <w:tcPr>
+            <w:tcW w:w="3212" w:type="dxa"/>
+            <w:tcBorders>
+              <w:start w:val="single" w:sz="4" w:space="0" w:color="000000"/>
+              <w:bottom w:val="single" w:sz="4" w:space="0" w:color="000000"/>
+            </w:tcBorders>
+          </w:tcPr>
+          <w:p>
+            <w:pPr>
+              <w:pStyle w:val="Contenudetableau"/>
+              <w:bidi w:val="0"/>
+              <w:jc w:val="start"/>
+              <w:rPr/>
+            </w:pPr>
+            <w:r>
+              <w:rPr/>
+            </w:r>
+          </w:p>
+        </w:tc>
+        <w:tc>
+          <w:tcPr>
+            <w:tcW w:w="3213" w:type="dxa"/>
+            <w:tcBorders>
+              <w:start w:val="single" w:sz="4" w:space="0" w:color="000000"/>
+              <w:bottom w:val="single" w:sz="4" w:space="0" w:color="000000"/>
+            </w:tcBorders>
+          </w:tcPr>
+          <w:p>
+            <w:pPr>
+              <w:pStyle w:val="Contenudetableau"/>
+              <w:bidi w:val="0"/>
+              <w:jc w:val="start"/>
+              <w:rPr/>
+            </w:pPr>
+            <w:r>
+              <w:rPr/>
+            </w:r>
+          </w:p>
+        </w:tc>
+        <w:tc>
+          <w:tcPr>
+            <w:tcW w:w="3213" w:type="dxa"/>
+            <w:tcBorders>
+              <w:start w:val="single" w:sz="4" w:space="0" w:color="000000"/>
+              <w:bottom w:val="single" w:sz="4" w:space="0" w:color="000000"/>
+              <w:end w:val="single" w:sz="4" w:space="0" w:color="000000"/>
+            </w:tcBorders>
+          </w:tcPr>
+          <w:p>
+            <w:pPr>
+              <w:pStyle w:val="Contenudetableau"/>
+              <w:bidi w:val="0"/>
+              <w:jc w:val="start"/>
+              <w:rPr/>
+            </w:pPr>
+            <w:r>
+              <w:rPr/>
+            </w:r>
+          </w:p>
+        </w:tc>
+      </w:tr>
+    </w:tbl>
+    <w:p>
+      <w:pPr>
+        <w:pStyle w:val="Normal"/>
+        <w:bidi w:val="0"/>
+        <w:jc w:val="start"/>
+        <w:rPr/>
+      </w:pPr>
+      <w:r>
+        <w:rPr/>
+      </w:r>
+    </w:p>
+    <w:p>
+      <w:pPr>
+        <w:pStyle w:val="Normal"/>
+        <w:bidi w:val="0"/>
+        <w:jc w:val="start"/>
+        <w:rPr/>
+      </w:pPr>
+      <w:r>
+        <w:rPr/>
+        <w:t>Modification rôle (tableau → admin)</w:t>
+      </w:r>
+    </w:p>
+    <w:tbl>
+      <w:tblPr>
+        <w:tblW w:w="5000" w:type="pct"/>
+        <w:jc w:val="start"/>
+        <w:tblInd w:w="-5" w:type="dxa"/>
+        <w:tblLayout w:type="fixed"/>
+        <w:tblCellMar>
+          <w:top w:w="55" w:type="dxa"/>
+          <w:start w:w="55" w:type="dxa"/>
+          <w:bottom w:w="55" w:type="dxa"/>
+          <w:end w:w="55" w:type="dxa"/>
+        </w:tblCellMar>
+      </w:tblPr>
+      <w:tblGrid>
+        <w:gridCol w:w="3212"/>
+        <w:gridCol w:w="3213"/>
+        <w:gridCol w:w="3213"/>
+      </w:tblGrid>
+      <w:tr>
+        <w:trPr/>
+        <w:tc>
+          <w:tcPr>
+            <w:tcW w:w="3212" w:type="dxa"/>
+            <w:tcBorders>
+              <w:top w:val="single" w:sz="4" w:space="0" w:color="000000"/>
+              <w:start w:val="single" w:sz="4" w:space="0" w:color="000000"/>
+              <w:bottom w:val="single" w:sz="4" w:space="0" w:color="000000"/>
+            </w:tcBorders>
+          </w:tcPr>
+          <w:p>
+            <w:pPr>
+              <w:pStyle w:val="Contenudetableau"/>
+              <w:bidi w:val="0"/>
+              <w:jc w:val="start"/>
+              <w:rPr/>
+            </w:pPr>
+            <w:r>
+              <w:rPr/>
+              <w:t>Etape</w:t>
+            </w:r>
+          </w:p>
+        </w:tc>
+        <w:tc>
+          <w:tcPr>
+            <w:tcW w:w="3213" w:type="dxa"/>
+            <w:tcBorders>
+              <w:top w:val="single" w:sz="4" w:space="0" w:color="000000"/>
+              <w:start w:val="single" w:sz="4" w:space="0" w:color="000000"/>
+              <w:bottom w:val="single" w:sz="4" w:space="0" w:color="000000"/>
+            </w:tcBorders>
+          </w:tcPr>
+          <w:p>
+            <w:pPr>
+              <w:pStyle w:val="Contenudetableau"/>
+              <w:bidi w:val="0"/>
+              <w:jc w:val="start"/>
+              <w:rPr/>
+            </w:pPr>
+            <w:r>
+              <w:rPr/>
+              <w:t>Action utilisateur</w:t>
+            </w:r>
+          </w:p>
+        </w:tc>
+        <w:tc>
+          <w:tcPr>
+            <w:tcW w:w="3213" w:type="dxa"/>
+            <w:tcBorders>
+              <w:top w:val="single" w:sz="4" w:space="0" w:color="000000"/>
+              <w:start w:val="single" w:sz="4" w:space="0" w:color="000000"/>
+              <w:bottom w:val="single" w:sz="4" w:space="0" w:color="000000"/>
+              <w:end w:val="single" w:sz="4" w:space="0" w:color="000000"/>
+            </w:tcBorders>
+          </w:tcPr>
+          <w:p>
+            <w:pPr>
+              <w:pStyle w:val="Contenudetableau"/>
+              <w:bidi w:val="0"/>
+              <w:jc w:val="start"/>
+              <w:rPr/>
+            </w:pPr>
+            <w:r>
+              <w:rPr/>
+              <w:t>Réponse Api</w:t>
+            </w:r>
+          </w:p>
+        </w:tc>
+      </w:tr>
+      <w:tr>
+        <w:trPr/>
+        <w:tc>
+          <w:tcPr>
+            <w:tcW w:w="3212" w:type="dxa"/>
+            <w:tcBorders>
+              <w:start w:val="single" w:sz="4" w:space="0" w:color="000000"/>
+              <w:bottom w:val="single" w:sz="4" w:space="0" w:color="000000"/>
+            </w:tcBorders>
+          </w:tcPr>
+          <w:p>
+            <w:pPr>
+              <w:pStyle w:val="Contenudetableau"/>
+              <w:bidi w:val="0"/>
+              <w:jc w:val="start"/>
+              <w:rPr/>
+            </w:pPr>
+            <w:r>
+              <w:rPr/>
+            </w:r>
+          </w:p>
+        </w:tc>
+        <w:tc>
+          <w:tcPr>
+            <w:tcW w:w="3213" w:type="dxa"/>
+            <w:tcBorders>
+              <w:start w:val="single" w:sz="4" w:space="0" w:color="000000"/>
+              <w:bottom w:val="single" w:sz="4" w:space="0" w:color="000000"/>
+            </w:tcBorders>
+          </w:tcPr>
+          <w:p>
+            <w:pPr>
+              <w:pStyle w:val="Contenudetableau"/>
+              <w:bidi w:val="0"/>
+              <w:jc w:val="start"/>
+              <w:rPr/>
+            </w:pPr>
+            <w:r>
+              <w:rPr/>
+            </w:r>
+          </w:p>
+        </w:tc>
+        <w:tc>
+          <w:tcPr>
+            <w:tcW w:w="3213" w:type="dxa"/>
+            <w:tcBorders>
+              <w:start w:val="single" w:sz="4" w:space="0" w:color="000000"/>
+              <w:bottom w:val="single" w:sz="4" w:space="0" w:color="000000"/>
+              <w:end w:val="single" w:sz="4" w:space="0" w:color="000000"/>
+            </w:tcBorders>
+          </w:tcPr>
+          <w:p>
+            <w:pPr>
+              <w:pStyle w:val="Contenudetableau"/>
+              <w:bidi w:val="0"/>
+              <w:jc w:val="start"/>
+              <w:rPr/>
+            </w:pPr>
+            <w:r>
+              <w:rPr/>
+            </w:r>
+          </w:p>
+        </w:tc>
+      </w:tr>
+      <w:tr>
+        <w:trPr/>
+        <w:tc>
+          <w:tcPr>
+            <w:tcW w:w="3212" w:type="dxa"/>
+            <w:tcBorders>
+              <w:start w:val="single" w:sz="4" w:space="0" w:color="000000"/>
+              <w:bottom w:val="single" w:sz="4" w:space="0" w:color="000000"/>
+            </w:tcBorders>
+          </w:tcPr>
+          <w:p>
+            <w:pPr>
+              <w:pStyle w:val="Contenudetableau"/>
+              <w:bidi w:val="0"/>
+              <w:jc w:val="start"/>
+              <w:rPr/>
+            </w:pPr>
+            <w:r>
+              <w:rPr/>
+            </w:r>
+          </w:p>
+        </w:tc>
+        <w:tc>
+          <w:tcPr>
+            <w:tcW w:w="3213" w:type="dxa"/>
+            <w:tcBorders>
+              <w:start w:val="single" w:sz="4" w:space="0" w:color="000000"/>
+              <w:bottom w:val="single" w:sz="4" w:space="0" w:color="000000"/>
+            </w:tcBorders>
+          </w:tcPr>
+          <w:p>
+            <w:pPr>
+              <w:pStyle w:val="Contenudetableau"/>
+              <w:bidi w:val="0"/>
+              <w:jc w:val="start"/>
+              <w:rPr/>
+            </w:pPr>
+            <w:r>
+              <w:rPr/>
+            </w:r>
+          </w:p>
+        </w:tc>
+        <w:tc>
+          <w:tcPr>
+            <w:tcW w:w="3213" w:type="dxa"/>
+            <w:tcBorders>
+              <w:start w:val="single" w:sz="4" w:space="0" w:color="000000"/>
+              <w:bottom w:val="single" w:sz="4" w:space="0" w:color="000000"/>
+              <w:end w:val="single" w:sz="4" w:space="0" w:color="000000"/>
+            </w:tcBorders>
+          </w:tcPr>
+          <w:p>
+            <w:pPr>
+              <w:pStyle w:val="Contenudetableau"/>
+              <w:bidi w:val="0"/>
+              <w:jc w:val="start"/>
+              <w:rPr/>
+            </w:pPr>
+            <w:r>
+              <w:rPr/>
+            </w:r>
+          </w:p>
+        </w:tc>
+      </w:tr>
+    </w:tbl>
+    <w:p>
+      <w:pPr>
+        <w:pStyle w:val="Normal"/>
+        <w:bidi w:val="0"/>
+        <w:jc w:val="start"/>
+        <w:rPr/>
+      </w:pPr>
+      <w:r>
+        <w:rPr/>
+      </w:r>
+    </w:p>
     <w:p>
       <w:pPr>
         <w:pStyle w:val="Normal"/>

</xml_diff>